<commit_message>
AI Docstring Write Up
</commit_message>
<xml_diff>
--- a/.documentation/NEA log.docx
+++ b/.documentation/NEA log.docx
@@ -6,19 +6,11 @@
       <w:pPr>
         <w:pStyle w:val="Title"/>
       </w:pPr>
-      <w:proofErr w:type="spellStart"/>
       <w:r>
         <w:rPr>
           <w:b/>
         </w:rPr>
-        <w:t>Eduqas</w:t>
-      </w:r>
-      <w:proofErr w:type="spellEnd"/>
-      <w:r>
-        <w:rPr>
-          <w:b/>
-        </w:rPr>
-        <w:t xml:space="preserve"> A Level Computer Science</w:t>
+        <w:t>Eduqas A Level Computer Science</w:t>
       </w:r>
       <w:r>
         <w:rPr>
@@ -49,15 +41,7 @@
         <w:t>This log should be completed every week to show your development</w:t>
       </w:r>
       <w:r>
-        <w:t xml:space="preserve"> and </w:t>
-      </w:r>
-      <w:proofErr w:type="gramStart"/>
-      <w:r>
-        <w:t>problem solving</w:t>
-      </w:r>
-      <w:proofErr w:type="gramEnd"/>
-      <w:r>
-        <w:t xml:space="preserve"> skills. </w:t>
+        <w:t xml:space="preserve"> and problem solving skills. </w:t>
       </w:r>
       <w:r>
         <w:br/>
@@ -75,16 +59,14 @@
       <w:tblPr>
         <w:tblStyle w:val="TableGrid"/>
         <w:tblW w:w="0" w:type="auto"/>
+        <w:tblLayout w:type="fixed"/>
         <w:tblLook w:val="04A0" w:firstRow="1" w:lastRow="0" w:firstColumn="1" w:lastColumn="0" w:noHBand="0" w:noVBand="1"/>
       </w:tblPr>
       <w:tblGrid>
-        <w:gridCol w:w="834"/>
-        <w:gridCol w:w="932"/>
-        <w:gridCol w:w="1515"/>
-        <w:gridCol w:w="3769"/>
-        <w:gridCol w:w="1794"/>
-        <w:gridCol w:w="1742"/>
+        <w:gridCol w:w="683"/>
+        <w:gridCol w:w="929"/>
         <w:gridCol w:w="1644"/>
+        <w:gridCol w:w="8930"/>
       </w:tblGrid>
       <w:tr>
         <w:trPr>
@@ -93,7 +75,7 @@
         </w:trPr>
         <w:tc>
           <w:tcPr>
-            <w:tcW w:w="841" w:type="dxa"/>
+            <w:tcW w:w="683" w:type="dxa"/>
             <w:vAlign w:val="center"/>
           </w:tcPr>
           <w:p>
@@ -115,7 +97,7 @@
         </w:tc>
         <w:tc>
           <w:tcPr>
-            <w:tcW w:w="932" w:type="dxa"/>
+            <w:tcW w:w="929" w:type="dxa"/>
             <w:vAlign w:val="center"/>
           </w:tcPr>
           <w:p>
@@ -153,102 +135,12 @@
                 <w:bCs/>
               </w:rPr>
             </w:pPr>
-            <w:proofErr w:type="spellStart"/>
             <w:r>
               <w:rPr>
                 <w:b/>
                 <w:bCs/>
               </w:rPr>
               <w:t>hh:mm</w:t>
-            </w:r>
-            <w:proofErr w:type="spellEnd"/>
-          </w:p>
-        </w:tc>
-        <w:tc>
-          <w:tcPr>
-            <w:tcW w:w="1450" w:type="dxa"/>
-            <w:vAlign w:val="center"/>
-          </w:tcPr>
-          <w:p>
-            <w:pPr>
-              <w:jc w:val="center"/>
-              <w:rPr>
-                <w:b/>
-                <w:bCs/>
-              </w:rPr>
-            </w:pPr>
-            <w:r>
-              <w:rPr>
-                <w:b/>
-                <w:bCs/>
-              </w:rPr>
-              <w:t>Area of NEA</w:t>
-            </w:r>
-          </w:p>
-        </w:tc>
-        <w:tc>
-          <w:tcPr>
-            <w:tcW w:w="3822" w:type="dxa"/>
-            <w:vAlign w:val="center"/>
-          </w:tcPr>
-          <w:p>
-            <w:pPr>
-              <w:jc w:val="center"/>
-              <w:rPr>
-                <w:b/>
-                <w:bCs/>
-              </w:rPr>
-            </w:pPr>
-            <w:r>
-              <w:rPr>
-                <w:b/>
-                <w:bCs/>
-              </w:rPr>
-              <w:t>Description of Work Completed</w:t>
-            </w:r>
-          </w:p>
-        </w:tc>
-        <w:tc>
-          <w:tcPr>
-            <w:tcW w:w="1799" w:type="dxa"/>
-            <w:vAlign w:val="center"/>
-          </w:tcPr>
-          <w:p>
-            <w:pPr>
-              <w:jc w:val="center"/>
-              <w:rPr>
-                <w:b/>
-                <w:bCs/>
-              </w:rPr>
-            </w:pPr>
-            <w:r>
-              <w:rPr>
-                <w:b/>
-                <w:bCs/>
-              </w:rPr>
-              <w:t>Problems / Decisions Made</w:t>
-            </w:r>
-          </w:p>
-        </w:tc>
-        <w:tc>
-          <w:tcPr>
-            <w:tcW w:w="1742" w:type="dxa"/>
-            <w:vAlign w:val="center"/>
-          </w:tcPr>
-          <w:p>
-            <w:pPr>
-              <w:jc w:val="center"/>
-              <w:rPr>
-                <w:b/>
-                <w:bCs/>
-              </w:rPr>
-            </w:pPr>
-            <w:r>
-              <w:rPr>
-                <w:b/>
-                <w:bCs/>
-              </w:rPr>
-              <w:t>Outcome</w:t>
             </w:r>
           </w:p>
         </w:tc>
@@ -270,7 +162,36 @@
                 <w:b/>
                 <w:bCs/>
               </w:rPr>
-              <w:t>Next Steps</w:t>
+              <w:t>Area of NEA</w:t>
+            </w:r>
+          </w:p>
+        </w:tc>
+        <w:tc>
+          <w:tcPr>
+            <w:tcW w:w="8930" w:type="dxa"/>
+            <w:vAlign w:val="center"/>
+          </w:tcPr>
+          <w:p>
+            <w:pPr>
+              <w:jc w:val="center"/>
+              <w:rPr>
+                <w:b/>
+                <w:bCs/>
+              </w:rPr>
+            </w:pPr>
+            <w:r>
+              <w:rPr>
+                <w:b/>
+                <w:bCs/>
+              </w:rPr>
+              <w:t xml:space="preserve">Description </w:t>
+            </w:r>
+            <w:r>
+              <w:rPr>
+                <w:b/>
+                <w:bCs/>
+              </w:rPr>
+              <w:t>(Including: Problems Encountered, Decisions Made, AI Usage, Outcome, and Next Steps)</w:t>
             </w:r>
           </w:p>
         </w:tc>
@@ -282,7 +203,7 @@
         </w:trPr>
         <w:tc>
           <w:tcPr>
-            <w:tcW w:w="841" w:type="dxa"/>
+            <w:tcW w:w="683" w:type="dxa"/>
             <w:textDirection w:val="tbRl"/>
             <w:vAlign w:val="center"/>
           </w:tcPr>
@@ -298,7 +219,7 @@
         </w:tc>
         <w:tc>
           <w:tcPr>
-            <w:tcW w:w="932" w:type="dxa"/>
+            <w:tcW w:w="929" w:type="dxa"/>
             <w:vAlign w:val="center"/>
           </w:tcPr>
           <w:p>
@@ -307,60 +228,33 @@
             </w:pPr>
             <w:r>
               <w:t>01:00</w:t>
-            </w:r>
-          </w:p>
-        </w:tc>
-        <w:tc>
-          <w:tcPr>
-            <w:tcW w:w="1450" w:type="dxa"/>
-            <w:vAlign w:val="center"/>
-          </w:tcPr>
-          <w:p>
-            <w:pPr>
-              <w:jc w:val="center"/>
-            </w:pPr>
-            <w:r>
-              <w:t>Design</w:t>
-            </w:r>
-          </w:p>
-        </w:tc>
-        <w:tc>
-          <w:tcPr>
-            <w:tcW w:w="3822" w:type="dxa"/>
-          </w:tcPr>
-          <w:p>
-            <w:r>
-              <w:t>Started to make paper plans and notes</w:t>
-            </w:r>
-          </w:p>
-        </w:tc>
-        <w:tc>
-          <w:tcPr>
-            <w:tcW w:w="1799" w:type="dxa"/>
-          </w:tcPr>
-          <w:p>
-            <w:r>
-              <w:t>Basic overview of the brief and what users should be able to do</w:t>
-            </w:r>
-          </w:p>
-        </w:tc>
-        <w:tc>
-          <w:tcPr>
-            <w:tcW w:w="1742" w:type="dxa"/>
-          </w:tcPr>
-          <w:p>
-            <w:r>
-              <w:t>I have started work on getting an idea of what I want the program to do</w:t>
             </w:r>
           </w:p>
         </w:tc>
         <w:tc>
           <w:tcPr>
             <w:tcW w:w="1644" w:type="dxa"/>
+            <w:vAlign w:val="center"/>
           </w:tcPr>
           <w:p>
-            <w:r>
-              <w:t>Continue planning</w:t>
+            <w:pPr>
+              <w:jc w:val="center"/>
+            </w:pPr>
+            <w:r>
+              <w:t>Design</w:t>
+            </w:r>
+          </w:p>
+        </w:tc>
+        <w:tc>
+          <w:tcPr>
+            <w:tcW w:w="8930" w:type="dxa"/>
+          </w:tcPr>
+          <w:p>
+            <w:r>
+              <w:t>Started to make paper plans and notes by going over a b</w:t>
+            </w:r>
+            <w:r>
+              <w:t>asic overview of the brief and what users should be able to do</w:t>
             </w:r>
           </w:p>
         </w:tc>
@@ -372,7 +266,7 @@
         </w:trPr>
         <w:tc>
           <w:tcPr>
-            <w:tcW w:w="841" w:type="dxa"/>
+            <w:tcW w:w="683" w:type="dxa"/>
             <w:textDirection w:val="tbRl"/>
             <w:vAlign w:val="center"/>
           </w:tcPr>
@@ -388,7 +282,7 @@
         </w:tc>
         <w:tc>
           <w:tcPr>
-            <w:tcW w:w="932" w:type="dxa"/>
+            <w:tcW w:w="929" w:type="dxa"/>
             <w:vAlign w:val="center"/>
           </w:tcPr>
           <w:p>
@@ -397,60 +291,33 @@
             </w:pPr>
             <w:r>
               <w:t>01:00</w:t>
-            </w:r>
-          </w:p>
-        </w:tc>
-        <w:tc>
-          <w:tcPr>
-            <w:tcW w:w="1450" w:type="dxa"/>
-            <w:vAlign w:val="center"/>
-          </w:tcPr>
-          <w:p>
-            <w:pPr>
-              <w:jc w:val="center"/>
-            </w:pPr>
-            <w:r>
-              <w:t>Design</w:t>
-            </w:r>
-          </w:p>
-        </w:tc>
-        <w:tc>
-          <w:tcPr>
-            <w:tcW w:w="3822" w:type="dxa"/>
-          </w:tcPr>
-          <w:p>
-            <w:r>
-              <w:t>Continued paper plans and notes</w:t>
-            </w:r>
-          </w:p>
-        </w:tc>
-        <w:tc>
-          <w:tcPr>
-            <w:tcW w:w="1799" w:type="dxa"/>
-          </w:tcPr>
-          <w:p>
-            <w:r>
-              <w:t>Basic UI wireframe for design ethos, basic roadmap</w:t>
-            </w:r>
-          </w:p>
-        </w:tc>
-        <w:tc>
-          <w:tcPr>
-            <w:tcW w:w="1742" w:type="dxa"/>
-          </w:tcPr>
-          <w:p>
-            <w:r>
-              <w:t>I have further developed mu understanding of what I want the program to do</w:t>
             </w:r>
           </w:p>
         </w:tc>
         <w:tc>
           <w:tcPr>
             <w:tcW w:w="1644" w:type="dxa"/>
+            <w:vAlign w:val="center"/>
           </w:tcPr>
           <w:p>
-            <w:r>
-              <w:t>Continue planning</w:t>
+            <w:pPr>
+              <w:jc w:val="center"/>
+            </w:pPr>
+            <w:r>
+              <w:t>Design</w:t>
+            </w:r>
+          </w:p>
+        </w:tc>
+        <w:tc>
+          <w:tcPr>
+            <w:tcW w:w="8930" w:type="dxa"/>
+          </w:tcPr>
+          <w:p>
+            <w:r>
+              <w:t>Continued paper plans and notes by making a b</w:t>
+            </w:r>
+            <w:r>
+              <w:t>asic UI wireframe for design ethos, basic roadmap</w:t>
             </w:r>
           </w:p>
         </w:tc>
@@ -462,7 +329,7 @@
         </w:trPr>
         <w:tc>
           <w:tcPr>
-            <w:tcW w:w="841" w:type="dxa"/>
+            <w:tcW w:w="683" w:type="dxa"/>
             <w:textDirection w:val="tbRl"/>
             <w:vAlign w:val="center"/>
           </w:tcPr>
@@ -478,7 +345,7 @@
         </w:tc>
         <w:tc>
           <w:tcPr>
-            <w:tcW w:w="932" w:type="dxa"/>
+            <w:tcW w:w="929" w:type="dxa"/>
             <w:vAlign w:val="center"/>
           </w:tcPr>
           <w:p>
@@ -487,60 +354,33 @@
             </w:pPr>
             <w:r>
               <w:t>01:15</w:t>
-            </w:r>
-          </w:p>
-        </w:tc>
-        <w:tc>
-          <w:tcPr>
-            <w:tcW w:w="1450" w:type="dxa"/>
-            <w:vAlign w:val="center"/>
-          </w:tcPr>
-          <w:p>
-            <w:pPr>
-              <w:jc w:val="center"/>
-            </w:pPr>
-            <w:r>
-              <w:t>Planning</w:t>
-            </w:r>
-          </w:p>
-        </w:tc>
-        <w:tc>
-          <w:tcPr>
-            <w:tcW w:w="3822" w:type="dxa"/>
-          </w:tcPr>
-          <w:p>
-            <w:r>
-              <w:t>Started to setup Jira</w:t>
-            </w:r>
-          </w:p>
-        </w:tc>
-        <w:tc>
-          <w:tcPr>
-            <w:tcW w:w="1799" w:type="dxa"/>
-          </w:tcPr>
-          <w:p>
-            <w:r>
-              <w:t>The decision of when different elements should be completed</w:t>
-            </w:r>
-          </w:p>
-        </w:tc>
-        <w:tc>
-          <w:tcPr>
-            <w:tcW w:w="1742" w:type="dxa"/>
-          </w:tcPr>
-          <w:p>
-            <w:r>
-              <w:t>Some elements of timeline have been planned</w:t>
             </w:r>
           </w:p>
         </w:tc>
         <w:tc>
           <w:tcPr>
             <w:tcW w:w="1644" w:type="dxa"/>
+            <w:vAlign w:val="center"/>
           </w:tcPr>
           <w:p>
-            <w:r>
-              <w:t>Finish setting up Jira</w:t>
+            <w:pPr>
+              <w:jc w:val="center"/>
+            </w:pPr>
+            <w:r>
+              <w:t>Planning</w:t>
+            </w:r>
+          </w:p>
+        </w:tc>
+        <w:tc>
+          <w:tcPr>
+            <w:tcW w:w="8930" w:type="dxa"/>
+          </w:tcPr>
+          <w:p>
+            <w:r>
+              <w:t xml:space="preserve">Started to setup Jira which helped me understand </w:t>
+            </w:r>
+            <w:r>
+              <w:t>when different elements should be completed</w:t>
             </w:r>
           </w:p>
         </w:tc>
@@ -552,7 +392,7 @@
         </w:trPr>
         <w:tc>
           <w:tcPr>
-            <w:tcW w:w="841" w:type="dxa"/>
+            <w:tcW w:w="683" w:type="dxa"/>
             <w:textDirection w:val="tbRl"/>
             <w:vAlign w:val="center"/>
           </w:tcPr>
@@ -569,7 +409,7 @@
         </w:tc>
         <w:tc>
           <w:tcPr>
-            <w:tcW w:w="932" w:type="dxa"/>
+            <w:tcW w:w="929" w:type="dxa"/>
             <w:vAlign w:val="center"/>
           </w:tcPr>
           <w:p>
@@ -578,60 +418,30 @@
             </w:pPr>
             <w:r>
               <w:t>00:45</w:t>
-            </w:r>
-          </w:p>
-        </w:tc>
-        <w:tc>
-          <w:tcPr>
-            <w:tcW w:w="1450" w:type="dxa"/>
-            <w:vAlign w:val="center"/>
-          </w:tcPr>
-          <w:p>
-            <w:pPr>
-              <w:jc w:val="center"/>
-            </w:pPr>
-            <w:r>
-              <w:t>Planning</w:t>
-            </w:r>
-          </w:p>
-        </w:tc>
-        <w:tc>
-          <w:tcPr>
-            <w:tcW w:w="3822" w:type="dxa"/>
-          </w:tcPr>
-          <w:p>
-            <w:r>
-              <w:t>Continued to setup Jira</w:t>
-            </w:r>
-          </w:p>
-        </w:tc>
-        <w:tc>
-          <w:tcPr>
-            <w:tcW w:w="1799" w:type="dxa"/>
-          </w:tcPr>
-          <w:p>
-            <w:r>
-              <w:t>The decision of when different elements should be completed</w:t>
-            </w:r>
-          </w:p>
-        </w:tc>
-        <w:tc>
-          <w:tcPr>
-            <w:tcW w:w="1742" w:type="dxa"/>
-          </w:tcPr>
-          <w:p>
-            <w:r>
-              <w:t>Some more elements of timeline have been planned</w:t>
             </w:r>
           </w:p>
         </w:tc>
         <w:tc>
           <w:tcPr>
             <w:tcW w:w="1644" w:type="dxa"/>
+            <w:vAlign w:val="center"/>
           </w:tcPr>
           <w:p>
-            <w:r>
-              <w:t>Start to write documentation</w:t>
+            <w:pPr>
+              <w:jc w:val="center"/>
+            </w:pPr>
+            <w:r>
+              <w:t>Planning</w:t>
+            </w:r>
+          </w:p>
+        </w:tc>
+        <w:tc>
+          <w:tcPr>
+            <w:tcW w:w="8930" w:type="dxa"/>
+          </w:tcPr>
+          <w:p>
+            <w:r>
+              <w:t>Continued to setup Jira</w:t>
             </w:r>
           </w:p>
         </w:tc>
@@ -643,7 +453,7 @@
         </w:trPr>
         <w:tc>
           <w:tcPr>
-            <w:tcW w:w="841" w:type="dxa"/>
+            <w:tcW w:w="683" w:type="dxa"/>
             <w:textDirection w:val="tbRl"/>
             <w:vAlign w:val="center"/>
           </w:tcPr>
@@ -659,7 +469,7 @@
         </w:tc>
         <w:tc>
           <w:tcPr>
-            <w:tcW w:w="932" w:type="dxa"/>
+            <w:tcW w:w="929" w:type="dxa"/>
             <w:vAlign w:val="center"/>
           </w:tcPr>
           <w:p>
@@ -668,117 +478,73 @@
             </w:pPr>
             <w:r>
               <w:t>02:30</w:t>
-            </w:r>
-          </w:p>
-        </w:tc>
-        <w:tc>
-          <w:tcPr>
-            <w:tcW w:w="1450" w:type="dxa"/>
-            <w:vAlign w:val="center"/>
-          </w:tcPr>
-          <w:p>
-            <w:pPr>
-              <w:jc w:val="center"/>
-            </w:pPr>
-            <w:r>
-              <w:t>Design</w:t>
-            </w:r>
-          </w:p>
-        </w:tc>
-        <w:tc>
-          <w:tcPr>
-            <w:tcW w:w="3822" w:type="dxa"/>
-          </w:tcPr>
-          <w:p>
-            <w:pPr>
-              <w:pStyle w:val="ListParagraph"/>
-            </w:pPr>
-            <w:r>
-              <w:t>Started to put together ideas on design ethos,</w:t>
-            </w:r>
-          </w:p>
-          <w:p>
-            <w:pPr>
-              <w:pStyle w:val="ListParagraph"/>
-            </w:pPr>
-            <w:r>
-              <w:t>Ou</w:t>
-            </w:r>
-            <w:r>
-              <w:t>t</w:t>
-            </w:r>
-            <w:r>
-              <w:t>line client wants and needs,</w:t>
-            </w:r>
-          </w:p>
-          <w:p>
-            <w:pPr>
-              <w:pStyle w:val="ListParagraph"/>
-            </w:pPr>
-            <w:r>
-              <w:t>Outlined target audience,</w:t>
-            </w:r>
-          </w:p>
-          <w:p>
-            <w:pPr>
-              <w:pStyle w:val="ListParagraph"/>
-            </w:pPr>
-            <w:r>
-              <w:t>Outlined potential user flows,</w:t>
-            </w:r>
-          </w:p>
-          <w:p>
-            <w:pPr>
-              <w:pStyle w:val="ListParagraph"/>
-            </w:pPr>
-            <w:r>
-              <w:t>Outlined user types and abilities,</w:t>
-            </w:r>
-          </w:p>
-          <w:p>
-            <w:pPr>
-              <w:pStyle w:val="ListParagraph"/>
-            </w:pPr>
-            <w:r>
-              <w:t>Started to design database,</w:t>
-            </w:r>
-          </w:p>
-        </w:tc>
-        <w:tc>
-          <w:tcPr>
-            <w:tcW w:w="1799" w:type="dxa"/>
-          </w:tcPr>
-          <w:p>
-            <w:r>
-              <w:t>The overall feel and usage of the system</w:t>
-            </w:r>
-          </w:p>
-        </w:tc>
-        <w:tc>
-          <w:tcPr>
-            <w:tcW w:w="1742" w:type="dxa"/>
-          </w:tcPr>
-          <w:p>
-            <w:r>
-              <w:t xml:space="preserve">I have a clear idea </w:t>
-            </w:r>
-            <w:proofErr w:type="spellStart"/>
-            <w:r>
-              <w:t>od</w:t>
-            </w:r>
-            <w:proofErr w:type="spellEnd"/>
-            <w:r>
-              <w:t xml:space="preserve"> how I want the program to be used</w:t>
             </w:r>
           </w:p>
         </w:tc>
         <w:tc>
           <w:tcPr>
             <w:tcW w:w="1644" w:type="dxa"/>
+            <w:vAlign w:val="center"/>
           </w:tcPr>
           <w:p>
-            <w:r>
-              <w:t>Start to write documentation</w:t>
+            <w:pPr>
+              <w:jc w:val="center"/>
+            </w:pPr>
+            <w:r>
+              <w:t>Design</w:t>
+            </w:r>
+          </w:p>
+        </w:tc>
+        <w:tc>
+          <w:tcPr>
+            <w:tcW w:w="8930" w:type="dxa"/>
+          </w:tcPr>
+          <w:p>
+            <w:pPr>
+              <w:pStyle w:val="ListParagraph"/>
+            </w:pPr>
+            <w:r>
+              <w:t>Started to put together ideas on design ethos,</w:t>
+            </w:r>
+          </w:p>
+          <w:p>
+            <w:pPr>
+              <w:pStyle w:val="ListParagraph"/>
+            </w:pPr>
+            <w:r>
+              <w:t>Outline client wants and needs,</w:t>
+            </w:r>
+          </w:p>
+          <w:p>
+            <w:pPr>
+              <w:pStyle w:val="ListParagraph"/>
+            </w:pPr>
+            <w:r>
+              <w:t>Outlined target audience,</w:t>
+            </w:r>
+          </w:p>
+          <w:p>
+            <w:pPr>
+              <w:pStyle w:val="ListParagraph"/>
+            </w:pPr>
+            <w:r>
+              <w:t>Outlined potential user flows,</w:t>
+            </w:r>
+          </w:p>
+          <w:p>
+            <w:pPr>
+              <w:pStyle w:val="ListParagraph"/>
+            </w:pPr>
+            <w:r>
+              <w:t>Outlined user types and abilities,</w:t>
+            </w:r>
+          </w:p>
+          <w:p>
+            <w:pPr>
+              <w:pStyle w:val="ListParagraph"/>
+            </w:pPr>
+            <w:r>
+              <w:t>Started to design database,</w:t>
             </w:r>
           </w:p>
         </w:tc>
@@ -790,7 +556,7 @@
         </w:trPr>
         <w:tc>
           <w:tcPr>
-            <w:tcW w:w="841" w:type="dxa"/>
+            <w:tcW w:w="683" w:type="dxa"/>
             <w:textDirection w:val="tbRl"/>
             <w:vAlign w:val="center"/>
           </w:tcPr>
@@ -806,7 +572,7 @@
         </w:tc>
         <w:tc>
           <w:tcPr>
-            <w:tcW w:w="932" w:type="dxa"/>
+            <w:tcW w:w="929" w:type="dxa"/>
             <w:vAlign w:val="center"/>
           </w:tcPr>
           <w:p>
@@ -820,7 +586,7 @@
         </w:tc>
         <w:tc>
           <w:tcPr>
-            <w:tcW w:w="1450" w:type="dxa"/>
+            <w:tcW w:w="1644" w:type="dxa"/>
             <w:vAlign w:val="center"/>
           </w:tcPr>
           <w:p>
@@ -834,7 +600,7 @@
         </w:tc>
         <w:tc>
           <w:tcPr>
-            <w:tcW w:w="3822" w:type="dxa"/>
+            <w:tcW w:w="8930" w:type="dxa"/>
           </w:tcPr>
           <w:p>
             <w:pPr>
@@ -855,23 +621,7 @@
               <w:ind w:left="701" w:hanging="283"/>
             </w:pPr>
             <w:r>
-              <w:t xml:space="preserve">Created </w:t>
-            </w:r>
-            <w:proofErr w:type="gramStart"/>
-            <w:r>
-              <w:t>document</w:t>
-            </w:r>
-            <w:proofErr w:type="gramEnd"/>
-            <w:r>
-              <w:t xml:space="preserve"> and prepared </w:t>
-            </w:r>
-            <w:proofErr w:type="gramStart"/>
-            <w:r>
-              <w:t>template</w:t>
-            </w:r>
-            <w:proofErr w:type="gramEnd"/>
-            <w:r>
-              <w:t>,</w:t>
+              <w:t>Created document and prepared template,</w:t>
             </w:r>
           </w:p>
           <w:p>
@@ -883,13 +633,8 @@
               </w:numPr>
               <w:ind w:left="701" w:hanging="283"/>
             </w:pPr>
-            <w:proofErr w:type="gramStart"/>
-            <w:r>
-              <w:t>Wrote</w:t>
-            </w:r>
-            <w:proofErr w:type="gramEnd"/>
-            <w:r>
-              <w:t xml:space="preserve"> introduction,</w:t>
+            <w:r>
+              <w:t>Wrote introduction,</w:t>
             </w:r>
           </w:p>
           <w:p>
@@ -901,13 +646,8 @@
               </w:numPr>
               <w:ind w:left="701" w:hanging="283"/>
             </w:pPr>
-            <w:proofErr w:type="gramStart"/>
-            <w:r>
-              <w:t>Wrote</w:t>
-            </w:r>
-            <w:proofErr w:type="gramEnd"/>
-            <w:r>
-              <w:t xml:space="preserve"> client information,</w:t>
+            <w:r>
+              <w:t>Wrote client information,</w:t>
             </w:r>
           </w:p>
           <w:p>
@@ -948,36 +688,6 @@
             </w:pPr>
             <w:r>
               <w:t>Designed file structure,</w:t>
-            </w:r>
-          </w:p>
-        </w:tc>
-        <w:tc>
-          <w:tcPr>
-            <w:tcW w:w="1799" w:type="dxa"/>
-          </w:tcPr>
-          <w:p>
-            <w:r>
-              <w:t>-</w:t>
-            </w:r>
-          </w:p>
-        </w:tc>
-        <w:tc>
-          <w:tcPr>
-            <w:tcW w:w="1742" w:type="dxa"/>
-          </w:tcPr>
-          <w:p>
-            <w:r>
-              <w:t>I have solidified my understanding of how I want the program to be used</w:t>
-            </w:r>
-          </w:p>
-        </w:tc>
-        <w:tc>
-          <w:tcPr>
-            <w:tcW w:w="1644" w:type="dxa"/>
-          </w:tcPr>
-          <w:p>
-            <w:r>
-              <w:t>Continue documentation</w:t>
             </w:r>
           </w:p>
         </w:tc>
@@ -989,7 +699,7 @@
         </w:trPr>
         <w:tc>
           <w:tcPr>
-            <w:tcW w:w="841" w:type="dxa"/>
+            <w:tcW w:w="683" w:type="dxa"/>
             <w:textDirection w:val="tbRl"/>
             <w:vAlign w:val="center"/>
           </w:tcPr>
@@ -999,14 +709,13 @@
               <w:jc w:val="center"/>
             </w:pPr>
             <w:r>
-              <w:lastRenderedPageBreak/>
               <w:t>08.06.2026</w:t>
             </w:r>
           </w:p>
         </w:tc>
         <w:tc>
           <w:tcPr>
-            <w:tcW w:w="932" w:type="dxa"/>
+            <w:tcW w:w="929" w:type="dxa"/>
             <w:vAlign w:val="center"/>
           </w:tcPr>
           <w:p>
@@ -1020,7 +729,7 @@
         </w:tc>
         <w:tc>
           <w:tcPr>
-            <w:tcW w:w="1450" w:type="dxa"/>
+            <w:tcW w:w="1644" w:type="dxa"/>
             <w:vAlign w:val="center"/>
           </w:tcPr>
           <w:p>
@@ -1034,7 +743,7 @@
         </w:tc>
         <w:tc>
           <w:tcPr>
-            <w:tcW w:w="3822" w:type="dxa"/>
+            <w:tcW w:w="8930" w:type="dxa"/>
           </w:tcPr>
           <w:p>
             <w:pPr>
@@ -1094,39 +803,6 @@
             </w:pPr>
             <w:r>
               <w:t>Added client brief information,</w:t>
-            </w:r>
-          </w:p>
-        </w:tc>
-        <w:tc>
-          <w:tcPr>
-            <w:tcW w:w="1799" w:type="dxa"/>
-          </w:tcPr>
-          <w:p>
-            <w:r>
-              <w:t>Decided on the aims and objectives of the system.</w:t>
-            </w:r>
-          </w:p>
-        </w:tc>
-        <w:tc>
-          <w:tcPr>
-            <w:tcW w:w="1742" w:type="dxa"/>
-          </w:tcPr>
-          <w:p>
-            <w:r>
-              <w:t>I have further developed my understanding of what I want the system to do.</w:t>
-            </w:r>
-          </w:p>
-        </w:tc>
-        <w:tc>
-          <w:tcPr>
-            <w:tcW w:w="1644" w:type="dxa"/>
-          </w:tcPr>
-          <w:p>
-            <w:r>
-              <w:t xml:space="preserve">Review discussion </w:t>
-            </w:r>
-            <w:r>
-              <w:t>documentation</w:t>
             </w:r>
           </w:p>
         </w:tc>
@@ -1138,7 +814,7 @@
         </w:trPr>
         <w:tc>
           <w:tcPr>
-            <w:tcW w:w="841" w:type="dxa"/>
+            <w:tcW w:w="683" w:type="dxa"/>
             <w:textDirection w:val="tbRl"/>
             <w:vAlign w:val="center"/>
           </w:tcPr>
@@ -1154,7 +830,7 @@
         </w:tc>
         <w:tc>
           <w:tcPr>
-            <w:tcW w:w="932" w:type="dxa"/>
+            <w:tcW w:w="929" w:type="dxa"/>
             <w:vAlign w:val="center"/>
           </w:tcPr>
           <w:p>
@@ -1168,7 +844,7 @@
         </w:tc>
         <w:tc>
           <w:tcPr>
-            <w:tcW w:w="1450" w:type="dxa"/>
+            <w:tcW w:w="1644" w:type="dxa"/>
             <w:vAlign w:val="center"/>
           </w:tcPr>
           <w:p>
@@ -1182,7 +858,7 @@
         </w:tc>
         <w:tc>
           <w:tcPr>
-            <w:tcW w:w="3822" w:type="dxa"/>
+            <w:tcW w:w="8930" w:type="dxa"/>
           </w:tcPr>
           <w:p>
             <w:pPr>
@@ -1193,10 +869,7 @@
               </w:numPr>
             </w:pPr>
             <w:r>
-              <w:t xml:space="preserve">Discussed coursework </w:t>
-            </w:r>
-            <w:r>
-              <w:t>options and brief with peers,</w:t>
+              <w:t>Discussed coursework options and brief with peers,</w:t>
             </w:r>
           </w:p>
           <w:p>
@@ -1207,46 +880,8 @@
                 <w:numId w:val="14"/>
               </w:numPr>
             </w:pPr>
-            <w:proofErr w:type="gramStart"/>
-            <w:r>
-              <w:t>Proof read</w:t>
-            </w:r>
-            <w:proofErr w:type="gramEnd"/>
-            <w:r>
-              <w:t xml:space="preserve"> and edited </w:t>
-            </w:r>
-            <w:r>
-              <w:t>discussion documentation,</w:t>
-            </w:r>
-          </w:p>
-        </w:tc>
-        <w:tc>
-          <w:tcPr>
-            <w:tcW w:w="1799" w:type="dxa"/>
-          </w:tcPr>
-          <w:p>
-            <w:r>
-              <w:t>Made sure that wording was sufficiently understandable in documentation.</w:t>
-            </w:r>
-          </w:p>
-        </w:tc>
-        <w:tc>
-          <w:tcPr>
-            <w:tcW w:w="1742" w:type="dxa"/>
-          </w:tcPr>
-          <w:p>
-            <w:r>
-              <w:t>Documentation is more understandable.</w:t>
-            </w:r>
-          </w:p>
-        </w:tc>
-        <w:tc>
-          <w:tcPr>
-            <w:tcW w:w="1644" w:type="dxa"/>
-          </w:tcPr>
-          <w:p>
-            <w:r>
-              <w:t>Make slides for presentation.</w:t>
+            <w:r>
+              <w:t>Proof read and edited discussion documentation,</w:t>
             </w:r>
           </w:p>
         </w:tc>
@@ -1258,7 +893,7 @@
         </w:trPr>
         <w:tc>
           <w:tcPr>
-            <w:tcW w:w="841" w:type="dxa"/>
+            <w:tcW w:w="683" w:type="dxa"/>
             <w:textDirection w:val="tbRl"/>
             <w:vAlign w:val="center"/>
           </w:tcPr>
@@ -1268,13 +903,14 @@
               <w:jc w:val="center"/>
             </w:pPr>
             <w:r>
+              <w:lastRenderedPageBreak/>
               <w:t>14.06.2026</w:t>
             </w:r>
           </w:p>
         </w:tc>
         <w:tc>
           <w:tcPr>
-            <w:tcW w:w="932" w:type="dxa"/>
+            <w:tcW w:w="929" w:type="dxa"/>
             <w:vAlign w:val="center"/>
           </w:tcPr>
           <w:p>
@@ -1282,16 +918,13 @@
               <w:jc w:val="center"/>
             </w:pPr>
             <w:r>
-              <w:t>01:</w:t>
-            </w:r>
-            <w:r>
-              <w:t>55</w:t>
+              <w:t>01:55</w:t>
             </w:r>
           </w:p>
         </w:tc>
         <w:tc>
           <w:tcPr>
-            <w:tcW w:w="1450" w:type="dxa"/>
+            <w:tcW w:w="1644" w:type="dxa"/>
             <w:vAlign w:val="center"/>
           </w:tcPr>
           <w:p>
@@ -1305,7 +938,7 @@
         </w:tc>
         <w:tc>
           <w:tcPr>
-            <w:tcW w:w="3822" w:type="dxa"/>
+            <w:tcW w:w="8930" w:type="dxa"/>
           </w:tcPr>
           <w:p>
             <w:pPr>
@@ -1317,36 +950,6 @@
             </w:pPr>
             <w:r>
               <w:t>Made first draft of presentation</w:t>
-            </w:r>
-          </w:p>
-        </w:tc>
-        <w:tc>
-          <w:tcPr>
-            <w:tcW w:w="1799" w:type="dxa"/>
-          </w:tcPr>
-          <w:p>
-            <w:r>
-              <w:t>Didn’t have a presentation before</w:t>
-            </w:r>
-          </w:p>
-        </w:tc>
-        <w:tc>
-          <w:tcPr>
-            <w:tcW w:w="1742" w:type="dxa"/>
-          </w:tcPr>
-          <w:p>
-            <w:r>
-              <w:t>I have a presentation for the discussion lesson</w:t>
-            </w:r>
-          </w:p>
-        </w:tc>
-        <w:tc>
-          <w:tcPr>
-            <w:tcW w:w="1644" w:type="dxa"/>
-          </w:tcPr>
-          <w:p>
-            <w:r>
-              <w:t>Check presentation and make feedback hand out</w:t>
             </w:r>
           </w:p>
         </w:tc>
@@ -1358,7 +961,7 @@
         </w:trPr>
         <w:tc>
           <w:tcPr>
-            <w:tcW w:w="841" w:type="dxa"/>
+            <w:tcW w:w="683" w:type="dxa"/>
             <w:textDirection w:val="tbRl"/>
             <w:vAlign w:val="center"/>
           </w:tcPr>
@@ -1374,7 +977,7 @@
         </w:tc>
         <w:tc>
           <w:tcPr>
-            <w:tcW w:w="932" w:type="dxa"/>
+            <w:tcW w:w="929" w:type="dxa"/>
             <w:vAlign w:val="center"/>
           </w:tcPr>
           <w:p>
@@ -1388,7 +991,7 @@
         </w:tc>
         <w:tc>
           <w:tcPr>
-            <w:tcW w:w="1450" w:type="dxa"/>
+            <w:tcW w:w="1644" w:type="dxa"/>
             <w:vAlign w:val="center"/>
           </w:tcPr>
           <w:p>
@@ -1402,7 +1005,7 @@
         </w:tc>
         <w:tc>
           <w:tcPr>
-            <w:tcW w:w="3822" w:type="dxa"/>
+            <w:tcW w:w="8930" w:type="dxa"/>
           </w:tcPr>
           <w:p>
             <w:pPr>
@@ -1413,10 +1016,7 @@
               </w:numPr>
             </w:pPr>
             <w:r>
-              <w:t xml:space="preserve">Presented </w:t>
-            </w:r>
-            <w:r>
-              <w:t>discussion,</w:t>
+              <w:t>Presented discussion,</w:t>
             </w:r>
           </w:p>
           <w:p>
@@ -1429,36 +1029,6 @@
             </w:pPr>
             <w:r>
               <w:t>Viewed other presentations,</w:t>
-            </w:r>
-          </w:p>
-        </w:tc>
-        <w:tc>
-          <w:tcPr>
-            <w:tcW w:w="1799" w:type="dxa"/>
-          </w:tcPr>
-          <w:p>
-            <w:r>
-              <w:t>Took feedback on my presentation</w:t>
-            </w:r>
-          </w:p>
-        </w:tc>
-        <w:tc>
-          <w:tcPr>
-            <w:tcW w:w="1742" w:type="dxa"/>
-          </w:tcPr>
-          <w:p>
-            <w:r>
-              <w:t>Was inspired by the ideas of others</w:t>
-            </w:r>
-          </w:p>
-        </w:tc>
-        <w:tc>
-          <w:tcPr>
-            <w:tcW w:w="1644" w:type="dxa"/>
-          </w:tcPr>
-          <w:p>
-            <w:r>
-              <w:t>Write up feedback report</w:t>
             </w:r>
           </w:p>
         </w:tc>
@@ -1470,7 +1040,7 @@
         </w:trPr>
         <w:tc>
           <w:tcPr>
-            <w:tcW w:w="841" w:type="dxa"/>
+            <w:tcW w:w="683" w:type="dxa"/>
             <w:textDirection w:val="tbRl"/>
             <w:vAlign w:val="center"/>
           </w:tcPr>
@@ -1486,7 +1056,7 @@
         </w:tc>
         <w:tc>
           <w:tcPr>
-            <w:tcW w:w="932" w:type="dxa"/>
+            <w:tcW w:w="929" w:type="dxa"/>
             <w:vAlign w:val="center"/>
           </w:tcPr>
           <w:p>
@@ -1500,7 +1070,7 @@
         </w:tc>
         <w:tc>
           <w:tcPr>
-            <w:tcW w:w="1450" w:type="dxa"/>
+            <w:tcW w:w="1644" w:type="dxa"/>
             <w:vAlign w:val="center"/>
           </w:tcPr>
           <w:p>
@@ -1514,7 +1084,7 @@
         </w:tc>
         <w:tc>
           <w:tcPr>
-            <w:tcW w:w="3822" w:type="dxa"/>
+            <w:tcW w:w="8930" w:type="dxa"/>
           </w:tcPr>
           <w:p>
             <w:pPr>
@@ -1526,36 +1096,6 @@
             </w:pPr>
             <w:r>
               <w:t>Viewed other presentations,</w:t>
-            </w:r>
-          </w:p>
-        </w:tc>
-        <w:tc>
-          <w:tcPr>
-            <w:tcW w:w="1799" w:type="dxa"/>
-          </w:tcPr>
-          <w:p>
-            <w:r>
-              <w:t>-</w:t>
-            </w:r>
-          </w:p>
-        </w:tc>
-        <w:tc>
-          <w:tcPr>
-            <w:tcW w:w="1742" w:type="dxa"/>
-          </w:tcPr>
-          <w:p>
-            <w:r>
-              <w:t>Was inspired by ideas of others</w:t>
-            </w:r>
-          </w:p>
-        </w:tc>
-        <w:tc>
-          <w:tcPr>
-            <w:tcW w:w="1644" w:type="dxa"/>
-          </w:tcPr>
-          <w:p>
-            <w:r>
-              <w:t>Write up feedback report</w:t>
             </w:r>
           </w:p>
         </w:tc>
@@ -1567,7 +1107,7 @@
         </w:trPr>
         <w:tc>
           <w:tcPr>
-            <w:tcW w:w="841" w:type="dxa"/>
+            <w:tcW w:w="683" w:type="dxa"/>
             <w:textDirection w:val="tbRl"/>
             <w:vAlign w:val="center"/>
           </w:tcPr>
@@ -1577,14 +1117,13 @@
               <w:jc w:val="center"/>
             </w:pPr>
             <w:r>
-              <w:lastRenderedPageBreak/>
               <w:t>19.06.2026</w:t>
             </w:r>
           </w:p>
         </w:tc>
         <w:tc>
           <w:tcPr>
-            <w:tcW w:w="932" w:type="dxa"/>
+            <w:tcW w:w="929" w:type="dxa"/>
             <w:vAlign w:val="center"/>
           </w:tcPr>
           <w:p>
@@ -1592,22 +1131,13 @@
               <w:jc w:val="center"/>
             </w:pPr>
             <w:r>
-              <w:t>0</w:t>
-            </w:r>
-            <w:r>
-              <w:t>1</w:t>
-            </w:r>
-            <w:r>
-              <w:t>:3</w:t>
-            </w:r>
-            <w:r>
-              <w:t>5</w:t>
+              <w:t>01:35</w:t>
             </w:r>
           </w:p>
         </w:tc>
         <w:tc>
           <w:tcPr>
-            <w:tcW w:w="1450" w:type="dxa"/>
+            <w:tcW w:w="1644" w:type="dxa"/>
             <w:vAlign w:val="center"/>
           </w:tcPr>
           <w:p>
@@ -1621,7 +1151,7 @@
         </w:tc>
         <w:tc>
           <w:tcPr>
-            <w:tcW w:w="3822" w:type="dxa"/>
+            <w:tcW w:w="8930" w:type="dxa"/>
           </w:tcPr>
           <w:p>
             <w:pPr>
@@ -1631,16 +1161,8 @@
                 <w:numId w:val="14"/>
               </w:numPr>
             </w:pPr>
-            <w:proofErr w:type="gramStart"/>
-            <w:r>
-              <w:t>Wrote</w:t>
-            </w:r>
-            <w:proofErr w:type="gramEnd"/>
-            <w:r>
-              <w:t xml:space="preserve"> report on </w:t>
-            </w:r>
-            <w:r>
-              <w:t>feedback given</w:t>
+            <w:r>
+              <w:t>Wrote report on feedback given</w:t>
             </w:r>
           </w:p>
           <w:p>
@@ -1651,46 +1173,8 @@
                 <w:numId w:val="14"/>
               </w:numPr>
             </w:pPr>
-            <w:proofErr w:type="gramStart"/>
-            <w:r>
-              <w:t>Listened</w:t>
-            </w:r>
-            <w:proofErr w:type="gramEnd"/>
-            <w:r>
-              <w:t xml:space="preserve"> to more discussions</w:t>
-            </w:r>
-          </w:p>
-        </w:tc>
-        <w:tc>
-          <w:tcPr>
-            <w:tcW w:w="1799" w:type="dxa"/>
-          </w:tcPr>
-          <w:p>
-            <w:r>
-              <w:t xml:space="preserve">Deciding which feedback items to </w:t>
-            </w:r>
-            <w:r>
-              <w:t>accept</w:t>
-            </w:r>
-          </w:p>
-        </w:tc>
-        <w:tc>
-          <w:tcPr>
-            <w:tcW w:w="1742" w:type="dxa"/>
-          </w:tcPr>
-          <w:p>
-            <w:r>
-              <w:t>I have a clear idea of the changes I am going to make to my brief</w:t>
-            </w:r>
-          </w:p>
-        </w:tc>
-        <w:tc>
-          <w:tcPr>
-            <w:tcW w:w="1644" w:type="dxa"/>
-          </w:tcPr>
-          <w:p>
-            <w:r>
-              <w:t>Submit and start investigation</w:t>
+            <w:r>
+              <w:t>Listened to more discussions</w:t>
             </w:r>
           </w:p>
         </w:tc>
@@ -1702,7 +1186,7 @@
         </w:trPr>
         <w:tc>
           <w:tcPr>
-            <w:tcW w:w="841" w:type="dxa"/>
+            <w:tcW w:w="683" w:type="dxa"/>
             <w:textDirection w:val="tbRl"/>
             <w:vAlign w:val="center"/>
           </w:tcPr>
@@ -1718,7 +1202,7 @@
         </w:tc>
         <w:tc>
           <w:tcPr>
-            <w:tcW w:w="932" w:type="dxa"/>
+            <w:tcW w:w="929" w:type="dxa"/>
             <w:vAlign w:val="center"/>
           </w:tcPr>
           <w:p>
@@ -1732,7 +1216,7 @@
         </w:tc>
         <w:tc>
           <w:tcPr>
-            <w:tcW w:w="1450" w:type="dxa"/>
+            <w:tcW w:w="1644" w:type="dxa"/>
             <w:vAlign w:val="center"/>
           </w:tcPr>
           <w:p>
@@ -1746,7 +1230,7 @@
         </w:tc>
         <w:tc>
           <w:tcPr>
-            <w:tcW w:w="3822" w:type="dxa"/>
+            <w:tcW w:w="8930" w:type="dxa"/>
           </w:tcPr>
           <w:p>
             <w:pPr>
@@ -1758,46 +1242,6 @@
             </w:pPr>
             <w:r>
               <w:t>Researched different methods of writing my program and technologies I can use,</w:t>
-            </w:r>
-          </w:p>
-        </w:tc>
-        <w:tc>
-          <w:tcPr>
-            <w:tcW w:w="1799" w:type="dxa"/>
-          </w:tcPr>
-          <w:p>
-            <w:r>
-              <w:t>Use SQL Alchemy?</w:t>
-            </w:r>
-          </w:p>
-          <w:p>
-            <w:r>
-              <w:t>Use UV?</w:t>
-            </w:r>
-          </w:p>
-          <w:p>
-            <w:r>
-              <w:t>Use alembic?</w:t>
-            </w:r>
-          </w:p>
-        </w:tc>
-        <w:tc>
-          <w:tcPr>
-            <w:tcW w:w="1742" w:type="dxa"/>
-          </w:tcPr>
-          <w:p>
-            <w:r>
-              <w:t>Further research needed</w:t>
-            </w:r>
-          </w:p>
-        </w:tc>
-        <w:tc>
-          <w:tcPr>
-            <w:tcW w:w="1644" w:type="dxa"/>
-          </w:tcPr>
-          <w:p>
-            <w:r>
-              <w:t>More investigation</w:t>
             </w:r>
           </w:p>
         </w:tc>
@@ -1809,7 +1253,7 @@
         </w:trPr>
         <w:tc>
           <w:tcPr>
-            <w:tcW w:w="841" w:type="dxa"/>
+            <w:tcW w:w="683" w:type="dxa"/>
             <w:textDirection w:val="tbRl"/>
             <w:vAlign w:val="center"/>
           </w:tcPr>
@@ -1825,7 +1269,7 @@
         </w:tc>
         <w:tc>
           <w:tcPr>
-            <w:tcW w:w="932" w:type="dxa"/>
+            <w:tcW w:w="929" w:type="dxa"/>
             <w:vAlign w:val="center"/>
           </w:tcPr>
           <w:p>
@@ -1839,7 +1283,7 @@
         </w:tc>
         <w:tc>
           <w:tcPr>
-            <w:tcW w:w="1450" w:type="dxa"/>
+            <w:tcW w:w="1644" w:type="dxa"/>
             <w:vAlign w:val="center"/>
           </w:tcPr>
           <w:p>
@@ -1853,7 +1297,7 @@
         </w:tc>
         <w:tc>
           <w:tcPr>
-            <w:tcW w:w="3822" w:type="dxa"/>
+            <w:tcW w:w="8930" w:type="dxa"/>
           </w:tcPr>
           <w:p>
             <w:pPr>
@@ -1865,51 +1309,6 @@
             </w:pPr>
             <w:r>
               <w:t>Experimented with different technologies that I could use in my project,</w:t>
-            </w:r>
-          </w:p>
-        </w:tc>
-        <w:tc>
-          <w:tcPr>
-            <w:tcW w:w="1799" w:type="dxa"/>
-          </w:tcPr>
-          <w:p>
-            <w:r>
-              <w:t>Use SQL Alchemy?</w:t>
-            </w:r>
-          </w:p>
-          <w:p>
-            <w:r>
-              <w:t>Use UV?</w:t>
-            </w:r>
-          </w:p>
-          <w:p>
-            <w:r>
-              <w:t>Use alembic?</w:t>
-            </w:r>
-          </w:p>
-          <w:p>
-            <w:r>
-              <w:t>Use Flask sessions?</w:t>
-            </w:r>
-          </w:p>
-        </w:tc>
-        <w:tc>
-          <w:tcPr>
-            <w:tcW w:w="1742" w:type="dxa"/>
-          </w:tcPr>
-          <w:p>
-            <w:r>
-              <w:t>Further research needed</w:t>
-            </w:r>
-          </w:p>
-        </w:tc>
-        <w:tc>
-          <w:tcPr>
-            <w:tcW w:w="1644" w:type="dxa"/>
-          </w:tcPr>
-          <w:p>
-            <w:r>
-              <w:t>More investigation</w:t>
             </w:r>
           </w:p>
         </w:tc>
@@ -1921,7 +1320,7 @@
         </w:trPr>
         <w:tc>
           <w:tcPr>
-            <w:tcW w:w="841" w:type="dxa"/>
+            <w:tcW w:w="683" w:type="dxa"/>
             <w:textDirection w:val="tbRl"/>
             <w:vAlign w:val="center"/>
           </w:tcPr>
@@ -1931,19 +1330,14 @@
               <w:jc w:val="center"/>
             </w:pPr>
             <w:r>
-              <w:t>29</w:t>
-            </w:r>
-            <w:r>
-              <w:t>.</w:t>
-            </w:r>
-            <w:r>
-              <w:t>06.2026</w:t>
+              <w:lastRenderedPageBreak/>
+              <w:t>29.06.2026</w:t>
             </w:r>
           </w:p>
         </w:tc>
         <w:tc>
           <w:tcPr>
-            <w:tcW w:w="932" w:type="dxa"/>
+            <w:tcW w:w="929" w:type="dxa"/>
             <w:vAlign w:val="center"/>
           </w:tcPr>
           <w:p>
@@ -1951,16 +1345,13 @@
               <w:jc w:val="center"/>
             </w:pPr>
             <w:r>
-              <w:t>03:</w:t>
-            </w:r>
-            <w:r>
-              <w:t>20</w:t>
+              <w:t>03:20</w:t>
             </w:r>
           </w:p>
         </w:tc>
         <w:tc>
           <w:tcPr>
-            <w:tcW w:w="1450" w:type="dxa"/>
+            <w:tcW w:w="1644" w:type="dxa"/>
             <w:vAlign w:val="center"/>
           </w:tcPr>
           <w:p>
@@ -1974,7 +1365,7 @@
         </w:tc>
         <w:tc>
           <w:tcPr>
-            <w:tcW w:w="3822" w:type="dxa"/>
+            <w:tcW w:w="8930" w:type="dxa"/>
           </w:tcPr>
           <w:p>
             <w:pPr>
@@ -1986,51 +1377,6 @@
             </w:pPr>
             <w:r>
               <w:t>Experimented with different technologies that I could use in my project,</w:t>
-            </w:r>
-          </w:p>
-        </w:tc>
-        <w:tc>
-          <w:tcPr>
-            <w:tcW w:w="1799" w:type="dxa"/>
-          </w:tcPr>
-          <w:p>
-            <w:r>
-              <w:t>Use SQL Alchemy?</w:t>
-            </w:r>
-          </w:p>
-          <w:p>
-            <w:r>
-              <w:t>Use UV?</w:t>
-            </w:r>
-          </w:p>
-          <w:p>
-            <w:r>
-              <w:t>Use alembic?</w:t>
-            </w:r>
-          </w:p>
-          <w:p>
-            <w:r>
-              <w:t>Use Flask sessions?</w:t>
-            </w:r>
-          </w:p>
-        </w:tc>
-        <w:tc>
-          <w:tcPr>
-            <w:tcW w:w="1742" w:type="dxa"/>
-          </w:tcPr>
-          <w:p>
-            <w:r>
-              <w:t>Further research needed</w:t>
-            </w:r>
-          </w:p>
-        </w:tc>
-        <w:tc>
-          <w:tcPr>
-            <w:tcW w:w="1644" w:type="dxa"/>
-          </w:tcPr>
-          <w:p>
-            <w:r>
-              <w:t>More investigation</w:t>
             </w:r>
           </w:p>
         </w:tc>
@@ -2042,7 +1388,7 @@
         </w:trPr>
         <w:tc>
           <w:tcPr>
-            <w:tcW w:w="841" w:type="dxa"/>
+            <w:tcW w:w="683" w:type="dxa"/>
             <w:textDirection w:val="tbRl"/>
             <w:vAlign w:val="center"/>
           </w:tcPr>
@@ -2058,7 +1404,7 @@
         </w:tc>
         <w:tc>
           <w:tcPr>
-            <w:tcW w:w="932" w:type="dxa"/>
+            <w:tcW w:w="929" w:type="dxa"/>
             <w:vAlign w:val="center"/>
           </w:tcPr>
           <w:p>
@@ -2066,19 +1412,13 @@
               <w:jc w:val="center"/>
             </w:pPr>
             <w:r>
-              <w:t>01:</w:t>
-            </w:r>
-            <w:r>
-              <w:t>2</w:t>
-            </w:r>
-            <w:r>
-              <w:t>5</w:t>
+              <w:t>01:25</w:t>
             </w:r>
           </w:p>
         </w:tc>
         <w:tc>
           <w:tcPr>
-            <w:tcW w:w="1450" w:type="dxa"/>
+            <w:tcW w:w="1644" w:type="dxa"/>
             <w:vAlign w:val="center"/>
           </w:tcPr>
           <w:p>
@@ -2092,7 +1432,7 @@
         </w:tc>
         <w:tc>
           <w:tcPr>
-            <w:tcW w:w="3822" w:type="dxa"/>
+            <w:tcW w:w="8930" w:type="dxa"/>
           </w:tcPr>
           <w:p>
             <w:pPr>
@@ -2114,58 +1454,8 @@
                 <w:numId w:val="14"/>
               </w:numPr>
             </w:pPr>
-            <w:proofErr w:type="gramStart"/>
-            <w:r>
-              <w:t>Learnt</w:t>
-            </w:r>
-            <w:proofErr w:type="gramEnd"/>
-            <w:r>
-              <w:t xml:space="preserve"> how to use Flask sessions,</w:t>
-            </w:r>
-          </w:p>
-        </w:tc>
-        <w:tc>
-          <w:tcPr>
-            <w:tcW w:w="1799" w:type="dxa"/>
-          </w:tcPr>
-          <w:p>
-            <w:r>
-              <w:t>Use SQL Alchemy?</w:t>
-            </w:r>
-          </w:p>
-          <w:p>
-            <w:r>
-              <w:t>Use UV?</w:t>
-            </w:r>
-          </w:p>
-          <w:p>
-            <w:r>
-              <w:t>Use alembic?</w:t>
-            </w:r>
-          </w:p>
-          <w:p>
-            <w:r>
-              <w:t>Use Flask sessions?</w:t>
-            </w:r>
-          </w:p>
-        </w:tc>
-        <w:tc>
-          <w:tcPr>
-            <w:tcW w:w="1742" w:type="dxa"/>
-          </w:tcPr>
-          <w:p>
-            <w:r>
-              <w:t>Further research needed</w:t>
-            </w:r>
-          </w:p>
-        </w:tc>
-        <w:tc>
-          <w:tcPr>
-            <w:tcW w:w="1644" w:type="dxa"/>
-          </w:tcPr>
-          <w:p>
-            <w:r>
-              <w:t>More investigation</w:t>
+            <w:r>
+              <w:t>Learnt how to use Flask sessions,</w:t>
             </w:r>
           </w:p>
         </w:tc>
@@ -2177,7 +1467,7 @@
         </w:trPr>
         <w:tc>
           <w:tcPr>
-            <w:tcW w:w="841" w:type="dxa"/>
+            <w:tcW w:w="683" w:type="dxa"/>
             <w:textDirection w:val="tbRl"/>
             <w:vAlign w:val="center"/>
           </w:tcPr>
@@ -2187,20 +1477,13 @@
               <w:jc w:val="center"/>
             </w:pPr>
             <w:r>
-              <w:lastRenderedPageBreak/>
-              <w:t>02.0</w:t>
-            </w:r>
-            <w:r>
-              <w:t>7</w:t>
-            </w:r>
-            <w:r>
-              <w:t>.2026</w:t>
+              <w:t>02.07.2026</w:t>
             </w:r>
           </w:p>
         </w:tc>
         <w:tc>
           <w:tcPr>
-            <w:tcW w:w="932" w:type="dxa"/>
+            <w:tcW w:w="929" w:type="dxa"/>
             <w:vAlign w:val="center"/>
           </w:tcPr>
           <w:p>
@@ -2214,7 +1497,7 @@
         </w:tc>
         <w:tc>
           <w:tcPr>
-            <w:tcW w:w="1450" w:type="dxa"/>
+            <w:tcW w:w="1644" w:type="dxa"/>
             <w:vAlign w:val="center"/>
           </w:tcPr>
           <w:p>
@@ -2228,7 +1511,7 @@
         </w:tc>
         <w:tc>
           <w:tcPr>
-            <w:tcW w:w="3822" w:type="dxa"/>
+            <w:tcW w:w="8930" w:type="dxa"/>
           </w:tcPr>
           <w:p>
             <w:pPr>
@@ -2251,43 +1534,7 @@
               </w:numPr>
             </w:pPr>
             <w:r>
-              <w:t xml:space="preserve">Started </w:t>
-            </w:r>
-            <w:r>
-              <w:t>studying</w:t>
-            </w:r>
-            <w:r>
-              <w:t xml:space="preserve"> of competition,</w:t>
-            </w:r>
-          </w:p>
-        </w:tc>
-        <w:tc>
-          <w:tcPr>
-            <w:tcW w:w="1799" w:type="dxa"/>
-          </w:tcPr>
-          <w:p>
-            <w:r>
-              <w:t>The wants and needs of various stakeholders</w:t>
-            </w:r>
-          </w:p>
-        </w:tc>
-        <w:tc>
-          <w:tcPr>
-            <w:tcW w:w="1742" w:type="dxa"/>
-          </w:tcPr>
-          <w:p>
-            <w:r>
-              <w:t>Have an idea of what some of the stakeholders will want</w:t>
-            </w:r>
-          </w:p>
-        </w:tc>
-        <w:tc>
-          <w:tcPr>
-            <w:tcW w:w="1644" w:type="dxa"/>
-          </w:tcPr>
-          <w:p>
-            <w:r>
-              <w:t>Analysis of competition and more stakeholders</w:t>
+              <w:t>Started studying of competition,</w:t>
             </w:r>
           </w:p>
         </w:tc>
@@ -2299,7 +1546,7 @@
         </w:trPr>
         <w:tc>
           <w:tcPr>
-            <w:tcW w:w="841" w:type="dxa"/>
+            <w:tcW w:w="683" w:type="dxa"/>
             <w:textDirection w:val="tbRl"/>
             <w:vAlign w:val="center"/>
           </w:tcPr>
@@ -2315,7 +1562,7 @@
         </w:tc>
         <w:tc>
           <w:tcPr>
-            <w:tcW w:w="932" w:type="dxa"/>
+            <w:tcW w:w="929" w:type="dxa"/>
             <w:vAlign w:val="center"/>
           </w:tcPr>
           <w:p>
@@ -2323,25 +1570,13 @@
               <w:jc w:val="center"/>
             </w:pPr>
             <w:r>
-              <w:t>0</w:t>
-            </w:r>
-            <w:r>
-              <w:t>2</w:t>
-            </w:r>
-            <w:r>
-              <w:t>:</w:t>
-            </w:r>
-            <w:r>
-              <w:t>0</w:t>
-            </w:r>
-            <w:r>
-              <w:t>0</w:t>
+              <w:t>02:00</w:t>
             </w:r>
           </w:p>
         </w:tc>
         <w:tc>
           <w:tcPr>
-            <w:tcW w:w="1450" w:type="dxa"/>
+            <w:tcW w:w="1644" w:type="dxa"/>
             <w:vAlign w:val="center"/>
           </w:tcPr>
           <w:p>
@@ -2355,7 +1590,7 @@
         </w:tc>
         <w:tc>
           <w:tcPr>
-            <w:tcW w:w="3822" w:type="dxa"/>
+            <w:tcW w:w="8930" w:type="dxa"/>
           </w:tcPr>
           <w:p>
             <w:pPr>
@@ -2366,35 +1601,9 @@
               </w:numPr>
             </w:pPr>
             <w:r>
-              <w:t xml:space="preserve">Continued work on </w:t>
-            </w:r>
-            <w:proofErr w:type="spellStart"/>
-            <w:r>
-              <w:t>analysing</w:t>
-            </w:r>
-            <w:proofErr w:type="spellEnd"/>
-            <w:r>
-              <w:t xml:space="preserve"> competitors,</w:t>
-            </w:r>
-          </w:p>
-        </w:tc>
-        <w:tc>
-          <w:tcPr>
-            <w:tcW w:w="1799" w:type="dxa"/>
-          </w:tcPr>
-          <w:p/>
-        </w:tc>
-        <w:tc>
-          <w:tcPr>
-            <w:tcW w:w="1742" w:type="dxa"/>
-          </w:tcPr>
-          <w:p/>
-        </w:tc>
-        <w:tc>
-          <w:tcPr>
-            <w:tcW w:w="1644" w:type="dxa"/>
-          </w:tcPr>
-          <w:p/>
+              <w:t>Continued work on analysing competitors,</w:t>
+            </w:r>
+          </w:p>
         </w:tc>
       </w:tr>
       <w:tr>
@@ -2404,7 +1613,7 @@
         </w:trPr>
         <w:tc>
           <w:tcPr>
-            <w:tcW w:w="841" w:type="dxa"/>
+            <w:tcW w:w="683" w:type="dxa"/>
             <w:textDirection w:val="tbRl"/>
             <w:vAlign w:val="center"/>
           </w:tcPr>
@@ -2414,19 +1623,13 @@
               <w:jc w:val="center"/>
             </w:pPr>
             <w:r>
-              <w:t>0</w:t>
-            </w:r>
-            <w:r>
-              <w:t>8</w:t>
-            </w:r>
-            <w:r>
-              <w:t>.08.20226</w:t>
+              <w:t>08.08.20226</w:t>
             </w:r>
           </w:p>
         </w:tc>
         <w:tc>
           <w:tcPr>
-            <w:tcW w:w="932" w:type="dxa"/>
+            <w:tcW w:w="929" w:type="dxa"/>
             <w:vAlign w:val="center"/>
           </w:tcPr>
           <w:p>
@@ -2440,7 +1643,7 @@
         </w:tc>
         <w:tc>
           <w:tcPr>
-            <w:tcW w:w="1450" w:type="dxa"/>
+            <w:tcW w:w="1644" w:type="dxa"/>
             <w:vAlign w:val="center"/>
           </w:tcPr>
           <w:p>
@@ -2454,7 +1657,7 @@
         </w:tc>
         <w:tc>
           <w:tcPr>
-            <w:tcW w:w="3822" w:type="dxa"/>
+            <w:tcW w:w="8930" w:type="dxa"/>
           </w:tcPr>
           <w:p>
             <w:pPr>
@@ -2489,34 +1692,7 @@
               </w:numPr>
             </w:pPr>
             <w:r>
-              <w:t xml:space="preserve">Project UV </w:t>
-            </w:r>
-            <w:proofErr w:type="spellStart"/>
-            <w:r>
-              <w:t>init</w:t>
-            </w:r>
-            <w:proofErr w:type="spellEnd"/>
-          </w:p>
-        </w:tc>
-        <w:tc>
-          <w:tcPr>
-            <w:tcW w:w="1799" w:type="dxa"/>
-          </w:tcPr>
-          <w:p/>
-        </w:tc>
-        <w:tc>
-          <w:tcPr>
-            <w:tcW w:w="1742" w:type="dxa"/>
-          </w:tcPr>
-          <w:p/>
-        </w:tc>
-        <w:tc>
-          <w:tcPr>
-            <w:tcW w:w="1644" w:type="dxa"/>
-          </w:tcPr>
-          <w:p>
-            <w:r>
-              <w:t>Questionnaire and interview</w:t>
+              <w:t>Project UV init</w:t>
             </w:r>
           </w:p>
         </w:tc>
@@ -2528,7 +1704,7 @@
         </w:trPr>
         <w:tc>
           <w:tcPr>
-            <w:tcW w:w="841" w:type="dxa"/>
+            <w:tcW w:w="683" w:type="dxa"/>
             <w:textDirection w:val="tbRl"/>
             <w:vAlign w:val="center"/>
           </w:tcPr>
@@ -2544,7 +1720,7 @@
         </w:tc>
         <w:tc>
           <w:tcPr>
-            <w:tcW w:w="932" w:type="dxa"/>
+            <w:tcW w:w="929" w:type="dxa"/>
             <w:vAlign w:val="center"/>
           </w:tcPr>
           <w:p>
@@ -2558,7 +1734,7 @@
         </w:tc>
         <w:tc>
           <w:tcPr>
-            <w:tcW w:w="1450" w:type="dxa"/>
+            <w:tcW w:w="1644" w:type="dxa"/>
             <w:vAlign w:val="center"/>
           </w:tcPr>
           <w:p>
@@ -2572,7 +1748,7 @@
         </w:tc>
         <w:tc>
           <w:tcPr>
-            <w:tcW w:w="3822" w:type="dxa"/>
+            <w:tcW w:w="8930" w:type="dxa"/>
           </w:tcPr>
           <w:p>
             <w:pPr>
@@ -2620,28 +1796,6 @@
             </w:pPr>
             <w:r>
               <w:t>Made report on interview,</w:t>
-            </w:r>
-          </w:p>
-        </w:tc>
-        <w:tc>
-          <w:tcPr>
-            <w:tcW w:w="1799" w:type="dxa"/>
-          </w:tcPr>
-          <w:p/>
-        </w:tc>
-        <w:tc>
-          <w:tcPr>
-            <w:tcW w:w="1742" w:type="dxa"/>
-          </w:tcPr>
-          <w:p/>
-        </w:tc>
-        <w:tc>
-          <w:tcPr>
-            <w:tcW w:w="1644" w:type="dxa"/>
-          </w:tcPr>
-          <w:p>
-            <w:r>
-              <w:t>Document collection and data processing</w:t>
             </w:r>
           </w:p>
         </w:tc>
@@ -2653,7 +1807,7 @@
         </w:trPr>
         <w:tc>
           <w:tcPr>
-            <w:tcW w:w="841" w:type="dxa"/>
+            <w:tcW w:w="683" w:type="dxa"/>
             <w:textDirection w:val="tbRl"/>
             <w:vAlign w:val="center"/>
           </w:tcPr>
@@ -2663,13 +1817,14 @@
               <w:jc w:val="center"/>
             </w:pPr>
             <w:r>
+              <w:lastRenderedPageBreak/>
               <w:t>10.08.2026</w:t>
             </w:r>
           </w:p>
         </w:tc>
         <w:tc>
           <w:tcPr>
-            <w:tcW w:w="932" w:type="dxa"/>
+            <w:tcW w:w="929" w:type="dxa"/>
             <w:vAlign w:val="center"/>
           </w:tcPr>
           <w:p>
@@ -2683,7 +1838,7 @@
         </w:tc>
         <w:tc>
           <w:tcPr>
-            <w:tcW w:w="1450" w:type="dxa"/>
+            <w:tcW w:w="1644" w:type="dxa"/>
             <w:vAlign w:val="center"/>
           </w:tcPr>
           <w:p>
@@ -2697,7 +1852,7 @@
         </w:tc>
         <w:tc>
           <w:tcPr>
-            <w:tcW w:w="3822" w:type="dxa"/>
+            <w:tcW w:w="8930" w:type="dxa"/>
           </w:tcPr>
           <w:p>
             <w:pPr>
@@ -2721,28 +1876,6 @@
             </w:pPr>
             <w:r>
               <w:t>Data processing,</w:t>
-            </w:r>
-          </w:p>
-        </w:tc>
-        <w:tc>
-          <w:tcPr>
-            <w:tcW w:w="1799" w:type="dxa"/>
-          </w:tcPr>
-          <w:p/>
-        </w:tc>
-        <w:tc>
-          <w:tcPr>
-            <w:tcW w:w="1742" w:type="dxa"/>
-          </w:tcPr>
-          <w:p/>
-        </w:tc>
-        <w:tc>
-          <w:tcPr>
-            <w:tcW w:w="1644" w:type="dxa"/>
-          </w:tcPr>
-          <w:p>
-            <w:r>
-              <w:t>Updated limitations, working specification, justifications of methods to use, and updated aims and objectives</w:t>
             </w:r>
           </w:p>
         </w:tc>
@@ -2754,7 +1887,7 @@
         </w:trPr>
         <w:tc>
           <w:tcPr>
-            <w:tcW w:w="841" w:type="dxa"/>
+            <w:tcW w:w="683" w:type="dxa"/>
             <w:textDirection w:val="tbRl"/>
             <w:vAlign w:val="center"/>
           </w:tcPr>
@@ -2764,14 +1897,13 @@
               <w:jc w:val="center"/>
             </w:pPr>
             <w:r>
-              <w:lastRenderedPageBreak/>
               <w:t>12.08.2026</w:t>
             </w:r>
           </w:p>
         </w:tc>
         <w:tc>
           <w:tcPr>
-            <w:tcW w:w="932" w:type="dxa"/>
+            <w:tcW w:w="929" w:type="dxa"/>
             <w:vAlign w:val="center"/>
           </w:tcPr>
           <w:p>
@@ -2785,7 +1917,7 @@
         </w:tc>
         <w:tc>
           <w:tcPr>
-            <w:tcW w:w="1450" w:type="dxa"/>
+            <w:tcW w:w="1644" w:type="dxa"/>
             <w:vAlign w:val="center"/>
           </w:tcPr>
           <w:p>
@@ -2799,7 +1931,7 @@
         </w:tc>
         <w:tc>
           <w:tcPr>
-            <w:tcW w:w="3822" w:type="dxa"/>
+            <w:tcW w:w="8930" w:type="dxa"/>
           </w:tcPr>
           <w:p>
             <w:pPr>
@@ -2835,28 +1967,6 @@
             </w:pPr>
             <w:r>
               <w:t>Aims and objectives</w:t>
-            </w:r>
-          </w:p>
-        </w:tc>
-        <w:tc>
-          <w:tcPr>
-            <w:tcW w:w="1799" w:type="dxa"/>
-          </w:tcPr>
-          <w:p/>
-        </w:tc>
-        <w:tc>
-          <w:tcPr>
-            <w:tcW w:w="1742" w:type="dxa"/>
-          </w:tcPr>
-          <w:p/>
-        </w:tc>
-        <w:tc>
-          <w:tcPr>
-            <w:tcW w:w="1644" w:type="dxa"/>
-          </w:tcPr>
-          <w:p>
-            <w:r>
-              <w:t>Justification of methods</w:t>
             </w:r>
           </w:p>
         </w:tc>
@@ -2868,7 +1978,7 @@
         </w:trPr>
         <w:tc>
           <w:tcPr>
-            <w:tcW w:w="841" w:type="dxa"/>
+            <w:tcW w:w="683" w:type="dxa"/>
             <w:textDirection w:val="tbRl"/>
             <w:vAlign w:val="center"/>
           </w:tcPr>
@@ -2878,19 +1988,13 @@
               <w:jc w:val="center"/>
             </w:pPr>
             <w:r>
-              <w:t>1</w:t>
-            </w:r>
-            <w:r>
-              <w:t>5</w:t>
-            </w:r>
-            <w:r>
-              <w:t>.08.2026</w:t>
+              <w:t>15.08.2026</w:t>
             </w:r>
           </w:p>
         </w:tc>
         <w:tc>
           <w:tcPr>
-            <w:tcW w:w="932" w:type="dxa"/>
+            <w:tcW w:w="929" w:type="dxa"/>
             <w:vAlign w:val="center"/>
           </w:tcPr>
           <w:p>
@@ -2904,7 +2008,7 @@
         </w:tc>
         <w:tc>
           <w:tcPr>
-            <w:tcW w:w="1450" w:type="dxa"/>
+            <w:tcW w:w="1644" w:type="dxa"/>
             <w:vAlign w:val="center"/>
           </w:tcPr>
           <w:p>
@@ -2918,7 +2022,7 @@
         </w:tc>
         <w:tc>
           <w:tcPr>
-            <w:tcW w:w="3822" w:type="dxa"/>
+            <w:tcW w:w="8930" w:type="dxa"/>
           </w:tcPr>
           <w:p>
             <w:pPr>
@@ -2930,28 +2034,6 @@
             </w:pPr>
             <w:r>
               <w:t>Started justification of methods,</w:t>
-            </w:r>
-          </w:p>
-        </w:tc>
-        <w:tc>
-          <w:tcPr>
-            <w:tcW w:w="1799" w:type="dxa"/>
-          </w:tcPr>
-          <w:p/>
-        </w:tc>
-        <w:tc>
-          <w:tcPr>
-            <w:tcW w:w="1742" w:type="dxa"/>
-          </w:tcPr>
-          <w:p/>
-        </w:tc>
-        <w:tc>
-          <w:tcPr>
-            <w:tcW w:w="1644" w:type="dxa"/>
-          </w:tcPr>
-          <w:p>
-            <w:r>
-              <w:t>Complete working specification and justification of methods</w:t>
             </w:r>
           </w:p>
         </w:tc>
@@ -2963,7 +2045,7 @@
         </w:trPr>
         <w:tc>
           <w:tcPr>
-            <w:tcW w:w="841" w:type="dxa"/>
+            <w:tcW w:w="683" w:type="dxa"/>
             <w:textDirection w:val="tbRl"/>
             <w:vAlign w:val="center"/>
           </w:tcPr>
@@ -2979,7 +2061,7 @@
         </w:tc>
         <w:tc>
           <w:tcPr>
-            <w:tcW w:w="932" w:type="dxa"/>
+            <w:tcW w:w="929" w:type="dxa"/>
             <w:vAlign w:val="center"/>
           </w:tcPr>
           <w:p>
@@ -2993,7 +2075,7 @@
         </w:tc>
         <w:tc>
           <w:tcPr>
-            <w:tcW w:w="1450" w:type="dxa"/>
+            <w:tcW w:w="1644" w:type="dxa"/>
             <w:vAlign w:val="center"/>
           </w:tcPr>
           <w:p>
@@ -3007,7 +2089,7 @@
         </w:tc>
         <w:tc>
           <w:tcPr>
-            <w:tcW w:w="3822" w:type="dxa"/>
+            <w:tcW w:w="8930" w:type="dxa"/>
           </w:tcPr>
           <w:p>
             <w:pPr>
@@ -3019,28 +2101,6 @@
             </w:pPr>
             <w:r>
               <w:t>Started to design database structure</w:t>
-            </w:r>
-          </w:p>
-        </w:tc>
-        <w:tc>
-          <w:tcPr>
-            <w:tcW w:w="1799" w:type="dxa"/>
-          </w:tcPr>
-          <w:p/>
-        </w:tc>
-        <w:tc>
-          <w:tcPr>
-            <w:tcW w:w="1742" w:type="dxa"/>
-          </w:tcPr>
-          <w:p/>
-        </w:tc>
-        <w:tc>
-          <w:tcPr>
-            <w:tcW w:w="1644" w:type="dxa"/>
-          </w:tcPr>
-          <w:p>
-            <w:r>
-              <w:t>Continue to iron out kinks in database structure</w:t>
             </w:r>
           </w:p>
         </w:tc>
@@ -3052,7 +2112,7 @@
         </w:trPr>
         <w:tc>
           <w:tcPr>
-            <w:tcW w:w="841" w:type="dxa"/>
+            <w:tcW w:w="683" w:type="dxa"/>
             <w:textDirection w:val="tbRl"/>
             <w:vAlign w:val="center"/>
           </w:tcPr>
@@ -3068,7 +2128,7 @@
         </w:tc>
         <w:tc>
           <w:tcPr>
-            <w:tcW w:w="932" w:type="dxa"/>
+            <w:tcW w:w="929" w:type="dxa"/>
             <w:vAlign w:val="center"/>
           </w:tcPr>
           <w:p>
@@ -3082,7 +2142,7 @@
         </w:tc>
         <w:tc>
           <w:tcPr>
-            <w:tcW w:w="1450" w:type="dxa"/>
+            <w:tcW w:w="1644" w:type="dxa"/>
             <w:vAlign w:val="center"/>
           </w:tcPr>
           <w:p>
@@ -3096,7 +2156,7 @@
         </w:tc>
         <w:tc>
           <w:tcPr>
-            <w:tcW w:w="3822" w:type="dxa"/>
+            <w:tcW w:w="8930" w:type="dxa"/>
           </w:tcPr>
           <w:p>
             <w:pPr>
@@ -3108,28 +2168,6 @@
             </w:pPr>
             <w:r>
               <w:t>Continued database design and worked on UI designs</w:t>
-            </w:r>
-          </w:p>
-        </w:tc>
-        <w:tc>
-          <w:tcPr>
-            <w:tcW w:w="1799" w:type="dxa"/>
-          </w:tcPr>
-          <w:p/>
-        </w:tc>
-        <w:tc>
-          <w:tcPr>
-            <w:tcW w:w="1742" w:type="dxa"/>
-          </w:tcPr>
-          <w:p/>
-        </w:tc>
-        <w:tc>
-          <w:tcPr>
-            <w:tcW w:w="1644" w:type="dxa"/>
-          </w:tcPr>
-          <w:p>
-            <w:r>
-              <w:t>Continue same</w:t>
             </w:r>
           </w:p>
         </w:tc>
@@ -3141,7 +2179,7 @@
         </w:trPr>
         <w:tc>
           <w:tcPr>
-            <w:tcW w:w="841" w:type="dxa"/>
+            <w:tcW w:w="683" w:type="dxa"/>
             <w:textDirection w:val="tbRl"/>
             <w:vAlign w:val="center"/>
           </w:tcPr>
@@ -3151,13 +2189,14 @@
               <w:jc w:val="center"/>
             </w:pPr>
             <w:r>
+              <w:lastRenderedPageBreak/>
               <w:t>28.09.2026</w:t>
             </w:r>
           </w:p>
         </w:tc>
         <w:tc>
           <w:tcPr>
-            <w:tcW w:w="932" w:type="dxa"/>
+            <w:tcW w:w="929" w:type="dxa"/>
             <w:vAlign w:val="center"/>
           </w:tcPr>
           <w:p>
@@ -3171,7 +2210,7 @@
         </w:tc>
         <w:tc>
           <w:tcPr>
-            <w:tcW w:w="1450" w:type="dxa"/>
+            <w:tcW w:w="1644" w:type="dxa"/>
             <w:vAlign w:val="center"/>
           </w:tcPr>
           <w:p>
@@ -3185,7 +2224,7 @@
         </w:tc>
         <w:tc>
           <w:tcPr>
-            <w:tcW w:w="3822" w:type="dxa"/>
+            <w:tcW w:w="8930" w:type="dxa"/>
           </w:tcPr>
           <w:p>
             <w:pPr>
@@ -3197,28 +2236,6 @@
             </w:pPr>
             <w:r>
               <w:t>Continued work on UI designs</w:t>
-            </w:r>
-          </w:p>
-        </w:tc>
-        <w:tc>
-          <w:tcPr>
-            <w:tcW w:w="1799" w:type="dxa"/>
-          </w:tcPr>
-          <w:p/>
-        </w:tc>
-        <w:tc>
-          <w:tcPr>
-            <w:tcW w:w="1742" w:type="dxa"/>
-          </w:tcPr>
-          <w:p/>
-        </w:tc>
-        <w:tc>
-          <w:tcPr>
-            <w:tcW w:w="1644" w:type="dxa"/>
-          </w:tcPr>
-          <w:p>
-            <w:r>
-              <w:t>Finish DB ERD</w:t>
             </w:r>
           </w:p>
         </w:tc>
@@ -3230,7 +2247,7 @@
         </w:trPr>
         <w:tc>
           <w:tcPr>
-            <w:tcW w:w="841" w:type="dxa"/>
+            <w:tcW w:w="683" w:type="dxa"/>
             <w:textDirection w:val="tbRl"/>
             <w:vAlign w:val="center"/>
           </w:tcPr>
@@ -3240,14 +2257,13 @@
               <w:jc w:val="center"/>
             </w:pPr>
             <w:r>
-              <w:lastRenderedPageBreak/>
               <w:t>29.09.2026</w:t>
             </w:r>
           </w:p>
         </w:tc>
         <w:tc>
           <w:tcPr>
-            <w:tcW w:w="932" w:type="dxa"/>
+            <w:tcW w:w="929" w:type="dxa"/>
             <w:vAlign w:val="center"/>
           </w:tcPr>
           <w:p>
@@ -3261,7 +2277,7 @@
         </w:tc>
         <w:tc>
           <w:tcPr>
-            <w:tcW w:w="1450" w:type="dxa"/>
+            <w:tcW w:w="1644" w:type="dxa"/>
             <w:vAlign w:val="center"/>
           </w:tcPr>
           <w:p>
@@ -3275,7 +2291,7 @@
         </w:tc>
         <w:tc>
           <w:tcPr>
-            <w:tcW w:w="3822" w:type="dxa"/>
+            <w:tcW w:w="8930" w:type="dxa"/>
           </w:tcPr>
           <w:p>
             <w:pPr>
@@ -3287,28 +2303,6 @@
             </w:pPr>
             <w:r>
               <w:t>Finished designing database ERD</w:t>
-            </w:r>
-          </w:p>
-        </w:tc>
-        <w:tc>
-          <w:tcPr>
-            <w:tcW w:w="1799" w:type="dxa"/>
-          </w:tcPr>
-          <w:p/>
-        </w:tc>
-        <w:tc>
-          <w:tcPr>
-            <w:tcW w:w="1742" w:type="dxa"/>
-          </w:tcPr>
-          <w:p/>
-        </w:tc>
-        <w:tc>
-          <w:tcPr>
-            <w:tcW w:w="1644" w:type="dxa"/>
-          </w:tcPr>
-          <w:p>
-            <w:r>
-              <w:t>Finish UI</w:t>
             </w:r>
           </w:p>
         </w:tc>
@@ -3320,7 +2314,7 @@
         </w:trPr>
         <w:tc>
           <w:tcPr>
-            <w:tcW w:w="841" w:type="dxa"/>
+            <w:tcW w:w="683" w:type="dxa"/>
             <w:textDirection w:val="tbRl"/>
             <w:vAlign w:val="center"/>
           </w:tcPr>
@@ -3336,7 +2330,7 @@
         </w:tc>
         <w:tc>
           <w:tcPr>
-            <w:tcW w:w="932" w:type="dxa"/>
+            <w:tcW w:w="929" w:type="dxa"/>
             <w:vAlign w:val="center"/>
           </w:tcPr>
           <w:p>
@@ -3350,7 +2344,7 @@
         </w:tc>
         <w:tc>
           <w:tcPr>
-            <w:tcW w:w="1450" w:type="dxa"/>
+            <w:tcW w:w="1644" w:type="dxa"/>
             <w:vAlign w:val="center"/>
           </w:tcPr>
           <w:p>
@@ -3364,7 +2358,7 @@
         </w:tc>
         <w:tc>
           <w:tcPr>
-            <w:tcW w:w="3822" w:type="dxa"/>
+            <w:tcW w:w="8930" w:type="dxa"/>
           </w:tcPr>
           <w:p>
             <w:pPr>
@@ -3387,13 +2381,7 @@
               </w:numPr>
             </w:pPr>
             <w:r>
-              <w:t xml:space="preserve">Did </w:t>
-            </w:r>
-            <w:r>
-              <w:t>i</w:t>
-            </w:r>
-            <w:r>
-              <w:t>nputs/outputs list,</w:t>
+              <w:t>Did inputs/outputs list,</w:t>
             </w:r>
           </w:p>
           <w:p>
@@ -3408,24 +2396,6 @@
               <w:t>Started decomposition,</w:t>
             </w:r>
           </w:p>
-        </w:tc>
-        <w:tc>
-          <w:tcPr>
-            <w:tcW w:w="1799" w:type="dxa"/>
-          </w:tcPr>
-          <w:p/>
-        </w:tc>
-        <w:tc>
-          <w:tcPr>
-            <w:tcW w:w="1742" w:type="dxa"/>
-          </w:tcPr>
-          <w:p/>
-        </w:tc>
-        <w:tc>
-          <w:tcPr>
-            <w:tcW w:w="1644" w:type="dxa"/>
-          </w:tcPr>
-          <w:p/>
         </w:tc>
       </w:tr>
       <w:tr>
@@ -3435,7 +2405,7 @@
         </w:trPr>
         <w:tc>
           <w:tcPr>
-            <w:tcW w:w="841" w:type="dxa"/>
+            <w:tcW w:w="683" w:type="dxa"/>
             <w:textDirection w:val="tbRl"/>
             <w:vAlign w:val="center"/>
           </w:tcPr>
@@ -3451,7 +2421,7 @@
         </w:tc>
         <w:tc>
           <w:tcPr>
-            <w:tcW w:w="932" w:type="dxa"/>
+            <w:tcW w:w="929" w:type="dxa"/>
             <w:vAlign w:val="center"/>
           </w:tcPr>
           <w:p>
@@ -3465,7 +2435,7 @@
         </w:tc>
         <w:tc>
           <w:tcPr>
-            <w:tcW w:w="1450" w:type="dxa"/>
+            <w:tcW w:w="1644" w:type="dxa"/>
             <w:vAlign w:val="center"/>
           </w:tcPr>
           <w:p>
@@ -3479,7 +2449,7 @@
         </w:tc>
         <w:tc>
           <w:tcPr>
-            <w:tcW w:w="3822" w:type="dxa"/>
+            <w:tcW w:w="8930" w:type="dxa"/>
           </w:tcPr>
           <w:p>
             <w:pPr>
@@ -3493,24 +2463,6 @@
               <w:t>Worked on decompositions,</w:t>
             </w:r>
           </w:p>
-        </w:tc>
-        <w:tc>
-          <w:tcPr>
-            <w:tcW w:w="1799" w:type="dxa"/>
-          </w:tcPr>
-          <w:p/>
-        </w:tc>
-        <w:tc>
-          <w:tcPr>
-            <w:tcW w:w="1742" w:type="dxa"/>
-          </w:tcPr>
-          <w:p/>
-        </w:tc>
-        <w:tc>
-          <w:tcPr>
-            <w:tcW w:w="1644" w:type="dxa"/>
-          </w:tcPr>
-          <w:p/>
         </w:tc>
       </w:tr>
       <w:tr>
@@ -3520,7 +2472,7 @@
         </w:trPr>
         <w:tc>
           <w:tcPr>
-            <w:tcW w:w="841" w:type="dxa"/>
+            <w:tcW w:w="683" w:type="dxa"/>
             <w:textDirection w:val="tbRl"/>
             <w:vAlign w:val="center"/>
           </w:tcPr>
@@ -3536,7 +2488,7 @@
         </w:tc>
         <w:tc>
           <w:tcPr>
-            <w:tcW w:w="932" w:type="dxa"/>
+            <w:tcW w:w="929" w:type="dxa"/>
             <w:vAlign w:val="center"/>
           </w:tcPr>
           <w:p>
@@ -3550,7 +2502,7 @@
         </w:tc>
         <w:tc>
           <w:tcPr>
-            <w:tcW w:w="1450" w:type="dxa"/>
+            <w:tcW w:w="1644" w:type="dxa"/>
             <w:vAlign w:val="center"/>
           </w:tcPr>
           <w:p>
@@ -3564,7 +2516,7 @@
         </w:tc>
         <w:tc>
           <w:tcPr>
-            <w:tcW w:w="3822" w:type="dxa"/>
+            <w:tcW w:w="8930" w:type="dxa"/>
           </w:tcPr>
           <w:p>
             <w:pPr>
@@ -3578,24 +2530,6 @@
               <w:t>Worked on decompositions</w:t>
             </w:r>
           </w:p>
-        </w:tc>
-        <w:tc>
-          <w:tcPr>
-            <w:tcW w:w="1799" w:type="dxa"/>
-          </w:tcPr>
-          <w:p/>
-        </w:tc>
-        <w:tc>
-          <w:tcPr>
-            <w:tcW w:w="1742" w:type="dxa"/>
-          </w:tcPr>
-          <w:p/>
-        </w:tc>
-        <w:tc>
-          <w:tcPr>
-            <w:tcW w:w="1644" w:type="dxa"/>
-          </w:tcPr>
-          <w:p/>
         </w:tc>
       </w:tr>
       <w:tr>
@@ -3605,7 +2539,7 @@
         </w:trPr>
         <w:tc>
           <w:tcPr>
-            <w:tcW w:w="841" w:type="dxa"/>
+            <w:tcW w:w="683" w:type="dxa"/>
             <w:textDirection w:val="tbRl"/>
             <w:vAlign w:val="center"/>
           </w:tcPr>
@@ -3615,13 +2549,14 @@
               <w:jc w:val="center"/>
             </w:pPr>
             <w:r>
+              <w:lastRenderedPageBreak/>
               <w:t>08.10.2026</w:t>
             </w:r>
           </w:p>
         </w:tc>
         <w:tc>
           <w:tcPr>
-            <w:tcW w:w="932" w:type="dxa"/>
+            <w:tcW w:w="929" w:type="dxa"/>
             <w:vAlign w:val="center"/>
           </w:tcPr>
           <w:p>
@@ -3635,7 +2570,7 @@
         </w:tc>
         <w:tc>
           <w:tcPr>
-            <w:tcW w:w="1450" w:type="dxa"/>
+            <w:tcW w:w="1644" w:type="dxa"/>
             <w:vAlign w:val="center"/>
           </w:tcPr>
           <w:p>
@@ -3649,7 +2584,7 @@
         </w:tc>
         <w:tc>
           <w:tcPr>
-            <w:tcW w:w="3822" w:type="dxa"/>
+            <w:tcW w:w="8930" w:type="dxa"/>
           </w:tcPr>
           <w:p>
             <w:pPr>
@@ -3675,24 +2610,6 @@
               <w:t>Started admin page UI designs (previously forgotten),</w:t>
             </w:r>
           </w:p>
-        </w:tc>
-        <w:tc>
-          <w:tcPr>
-            <w:tcW w:w="1799" w:type="dxa"/>
-          </w:tcPr>
-          <w:p/>
-        </w:tc>
-        <w:tc>
-          <w:tcPr>
-            <w:tcW w:w="1742" w:type="dxa"/>
-          </w:tcPr>
-          <w:p/>
-        </w:tc>
-        <w:tc>
-          <w:tcPr>
-            <w:tcW w:w="1644" w:type="dxa"/>
-          </w:tcPr>
-          <w:p/>
         </w:tc>
       </w:tr>
       <w:tr>
@@ -3702,7 +2619,7 @@
         </w:trPr>
         <w:tc>
           <w:tcPr>
-            <w:tcW w:w="841" w:type="dxa"/>
+            <w:tcW w:w="683" w:type="dxa"/>
             <w:textDirection w:val="tbRl"/>
             <w:vAlign w:val="center"/>
           </w:tcPr>
@@ -3712,14 +2629,13 @@
               <w:jc w:val="center"/>
             </w:pPr>
             <w:r>
-              <w:lastRenderedPageBreak/>
               <w:t>09.10.2026</w:t>
             </w:r>
           </w:p>
         </w:tc>
         <w:tc>
           <w:tcPr>
-            <w:tcW w:w="932" w:type="dxa"/>
+            <w:tcW w:w="929" w:type="dxa"/>
             <w:vAlign w:val="center"/>
           </w:tcPr>
           <w:p>
@@ -3733,7 +2649,7 @@
         </w:tc>
         <w:tc>
           <w:tcPr>
-            <w:tcW w:w="1450" w:type="dxa"/>
+            <w:tcW w:w="1644" w:type="dxa"/>
             <w:vAlign w:val="center"/>
           </w:tcPr>
           <w:p>
@@ -3741,19 +2657,13 @@
               <w:jc w:val="center"/>
             </w:pPr>
             <w:r>
-              <w:t>Design</w:t>
-            </w:r>
-            <w:r>
-              <w:t xml:space="preserve"> / </w:t>
-            </w:r>
-            <w:r>
-              <w:t>Programming</w:t>
+              <w:t>Design / Programming</w:t>
             </w:r>
           </w:p>
         </w:tc>
         <w:tc>
           <w:tcPr>
-            <w:tcW w:w="3822" w:type="dxa"/>
+            <w:tcW w:w="8930" w:type="dxa"/>
           </w:tcPr>
           <w:p>
             <w:pPr>
@@ -3803,24 +2713,6 @@
               <w:t>Made database SQLAlchemy models</w:t>
             </w:r>
           </w:p>
-        </w:tc>
-        <w:tc>
-          <w:tcPr>
-            <w:tcW w:w="1799" w:type="dxa"/>
-          </w:tcPr>
-          <w:p/>
-        </w:tc>
-        <w:tc>
-          <w:tcPr>
-            <w:tcW w:w="1742" w:type="dxa"/>
-          </w:tcPr>
-          <w:p/>
-        </w:tc>
-        <w:tc>
-          <w:tcPr>
-            <w:tcW w:w="1644" w:type="dxa"/>
-          </w:tcPr>
-          <w:p/>
         </w:tc>
       </w:tr>
       <w:tr>
@@ -3830,7 +2722,7 @@
         </w:trPr>
         <w:tc>
           <w:tcPr>
-            <w:tcW w:w="841" w:type="dxa"/>
+            <w:tcW w:w="683" w:type="dxa"/>
             <w:textDirection w:val="tbRl"/>
             <w:vAlign w:val="center"/>
           </w:tcPr>
@@ -3846,7 +2738,7 @@
         </w:tc>
         <w:tc>
           <w:tcPr>
-            <w:tcW w:w="932" w:type="dxa"/>
+            <w:tcW w:w="929" w:type="dxa"/>
             <w:vAlign w:val="center"/>
           </w:tcPr>
           <w:p>
@@ -3860,7 +2752,7 @@
         </w:tc>
         <w:tc>
           <w:tcPr>
-            <w:tcW w:w="1450" w:type="dxa"/>
+            <w:tcW w:w="1644" w:type="dxa"/>
             <w:vAlign w:val="center"/>
           </w:tcPr>
           <w:p>
@@ -3874,7 +2766,7 @@
         </w:tc>
         <w:tc>
           <w:tcPr>
-            <w:tcW w:w="3822" w:type="dxa"/>
+            <w:tcW w:w="8930" w:type="dxa"/>
           </w:tcPr>
           <w:p>
             <w:pPr>
@@ -3888,24 +2780,6 @@
               <w:t>Laid out what functions need to be made</w:t>
             </w:r>
           </w:p>
-        </w:tc>
-        <w:tc>
-          <w:tcPr>
-            <w:tcW w:w="1799" w:type="dxa"/>
-          </w:tcPr>
-          <w:p/>
-        </w:tc>
-        <w:tc>
-          <w:tcPr>
-            <w:tcW w:w="1742" w:type="dxa"/>
-          </w:tcPr>
-          <w:p/>
-        </w:tc>
-        <w:tc>
-          <w:tcPr>
-            <w:tcW w:w="1644" w:type="dxa"/>
-          </w:tcPr>
-          <w:p/>
         </w:tc>
       </w:tr>
       <w:tr>
@@ -3915,7 +2789,7 @@
         </w:trPr>
         <w:tc>
           <w:tcPr>
-            <w:tcW w:w="841" w:type="dxa"/>
+            <w:tcW w:w="683" w:type="dxa"/>
             <w:textDirection w:val="tbRl"/>
             <w:vAlign w:val="center"/>
           </w:tcPr>
@@ -3931,7 +2805,7 @@
         </w:tc>
         <w:tc>
           <w:tcPr>
-            <w:tcW w:w="932" w:type="dxa"/>
+            <w:tcW w:w="929" w:type="dxa"/>
             <w:vAlign w:val="center"/>
           </w:tcPr>
           <w:p>
@@ -3945,7 +2819,7 @@
         </w:tc>
         <w:tc>
           <w:tcPr>
-            <w:tcW w:w="1450" w:type="dxa"/>
+            <w:tcW w:w="1644" w:type="dxa"/>
             <w:vAlign w:val="center"/>
           </w:tcPr>
           <w:p>
@@ -3959,7 +2833,7 @@
         </w:tc>
         <w:tc>
           <w:tcPr>
-            <w:tcW w:w="3822" w:type="dxa"/>
+            <w:tcW w:w="8930" w:type="dxa"/>
           </w:tcPr>
           <w:p>
             <w:pPr>
@@ -3974,23 +2848,725 @@
             </w:r>
           </w:p>
         </w:tc>
+      </w:tr>
+      <w:tr>
+        <w:trPr>
+          <w:cantSplit/>
+          <w:trHeight w:val="1419"/>
+        </w:trPr>
         <w:tc>
           <w:tcPr>
-            <w:tcW w:w="1799" w:type="dxa"/>
+            <w:tcW w:w="683" w:type="dxa"/>
+            <w:textDirection w:val="tbRl"/>
+            <w:vAlign w:val="center"/>
           </w:tcPr>
-          <w:p/>
+          <w:p>
+            <w:pPr>
+              <w:ind w:left="113" w:right="113"/>
+              <w:jc w:val="center"/>
+            </w:pPr>
+            <w:r>
+              <w:t>12.10.2026</w:t>
+            </w:r>
+          </w:p>
         </w:tc>
         <w:tc>
           <w:tcPr>
-            <w:tcW w:w="1742" w:type="dxa"/>
+            <w:tcW w:w="929" w:type="dxa"/>
+            <w:vAlign w:val="center"/>
           </w:tcPr>
-          <w:p/>
+          <w:p>
+            <w:pPr>
+              <w:jc w:val="center"/>
+            </w:pPr>
+            <w:r>
+              <w:t>00:45</w:t>
+            </w:r>
+          </w:p>
         </w:tc>
         <w:tc>
           <w:tcPr>
             <w:tcW w:w="1644" w:type="dxa"/>
+            <w:vAlign w:val="center"/>
           </w:tcPr>
+          <w:p>
+            <w:pPr>
+              <w:jc w:val="center"/>
+            </w:pPr>
+            <w:r>
+              <w:t>Programming</w:t>
+            </w:r>
+          </w:p>
+        </w:tc>
+        <w:tc>
+          <w:tcPr>
+            <w:tcW w:w="8930" w:type="dxa"/>
+          </w:tcPr>
+          <w:p>
+            <w:pPr>
+              <w:pStyle w:val="ListParagraph"/>
+              <w:numPr>
+                <w:ilvl w:val="0"/>
+                <w:numId w:val="14"/>
+              </w:numPr>
+            </w:pPr>
+            <w:r>
+              <w:t>Worked on docstrings and helped peers</w:t>
+            </w:r>
+          </w:p>
+        </w:tc>
+      </w:tr>
+      <w:tr>
+        <w:trPr>
+          <w:cantSplit/>
+          <w:trHeight w:val="1419"/>
+        </w:trPr>
+        <w:tc>
+          <w:tcPr>
+            <w:tcW w:w="683" w:type="dxa"/>
+            <w:textDirection w:val="tbRl"/>
+            <w:vAlign w:val="center"/>
+          </w:tcPr>
+          <w:p>
+            <w:pPr>
+              <w:ind w:left="113" w:right="113"/>
+              <w:jc w:val="center"/>
+            </w:pPr>
+            <w:r>
+              <w:lastRenderedPageBreak/>
+              <w:t>15.10.2026</w:t>
+            </w:r>
+          </w:p>
+        </w:tc>
+        <w:tc>
+          <w:tcPr>
+            <w:tcW w:w="929" w:type="dxa"/>
+            <w:vAlign w:val="center"/>
+          </w:tcPr>
+          <w:p>
+            <w:pPr>
+              <w:jc w:val="center"/>
+            </w:pPr>
+          </w:p>
+        </w:tc>
+        <w:tc>
+          <w:tcPr>
+            <w:tcW w:w="1644" w:type="dxa"/>
+            <w:vAlign w:val="center"/>
+          </w:tcPr>
+          <w:p>
+            <w:pPr>
+              <w:jc w:val="center"/>
+            </w:pPr>
+            <w:r>
+              <w:t>Programming &amp; Design</w:t>
+            </w:r>
+          </w:p>
+        </w:tc>
+        <w:tc>
+          <w:tcPr>
+            <w:tcW w:w="8930" w:type="dxa"/>
+          </w:tcPr>
+          <w:p>
+            <w:pPr>
+              <w:rPr>
+                <w:b/>
+                <w:bCs/>
+              </w:rPr>
+            </w:pPr>
+            <w:r>
+              <w:rPr>
+                <w:b/>
+                <w:bCs/>
+              </w:rPr>
+              <w:t>AI Usage</w:t>
+            </w:r>
+            <w:r>
+              <w:rPr>
+                <w:b/>
+                <w:bCs/>
+              </w:rPr>
+              <w:t xml:space="preserve"> Event #1</w:t>
+            </w:r>
+            <w:r>
+              <w:rPr>
+                <w:b/>
+                <w:bCs/>
+              </w:rPr>
+              <w:t>:</w:t>
+            </w:r>
+          </w:p>
+          <w:p>
+            <w:r>
+              <w:t>This is the first time I used AI in my project.</w:t>
+            </w:r>
+          </w:p>
           <w:p/>
+          <w:p>
+            <w:r>
+              <w:t>I used Claude Code in the terminal to convert the docstrings I had already created to paragraphs for my algorithms documentation. My justification for this usage was that I had already done the though process and I was merely getting it to reformat it slightly. I only had it make these paragraphs, I will write pseudocode for a number of them myself in the future.</w:t>
+            </w:r>
+          </w:p>
+          <w:p/>
+          <w:p>
+            <w:r>
+              <w:t xml:space="preserve">This likely took in the region of 30 minutes </w:t>
+            </w:r>
+            <w:r>
+              <w:t>as I had to run the full prompt each time I wanted to make a minor change else I would have had to paste a lengthy conversation with the LLM into this section and you would have had to watch me get increasingly annoyed with it.</w:t>
+            </w:r>
+          </w:p>
+          <w:p/>
+          <w:p>
+            <w:pPr>
+              <w:rPr>
+                <w:b/>
+                <w:bCs/>
+              </w:rPr>
+            </w:pPr>
+            <w:r>
+              <w:rPr>
+                <w:b/>
+                <w:bCs/>
+              </w:rPr>
+              <w:t>Prompt:</w:t>
+            </w:r>
+          </w:p>
+          <w:p>
+            <w:pPr>
+              <w:rPr>
+                <w:lang w:val="en-GB"/>
+              </w:rPr>
+            </w:pPr>
+            <w:r>
+              <w:rPr>
+                <w:lang w:val="en-GB"/>
+              </w:rPr>
+              <w:t>I have made a number of custom module outlines for my program. Each module has a number of fils and each file has a number of functions. Each function has a docstring outlining the inputs it needs, the outputs it provides and a basic overview of any processing it does. The modules are in the respective folders: bookings, flights, seats, and users. My task for the moment is converting the docstrings to paragraphs.</w:t>
+            </w:r>
+          </w:p>
+          <w:p>
+            <w:pPr>
+              <w:rPr>
+                <w:lang w:val="en-GB"/>
+              </w:rPr>
+            </w:pPr>
+          </w:p>
+          <w:p>
+            <w:pPr>
+              <w:rPr>
+                <w:lang w:val="en-GB"/>
+              </w:rPr>
+            </w:pPr>
+            <w:r>
+              <w:rPr>
+                <w:lang w:val="en-GB"/>
+              </w:rPr>
+              <w:t>I have made you a file "C:\Users\georg\OneDrive - The College of Richard Collyer\01 - Computer Science\Python Projects\Coursework_Airline-Booking\.documentation\AI Usage\Algorithms Docstring Conversion\Claude Document.docx" that has my heading styling already in it.</w:t>
+            </w:r>
+          </w:p>
+          <w:p>
+            <w:pPr>
+              <w:rPr>
+                <w:lang w:val="en-GB"/>
+              </w:rPr>
+            </w:pPr>
+          </w:p>
+          <w:p>
+            <w:pPr>
+              <w:rPr>
+                <w:lang w:val="en-GB"/>
+              </w:rPr>
+            </w:pPr>
+            <w:r>
+              <w:rPr>
+                <w:lang w:val="en-GB"/>
+              </w:rPr>
+              <w:t xml:space="preserve">Please write a brief paragraph for each function detailing the same information as included in the docstring, name of the function, arguments of the function, and return type prediction of the function. Your document should be organised with a level 2 heading for each module and a level 4 heading for each function. You should skip level 3 headers. Each level 4 heading should be preceded by a line break. Do not have the heading just as the name of the function; this can be included too but tidy it up for the heading by getting rid of underscores and fixing capitalisation. All spelling should be done by the UK standard (i.e.: no dropping the 'u' in colour and "-ise" instead of "-ize" suffixes). Try to keep your language understandable; I have been blunt with my docstrings trying to get straight to the point but you may reword them to make them more understandable. You may use bullet points and numbered lists if deemed appropriate/necessary (don't use them if not needed or helpful to overall readability). For writing style and intonation, feel free to look at my other documents in the .documentation </w:t>
+            </w:r>
+            <w:r>
+              <w:rPr>
+                <w:lang w:val="en-GB"/>
+              </w:rPr>
+              <w:lastRenderedPageBreak/>
+              <w:t>folder for inspiration for my personal writing style. For example, I indent after every new paragraph except the first in a block of text. I also start the body of each bullet point/numbered list item with a capital letter; I end short bullet point/numbered list item with a comma and longer ones with a semicolon (even if they are at the end of the list). You should order files within modules in the order in which they appear: alphabetically by file name within modules then in given order of files. I have already tried to group them somewhat.</w:t>
+            </w:r>
+          </w:p>
+          <w:p>
+            <w:pPr>
+              <w:rPr>
+                <w:lang w:val="en-GB"/>
+              </w:rPr>
+            </w:pPr>
+          </w:p>
+          <w:p>
+            <w:pPr>
+              <w:rPr>
+                <w:lang w:val="en-GB"/>
+              </w:rPr>
+            </w:pPr>
+            <w:r>
+              <w:rPr>
+                <w:lang w:val="en-GB"/>
+              </w:rPr>
+              <w:t>You may also look at the rest of the directory where required. For example, you may be inclined to look at the models to view the constants that I import for validation against.</w:t>
+            </w:r>
+          </w:p>
+          <w:p>
+            <w:pPr>
+              <w:rPr>
+                <w:lang w:val="en-GB"/>
+              </w:rPr>
+            </w:pPr>
+          </w:p>
+          <w:p>
+            <w:pPr>
+              <w:rPr>
+                <w:lang w:val="en-GB"/>
+              </w:rPr>
+            </w:pPr>
+            <w:r>
+              <w:rPr>
+                <w:lang w:val="en-GB"/>
+              </w:rPr>
+              <w:t>DO NOT EDIT ANY FILES OTHER THAN "C:\Users\georg\OneDrive - The College of Richard Collyer\01 - Computer Science\Python Projects\Coursework_Airline-Booking\.documentation\AI Usage\Algorithms Docstring Conversion\Claude Document.docx".</w:t>
+            </w:r>
+          </w:p>
+          <w:p/>
+          <w:p>
+            <w:pPr>
+              <w:rPr>
+                <w:b/>
+                <w:bCs/>
+              </w:rPr>
+            </w:pPr>
+            <w:r>
+              <w:rPr>
+                <w:b/>
+                <w:bCs/>
+              </w:rPr>
+              <w:t>Output:</w:t>
+            </w:r>
+          </w:p>
+          <w:p>
+            <w:r>
+              <w:t>It would be needlessly verbose of me to copy the entire input of my module docstrings and the associated paragraphs here. Instead, I will provide examples of conversions. I have kept complete records of my usage in “/.documentation/AI usage/Algorithms Docstring Conversions”. This contains: the prompt, a snapshot of the modules and their docstrings at the time of running the prompt, and the output word document Claude provided (if you are my teacher reading this, I can provide these files upon request).</w:t>
+            </w:r>
+          </w:p>
+          <w:p/>
+          <w:p>
+            <w:r>
+              <w:t>Function &amp; Docstring</w:t>
+            </w:r>
+            <w:r>
+              <w:t xml:space="preserve"> Input</w:t>
+            </w:r>
+            <w:r>
+              <w:t>:</w:t>
+            </w:r>
+          </w:p>
+          <w:p>
+            <w:pPr>
+              <w:rPr>
+                <w:lang w:val="en-GB"/>
+              </w:rPr>
+            </w:pPr>
+            <w:r>
+              <w:rPr>
+                <w:lang w:val="en-GB"/>
+              </w:rPr>
+              <w:t>@with_session</w:t>
+            </w:r>
+          </w:p>
+          <w:p>
+            <w:pPr>
+              <w:rPr>
+                <w:lang w:val="en-GB"/>
+              </w:rPr>
+            </w:pPr>
+            <w:r>
+              <w:rPr>
+                <w:lang w:val="en-GB"/>
+              </w:rPr>
+              <w:t>def get_flight_details(Session: Session, flight_id: int, airport_staff_id: int) -&gt; dict:</w:t>
+            </w:r>
+          </w:p>
+          <w:p>
+            <w:pPr>
+              <w:rPr>
+                <w:lang w:val="en-GB"/>
+              </w:rPr>
+            </w:pPr>
+            <w:r>
+              <w:rPr>
+                <w:lang w:val="en-GB"/>
+              </w:rPr>
+              <w:t>    """Gets the flight details for the selected flight. Used by check-in and get agent portals.</w:t>
+            </w:r>
+          </w:p>
+          <w:p>
+            <w:pPr>
+              <w:rPr>
+                <w:lang w:val="en-GB"/>
+              </w:rPr>
+            </w:pPr>
+          </w:p>
+          <w:p>
+            <w:pPr>
+              <w:rPr>
+                <w:lang w:val="en-GB"/>
+              </w:rPr>
+            </w:pPr>
+            <w:r>
+              <w:rPr>
+                <w:lang w:val="en-GB"/>
+              </w:rPr>
+              <w:t>    ## Return Format:</w:t>
+            </w:r>
+          </w:p>
+          <w:p>
+            <w:pPr>
+              <w:rPr>
+                <w:lang w:val="en-GB"/>
+              </w:rPr>
+            </w:pPr>
+            <w:r>
+              <w:rPr>
+                <w:lang w:val="en-GB"/>
+              </w:rPr>
+              <w:t>        {</w:t>
+            </w:r>
+          </w:p>
+          <w:p>
+            <w:pPr>
+              <w:rPr>
+                <w:lang w:val="en-GB"/>
+              </w:rPr>
+            </w:pPr>
+            <w:r>
+              <w:rPr>
+                <w:lang w:val="en-GB"/>
+              </w:rPr>
+              <w:t>            "flightNo": &lt;flight_number&gt;: str,</w:t>
+            </w:r>
+          </w:p>
+          <w:p>
+            <w:pPr>
+              <w:rPr>
+                <w:lang w:val="en-GB"/>
+              </w:rPr>
+            </w:pPr>
+            <w:r>
+              <w:rPr>
+                <w:lang w:val="en-GB"/>
+              </w:rPr>
+              <w:t>            "totalPassengers": &lt;total_passengers&gt;: int,</w:t>
+            </w:r>
+          </w:p>
+          <w:p>
+            <w:pPr>
+              <w:rPr>
+                <w:lang w:val="en-GB"/>
+              </w:rPr>
+            </w:pPr>
+            <w:r>
+              <w:rPr>
+                <w:lang w:val="en-GB"/>
+              </w:rPr>
+              <w:t>            "checked": &lt;check_passengers_total&gt;: int,</w:t>
+            </w:r>
+          </w:p>
+          <w:p>
+            <w:pPr>
+              <w:rPr>
+                <w:lang w:val="en-GB"/>
+              </w:rPr>
+            </w:pPr>
+            <w:r>
+              <w:rPr>
+                <w:lang w:val="en-GB"/>
+              </w:rPr>
+              <w:t>            "boarded" &lt;boarded_passengers_total&gt;: int,</w:t>
+            </w:r>
+          </w:p>
+          <w:p>
+            <w:pPr>
+              <w:rPr>
+                <w:lang w:val="en-GB"/>
+              </w:rPr>
+            </w:pPr>
+            <w:r>
+              <w:rPr>
+                <w:lang w:val="en-GB"/>
+              </w:rPr>
+              <w:t>            "status": &lt;status&gt;: str,</w:t>
+            </w:r>
+          </w:p>
+          <w:p>
+            <w:pPr>
+              <w:rPr>
+                <w:lang w:val="en-GB"/>
+              </w:rPr>
+            </w:pPr>
+            <w:r>
+              <w:rPr>
+                <w:lang w:val="en-GB"/>
+              </w:rPr>
+              <w:lastRenderedPageBreak/>
+              <w:t>            "departureTime": &lt;departure_datetime&gt;: datetime,</w:t>
+            </w:r>
+          </w:p>
+          <w:p>
+            <w:pPr>
+              <w:rPr>
+                <w:lang w:val="en-GB"/>
+              </w:rPr>
+            </w:pPr>
+            <w:r>
+              <w:rPr>
+                <w:lang w:val="en-GB"/>
+              </w:rPr>
+              <w:t>            "checkInCloseTime": &lt;check_in_close_datetime&gt;: datetime,</w:t>
+            </w:r>
+          </w:p>
+          <w:p>
+            <w:pPr>
+              <w:rPr>
+                <w:lang w:val="en-GB"/>
+              </w:rPr>
+            </w:pPr>
+            <w:r>
+              <w:rPr>
+                <w:lang w:val="en-GB"/>
+              </w:rPr>
+              <w:t>            "gateCloseTime": &lt;gate_close_datetime&gt;: datetime,</w:t>
+            </w:r>
+          </w:p>
+          <w:p>
+            <w:pPr>
+              <w:rPr>
+                <w:lang w:val="en-GB"/>
+              </w:rPr>
+            </w:pPr>
+            <w:r>
+              <w:rPr>
+                <w:lang w:val="en-GB"/>
+              </w:rPr>
+              <w:t>        }</w:t>
+            </w:r>
+          </w:p>
+          <w:p>
+            <w:pPr>
+              <w:rPr>
+                <w:lang w:val="en-GB"/>
+              </w:rPr>
+            </w:pPr>
+          </w:p>
+          <w:p>
+            <w:pPr>
+              <w:rPr>
+                <w:lang w:val="en-GB"/>
+              </w:rPr>
+            </w:pPr>
+            <w:r>
+              <w:rPr>
+                <w:lang w:val="en-GB"/>
+              </w:rPr>
+              <w:t>    Args:</w:t>
+            </w:r>
+          </w:p>
+          <w:p>
+            <w:pPr>
+              <w:rPr>
+                <w:lang w:val="en-GB"/>
+              </w:rPr>
+            </w:pPr>
+            <w:r>
+              <w:rPr>
+                <w:lang w:val="en-GB"/>
+              </w:rPr>
+              <w:t>        Session (Session): The database session automatically provided by @with_session</w:t>
+            </w:r>
+          </w:p>
+          <w:p>
+            <w:pPr>
+              <w:rPr>
+                <w:lang w:val="en-GB"/>
+              </w:rPr>
+            </w:pPr>
+            <w:r>
+              <w:rPr>
+                <w:lang w:val="en-GB"/>
+              </w:rPr>
+              <w:t>        flight_id (int): The flight number to get details for</w:t>
+            </w:r>
+          </w:p>
+          <w:p>
+            <w:pPr>
+              <w:rPr>
+                <w:lang w:val="en-GB"/>
+              </w:rPr>
+            </w:pPr>
+            <w:r>
+              <w:rPr>
+                <w:lang w:val="en-GB"/>
+              </w:rPr>
+              <w:t>        airport_staff_id (int): The airport staff ID the request is coming from to ensure they have access to that flight</w:t>
+            </w:r>
+          </w:p>
+          <w:p>
+            <w:pPr>
+              <w:rPr>
+                <w:lang w:val="en-GB"/>
+              </w:rPr>
+            </w:pPr>
+            <w:r>
+              <w:rPr>
+                <w:lang w:val="en-GB"/>
+              </w:rPr>
+              <w:t>    """</w:t>
+            </w:r>
+          </w:p>
+          <w:p/>
+          <w:p>
+            <w:r>
+              <w:t>Claude Paragraph:</w:t>
+            </w:r>
+          </w:p>
+          <w:p>
+            <w:pPr>
+              <w:pStyle w:val="Heading4"/>
+            </w:pPr>
+            <w:r>
+              <w:t>Get Flight Details</w:t>
+            </w:r>
+          </w:p>
+          <w:p>
+            <w:r>
+              <w:t xml:space="preserve">The </w:t>
+            </w:r>
+            <w:r>
+              <w:rPr>
+                <w:rFonts w:ascii="Consolas" w:hAnsi="Consolas"/>
+              </w:rPr>
+              <w:t>get_flight_details</w:t>
+            </w:r>
+            <w:r>
+              <w:t xml:space="preserve"> function gets the details of a selected flight for use in the check-in and gate agent portals. Besides the session, it takes the flight number of the flight (</w:t>
+            </w:r>
+            <w:r>
+              <w:rPr>
+                <w:rFonts w:ascii="Consolas" w:hAnsi="Consolas"/>
+              </w:rPr>
+              <w:t>flight_no</w:t>
+            </w:r>
+            <w:r>
+              <w:t>: int) and the ID of the member of airport staff making the request (</w:t>
+            </w:r>
+            <w:r>
+              <w:rPr>
+                <w:rFonts w:ascii="Consolas" w:hAnsi="Consolas"/>
+              </w:rPr>
+              <w:t>airport_staff_id</w:t>
+            </w:r>
+            <w:r>
+              <w:t>: int); the latter is used to make sure that they have access to that flight. It returns a dictionary (</w:t>
+            </w:r>
+            <w:r>
+              <w:rPr>
+                <w:rFonts w:ascii="Consolas" w:hAnsi="Consolas"/>
+              </w:rPr>
+              <w:t>dict</w:t>
+            </w:r>
+            <w:r>
+              <w:t>) containing:</w:t>
+            </w:r>
+          </w:p>
+          <w:p>
+            <w:pPr>
+              <w:pStyle w:val="ListParagraph"/>
+              <w:spacing w:after="80" w:line="278" w:lineRule="auto"/>
+              <w:ind w:left="720"/>
+            </w:pPr>
+            <w:r>
+              <w:t>“flightNo” – the flight number (str),</w:t>
+            </w:r>
+          </w:p>
+          <w:p>
+            <w:pPr>
+              <w:pStyle w:val="ListParagraph"/>
+              <w:spacing w:after="80" w:line="278" w:lineRule="auto"/>
+              <w:ind w:left="720"/>
+            </w:pPr>
+            <w:r>
+              <w:t>“totalPassengers” – the total number of passengers booked on to the flight (int),</w:t>
+            </w:r>
+          </w:p>
+          <w:p>
+            <w:pPr>
+              <w:pStyle w:val="ListParagraph"/>
+              <w:spacing w:after="80" w:line="278" w:lineRule="auto"/>
+              <w:ind w:left="720"/>
+            </w:pPr>
+            <w:r>
+              <w:t>“checked” – the number of passengers that have checked in (int),</w:t>
+            </w:r>
+          </w:p>
+          <w:p>
+            <w:pPr>
+              <w:pStyle w:val="ListParagraph"/>
+              <w:spacing w:after="80" w:line="278" w:lineRule="auto"/>
+              <w:ind w:left="720"/>
+            </w:pPr>
+            <w:r>
+              <w:t>“boarded” – the number of passengers that have boarded (int),</w:t>
+            </w:r>
+          </w:p>
+          <w:p>
+            <w:pPr>
+              <w:pStyle w:val="ListParagraph"/>
+              <w:spacing w:after="80" w:line="278" w:lineRule="auto"/>
+              <w:ind w:left="720"/>
+            </w:pPr>
+            <w:r>
+              <w:t>“status” – the status of the flight (str),</w:t>
+            </w:r>
+          </w:p>
+          <w:p>
+            <w:pPr>
+              <w:pStyle w:val="ListParagraph"/>
+              <w:spacing w:after="80" w:line="278" w:lineRule="auto"/>
+              <w:ind w:left="720"/>
+            </w:pPr>
+            <w:r>
+              <w:t>“departureTime” – the date and time of departure (datetime),</w:t>
+            </w:r>
+          </w:p>
+          <w:p>
+            <w:pPr>
+              <w:pStyle w:val="ListParagraph"/>
+              <w:spacing w:after="80" w:line="278" w:lineRule="auto"/>
+              <w:ind w:left="720"/>
+            </w:pPr>
+            <w:r>
+              <w:t>“checkInCloseTime” – the date and time that check-in closes (datetime),</w:t>
+            </w:r>
+          </w:p>
+          <w:p>
+            <w:pPr>
+              <w:pStyle w:val="ListParagraph"/>
+              <w:spacing w:after="80" w:line="278" w:lineRule="auto"/>
+              <w:ind w:left="720"/>
+            </w:pPr>
+            <w:r>
+              <w:t>“gateCloseTime” – the date and time that the gate closes (datetime),</w:t>
+            </w:r>
+          </w:p>
+          <w:p>
+            <w:pPr>
+              <w:ind w:left="360" w:hanging="360"/>
+            </w:pPr>
+          </w:p>
         </w:tc>
       </w:tr>
     </w:tbl>
@@ -3999,6 +3575,7 @@
         <w:pStyle w:val="Heading2"/>
       </w:pPr>
       <w:r>
+        <w:lastRenderedPageBreak/>
         <w:t>Example Entry</w:t>
       </w:r>
     </w:p>
@@ -4096,6 +3673,7 @@
           </w:tcPr>
           <w:p>
             <w:r>
+              <w:lastRenderedPageBreak/>
               <w:t>12/10/25</w:t>
             </w:r>
           </w:p>
@@ -5564,7 +5142,6 @@
   <w:style w:type="character" w:default="1" w:styleId="DefaultParagraphFont">
     <w:name w:val="Default Paragraph Font"/>
     <w:uiPriority w:val="1"/>
-    <w:semiHidden/>
     <w:unhideWhenUsed/>
   </w:style>
   <w:style w:type="table" w:default="1" w:styleId="TableNormal">
@@ -16668,10 +16245,26 @@
 </file>
 
 <file path=customXml/item1.xml><?xml version="1.0" encoding="utf-8"?>
-<b:Sources xmlns:b="http://schemas.openxmlformats.org/officeDocument/2006/bibliography" xmlns="http://schemas.openxmlformats.org/officeDocument/2006/bibliography" SelectedStyle="/APA.XSL" StyleName="APA"/>
+<p:properties xmlns:p="http://schemas.microsoft.com/office/2006/metadata/properties" xmlns:xsi="http://www.w3.org/2001/XMLSchema-instance" xmlns:pc="http://schemas.microsoft.com/office/infopath/2007/PartnerControls">
+  <documentManagement>
+    <TaxCatchAll xmlns="10d644ba-cf16-43e8-a31a-a6f565d9c224" xsi:nil="true"/>
+    <lcf76f155ced4ddcb4097134ff3c332f xmlns="9f27979c-cb1a-4f8c-bada-64f9d3ac4d94">
+      <Terms xmlns="http://schemas.microsoft.com/office/infopath/2007/PartnerControls"/>
+    </lcf76f155ced4ddcb4097134ff3c332f>
+  </documentManagement>
+</p:properties>
 </file>
 
 <file path=customXml/item2.xml><?xml version="1.0" encoding="utf-8"?>
+<?mso-contentType ?>
+<FormTemplates xmlns="http://schemas.microsoft.com/sharepoint/v3/contenttype/forms">
+  <Display>DocumentLibraryForm</Display>
+  <Edit>DocumentLibraryForm</Edit>
+  <New>DocumentLibraryForm</New>
+</FormTemplates>
+</file>
+
+<file path=customXml/item3.xml><?xml version="1.0" encoding="utf-8"?>
 <ct:contentTypeSchema xmlns:ct="http://schemas.microsoft.com/office/2006/metadata/contentType" xmlns:ma="http://schemas.microsoft.com/office/2006/metadata/properties/metaAttributes" ct:_="" ma:_="" ma:contentTypeName="Document" ma:contentTypeID="0x010100B31D159F86750749BAD869CB65D39E6C" ma:contentTypeVersion="19" ma:contentTypeDescription="Create a new document." ma:contentTypeScope="" ma:versionID="0ea2422bc5c6366a6faeb9099b70d2d2">
   <xsd:schema xmlns:xsd="http://www.w3.org/2001/XMLSchema" xmlns:xs="http://www.w3.org/2001/XMLSchema" xmlns:p="http://schemas.microsoft.com/office/2006/metadata/properties" xmlns:ns2="9f27979c-cb1a-4f8c-bada-64f9d3ac4d94" xmlns:ns3="10d644ba-cf16-43e8-a31a-a6f565d9c224" targetNamespace="http://schemas.microsoft.com/office/2006/metadata/properties" ma:root="true" ma:fieldsID="3a98ec8fef0d077c94de2b1dd278fe35" ns2:_="" ns3:_="">
     <xsd:import namespace="9f27979c-cb1a-4f8c-bada-64f9d3ac4d94"/>
@@ -16932,35 +16525,30 @@
 </ct:contentTypeSchema>
 </file>
 
-<file path=customXml/item3.xml><?xml version="1.0" encoding="utf-8"?>
-<?mso-contentType ?>
-<FormTemplates xmlns="http://schemas.microsoft.com/sharepoint/v3/contenttype/forms">
-  <Display>DocumentLibraryForm</Display>
-  <Edit>DocumentLibraryForm</Edit>
-  <New>DocumentLibraryForm</New>
-</FormTemplates>
-</file>
-
 <file path=customXml/item4.xml><?xml version="1.0" encoding="utf-8"?>
-<p:properties xmlns:p="http://schemas.microsoft.com/office/2006/metadata/properties" xmlns:xsi="http://www.w3.org/2001/XMLSchema-instance" xmlns:pc="http://schemas.microsoft.com/office/infopath/2007/PartnerControls">
-  <documentManagement>
-    <TaxCatchAll xmlns="10d644ba-cf16-43e8-a31a-a6f565d9c224" xsi:nil="true"/>
-    <lcf76f155ced4ddcb4097134ff3c332f xmlns="9f27979c-cb1a-4f8c-bada-64f9d3ac4d94">
-      <Terms xmlns="http://schemas.microsoft.com/office/infopath/2007/PartnerControls"/>
-    </lcf76f155ced4ddcb4097134ff3c332f>
-  </documentManagement>
-</p:properties>
+<b:Sources xmlns:b="http://schemas.openxmlformats.org/officeDocument/2006/bibliography" xmlns="http://schemas.openxmlformats.org/officeDocument/2006/bibliography" SelectedStyle="/APA.XSL" StyleName="APA"/>
 </file>
 
 <file path=customXml/itemProps1.xml><?xml version="1.0" encoding="utf-8"?>
-<ds:datastoreItem xmlns:ds="http://schemas.openxmlformats.org/officeDocument/2006/customXml" ds:itemID="{EF278816-EC6F-A645-907D-7F25AECB1D4A}">
+<ds:datastoreItem xmlns:ds="http://schemas.openxmlformats.org/officeDocument/2006/customXml" ds:itemID="{FA635BD9-2924-48FA-9C69-F6A95F69A99B}">
   <ds:schemaRefs>
-    <ds:schemaRef ds:uri="http://schemas.openxmlformats.org/officeDocument/2006/bibliography"/>
+    <ds:schemaRef ds:uri="http://schemas.microsoft.com/office/2006/metadata/properties"/>
+    <ds:schemaRef ds:uri="http://schemas.microsoft.com/office/infopath/2007/PartnerControls"/>
+    <ds:schemaRef ds:uri="10d644ba-cf16-43e8-a31a-a6f565d9c224"/>
+    <ds:schemaRef ds:uri="9f27979c-cb1a-4f8c-bada-64f9d3ac4d94"/>
   </ds:schemaRefs>
 </ds:datastoreItem>
 </file>
 
 <file path=customXml/itemProps2.xml><?xml version="1.0" encoding="utf-8"?>
+<ds:datastoreItem xmlns:ds="http://schemas.openxmlformats.org/officeDocument/2006/customXml" ds:itemID="{68F0750B-A861-460B-9805-C5691D482CA6}">
+  <ds:schemaRefs>
+    <ds:schemaRef ds:uri="http://schemas.microsoft.com/sharepoint/v3/contenttype/forms"/>
+  </ds:schemaRefs>
+</ds:datastoreItem>
+</file>
+
+<file path=customXml/itemProps3.xml><?xml version="1.0" encoding="utf-8"?>
 <ds:datastoreItem xmlns:ds="http://schemas.openxmlformats.org/officeDocument/2006/customXml" ds:itemID="{067471EF-364C-4C77-B374-93CE54282B7E}">
   <ds:schemaRefs>
     <ds:schemaRef ds:uri="http://schemas.microsoft.com/office/2006/metadata/contentType"/>
@@ -16979,21 +16567,10 @@
 </ds:datastoreItem>
 </file>
 
-<file path=customXml/itemProps3.xml><?xml version="1.0" encoding="utf-8"?>
-<ds:datastoreItem xmlns:ds="http://schemas.openxmlformats.org/officeDocument/2006/customXml" ds:itemID="{68F0750B-A861-460B-9805-C5691D482CA6}">
+<file path=customXml/itemProps4.xml><?xml version="1.0" encoding="utf-8"?>
+<ds:datastoreItem xmlns:ds="http://schemas.openxmlformats.org/officeDocument/2006/customXml" ds:itemID="{EF278816-EC6F-A645-907D-7F25AECB1D4A}">
   <ds:schemaRefs>
-    <ds:schemaRef ds:uri="http://schemas.microsoft.com/sharepoint/v3/contenttype/forms"/>
-  </ds:schemaRefs>
-</ds:datastoreItem>
-</file>
-
-<file path=customXml/itemProps4.xml><?xml version="1.0" encoding="utf-8"?>
-<ds:datastoreItem xmlns:ds="http://schemas.openxmlformats.org/officeDocument/2006/customXml" ds:itemID="{FA635BD9-2924-48FA-9C69-F6A95F69A99B}">
-  <ds:schemaRefs>
-    <ds:schemaRef ds:uri="http://schemas.microsoft.com/office/2006/metadata/properties"/>
-    <ds:schemaRef ds:uri="http://schemas.microsoft.com/office/infopath/2007/PartnerControls"/>
-    <ds:schemaRef ds:uri="10d644ba-cf16-43e8-a31a-a6f565d9c224"/>
-    <ds:schemaRef ds:uri="9f27979c-cb1a-4f8c-bada-64f9d3ac4d94"/>
+    <ds:schemaRef ds:uri="http://schemas.openxmlformats.org/officeDocument/2006/bibliography"/>
   </ds:schemaRefs>
 </ds:datastoreItem>
 </file>
</xml_diff>

<commit_message>
Methods of access, pseudocode, and completed data dictionary documentation
</commit_message>
<xml_diff>
--- a/.documentation/NEA log.docx
+++ b/.documentation/NEA log.docx
@@ -251,10 +251,7 @@
           </w:tcPr>
           <w:p>
             <w:r>
-              <w:t>Started to make paper plans and notes by going over a b</w:t>
-            </w:r>
-            <w:r>
-              <w:t>asic overview of the brief and what users should be able to do</w:t>
+              <w:t>Started to make paper plans and notes by going over a basic overview of the brief and what users should be able to do</w:t>
             </w:r>
           </w:p>
         </w:tc>
@@ -314,10 +311,7 @@
           </w:tcPr>
           <w:p>
             <w:r>
-              <w:t>Continued paper plans and notes by making a b</w:t>
-            </w:r>
-            <w:r>
-              <w:t>asic UI wireframe for design ethos, basic roadmap</w:t>
+              <w:t>Continued paper plans and notes by making a basic UI wireframe for design ethos, basic roadmap</w:t>
             </w:r>
           </w:p>
         </w:tc>
@@ -377,10 +371,7 @@
           </w:tcPr>
           <w:p>
             <w:r>
-              <w:t xml:space="preserve">Started to setup Jira which helped me understand </w:t>
-            </w:r>
-            <w:r>
-              <w:t>when different elements should be completed</w:t>
+              <w:t>Started to setup Jira which helped me understand when different elements should be completed</w:t>
             </w:r>
           </w:p>
         </w:tc>
@@ -2947,6 +2938,9 @@
             <w:pPr>
               <w:jc w:val="center"/>
             </w:pPr>
+            <w:r>
+              <w:t>04:00</w:t>
+            </w:r>
           </w:p>
         </w:tc>
         <w:tc>
@@ -2979,14 +2973,116 @@
                 <w:b/>
                 <w:bCs/>
               </w:rPr>
-              <w:t>AI Usage</w:t>
-            </w:r>
-            <w:r>
+              <w:t>Description:</w:t>
+            </w:r>
+          </w:p>
+          <w:p>
+            <w:pPr>
+              <w:pStyle w:val="ListParagraph"/>
+              <w:numPr>
+                <w:ilvl w:val="0"/>
+                <w:numId w:val="14"/>
+              </w:numPr>
+            </w:pPr>
+            <w:r>
+              <w:t>Finished docstrings,</w:t>
+            </w:r>
+          </w:p>
+          <w:p>
+            <w:pPr>
+              <w:pStyle w:val="ListParagraph"/>
+              <w:numPr>
+                <w:ilvl w:val="0"/>
+                <w:numId w:val="14"/>
+              </w:numPr>
+            </w:pPr>
+            <w:r>
+              <w:t>Had AI summarize docstrings to paragraphs (see below AI usage event),</w:t>
+            </w:r>
+          </w:p>
+          <w:p>
+            <w:pPr>
               <w:rPr>
                 <w:b/>
                 <w:bCs/>
               </w:rPr>
-              <w:t xml:space="preserve"> Event #1</w:t>
+            </w:pPr>
+          </w:p>
+          <w:p>
+            <w:pPr>
+              <w:rPr>
+                <w:b/>
+                <w:bCs/>
+              </w:rPr>
+            </w:pPr>
+            <w:r>
+              <w:rPr>
+                <w:b/>
+                <w:bCs/>
+              </w:rPr>
+              <w:t>AI Usage Event #1</w:t>
+            </w:r>
+            <w:r>
+              <w:rPr>
+                <w:b/>
+                <w:bCs/>
+              </w:rPr>
+              <w:t xml:space="preserve"> – </w:t>
+            </w:r>
+            <w:r>
+              <w:rPr>
+                <w:b/>
+                <w:bCs/>
+                <w:color w:val="C00000"/>
+                <w:highlight w:val="darkRed"/>
+              </w:rPr>
+              <w:t>.</w:t>
+            </w:r>
+            <w:r>
+              <w:rPr>
+                <w:b/>
+                <w:bCs/>
+                <w:color w:val="C00000"/>
+                <w:highlight w:val="darkRed"/>
+              </w:rPr>
+              <w:t xml:space="preserve"> </w:t>
+            </w:r>
+            <w:r>
+              <w:rPr>
+                <w:b/>
+                <w:bCs/>
+                <w:color w:val="FFFFFF" w:themeColor="background1"/>
+                <w:highlight w:val="darkRed"/>
+                <w:shd w:val="clear" w:color="auto" w:fill="C00000"/>
+              </w:rPr>
+              <w:t>A</w:t>
+            </w:r>
+            <w:r>
+              <w:rPr>
+                <w:b/>
+                <w:bCs/>
+                <w:highlight w:val="darkRed"/>
+                <w:shd w:val="clear" w:color="auto" w:fill="C00000"/>
+              </w:rPr>
+              <w:t>LL RESULTS FROM THIS WERE LATER REMOVED FROM DOCUMENTATION</w:t>
+            </w:r>
+            <w:r>
+              <w:rPr>
+                <w:b/>
+                <w:bCs/>
+                <w:color w:val="C00000"/>
+                <w:highlight w:val="darkRed"/>
+              </w:rPr>
+              <w:t xml:space="preserve"> </w:t>
+            </w:r>
+            <w:r>
+              <w:rPr>
+                <w:b/>
+                <w:bCs/>
+                <w:color w:val="C00000"/>
+                <w:highlight w:val="darkRed"/>
+              </w:rPr>
+              <w:t>.</w:t>
             </w:r>
             <w:r>
               <w:rPr>
@@ -2998,7 +3094,13 @@
           </w:p>
           <w:p>
             <w:r>
-              <w:t>This is the first time I used AI in my project.</w:t>
+              <w:t xml:space="preserve">This is the first time I </w:t>
+            </w:r>
+            <w:r>
+              <w:t xml:space="preserve">have </w:t>
+            </w:r>
+            <w:r>
+              <w:t>used AI in my project.</w:t>
             </w:r>
           </w:p>
           <w:p/>
@@ -3082,14 +3184,14 @@
               <w:rPr>
                 <w:lang w:val="en-GB"/>
               </w:rPr>
-              <w:t xml:space="preserve">Please write a brief paragraph for each function detailing the same information as included in the docstring, name of the function, arguments of the function, and return type prediction of the function. Your document should be organised with a level 2 heading for each module and a level 4 heading for each function. You should skip level 3 headers. Each level 4 heading should be preceded by a line break. Do not have the heading just as the name of the function; this can be included too but tidy it up for the heading by getting rid of underscores and fixing capitalisation. All spelling should be done by the UK standard (i.e.: no dropping the 'u' in colour and "-ise" instead of "-ize" suffixes). Try to keep your language understandable; I have been blunt with my docstrings trying to get straight to the point but you may reword them to make them more understandable. You may use bullet points and numbered lists if deemed appropriate/necessary (don't use them if not needed or helpful to overall readability). For writing style and intonation, feel free to look at my other documents in the .documentation </w:t>
+              <w:t xml:space="preserve">Please write a brief paragraph for each function detailing the same information as included in the docstring, name of the function, arguments of the function, and return type prediction of the function. Your document should be organised with a level 2 heading for each module and a level 4 heading for each function. You should skip level 3 headers. Each level 4 heading should be preceded by a line break. Do not have the heading just as the name of the function; this can be included too but tidy it up for the heading by getting rid of underscores and fixing capitalisation. All spelling should be done by the UK standard (i.e.: no dropping the 'u' in </w:t>
             </w:r>
             <w:r>
               <w:rPr>
                 <w:lang w:val="en-GB"/>
               </w:rPr>
               <w:lastRenderedPageBreak/>
-              <w:t>folder for inspiration for my personal writing style. For example, I indent after every new paragraph except the first in a block of text. I also start the body of each bullet point/numbered list item with a capital letter; I end short bullet point/numbered list item with a comma and longer ones with a semicolon (even if they are at the end of the list). You should order files within modules in the order in which they appear: alphabetically by file name within modules then in given order of files. I have already tried to group them somewhat.</w:t>
+              <w:t>colour and "-ise" instead of "-ize" suffixes). Try to keep your language understandable; I have been blunt with my docstrings trying to get straight to the point but you may reword them to make them more understandable. You may use bullet points and numbered lists if deemed appropriate/necessary (don't use them if not needed or helpful to overall readability). For writing style and intonation, feel free to look at my other documents in the .documentation folder for inspiration for my personal writing style. For example, I indent after every new paragraph except the first in a block of text. I also start the body of each bullet point/numbered list item with a capital letter; I end short bullet point/numbered list item with a comma and longer ones with a semicolon (even if they are at the end of the list). You should order files within modules in the order in which they appear: alphabetically by file name within modules then in given order of files. I have already tried to group them somewhat.</w:t>
             </w:r>
           </w:p>
           <w:p>
@@ -3162,6 +3264,19 @@
               <w:t xml:space="preserve"> Input</w:t>
             </w:r>
             <w:r>
+              <w:t xml:space="preserve"> (The docstring </w:t>
+            </w:r>
+            <w:r>
+              <w:rPr>
+                <w:b/>
+                <w:bCs/>
+              </w:rPr>
+              <w:t>that I wrote</w:t>
+            </w:r>
+            <w:r>
+              <w:t>, provided for comparison)</w:t>
+            </w:r>
+            <w:r>
               <w:t>:</w:t>
             </w:r>
           </w:p>
@@ -3247,6 +3362,7 @@
               <w:rPr>
                 <w:lang w:val="en-GB"/>
               </w:rPr>
+              <w:lastRenderedPageBreak/>
               <w:t>            "flightNo": &lt;flight_number&gt;: str,</w:t>
             </w:r>
           </w:p>
@@ -3312,7 +3428,6 @@
               <w:rPr>
                 <w:lang w:val="en-GB"/>
               </w:rPr>
-              <w:lastRenderedPageBreak/>
               <w:t>            "departureTime": &lt;departure_datetime&gt;: datetime,</w:t>
             </w:r>
           </w:p>
@@ -3566,6 +3681,113 @@
             <w:pPr>
               <w:ind w:left="360" w:hanging="360"/>
             </w:pPr>
+          </w:p>
+        </w:tc>
+      </w:tr>
+      <w:tr>
+        <w:trPr>
+          <w:cantSplit/>
+          <w:trHeight w:val="1419"/>
+        </w:trPr>
+        <w:tc>
+          <w:tcPr>
+            <w:tcW w:w="683" w:type="dxa"/>
+            <w:textDirection w:val="tbRl"/>
+            <w:vAlign w:val="center"/>
+          </w:tcPr>
+          <w:p>
+            <w:pPr>
+              <w:ind w:left="113" w:right="113"/>
+              <w:jc w:val="center"/>
+            </w:pPr>
+            <w:r>
+              <w:lastRenderedPageBreak/>
+              <w:t>16.10.2026</w:t>
+            </w:r>
+          </w:p>
+        </w:tc>
+        <w:tc>
+          <w:tcPr>
+            <w:tcW w:w="929" w:type="dxa"/>
+            <w:vAlign w:val="center"/>
+          </w:tcPr>
+          <w:p>
+            <w:pPr>
+              <w:jc w:val="center"/>
+            </w:pPr>
+            <w:r>
+              <w:t>04:00</w:t>
+            </w:r>
+          </w:p>
+        </w:tc>
+        <w:tc>
+          <w:tcPr>
+            <w:tcW w:w="1644" w:type="dxa"/>
+            <w:vAlign w:val="center"/>
+          </w:tcPr>
+          <w:p>
+            <w:pPr>
+              <w:jc w:val="center"/>
+            </w:pPr>
+            <w:r>
+              <w:t>Design</w:t>
+            </w:r>
+          </w:p>
+        </w:tc>
+        <w:tc>
+          <w:tcPr>
+            <w:tcW w:w="8930" w:type="dxa"/>
+          </w:tcPr>
+          <w:p>
+            <w:pPr>
+              <w:pStyle w:val="ListParagraph"/>
+              <w:numPr>
+                <w:ilvl w:val="0"/>
+                <w:numId w:val="16"/>
+              </w:numPr>
+            </w:pPr>
+            <w:r>
+              <w:t>Removed all</w:t>
+            </w:r>
+            <w:r>
+              <w:t xml:space="preserve"> results from AI Usage Event #1,</w:t>
+            </w:r>
+          </w:p>
+          <w:p>
+            <w:pPr>
+              <w:pStyle w:val="ListParagraph"/>
+              <w:numPr>
+                <w:ilvl w:val="0"/>
+                <w:numId w:val="16"/>
+              </w:numPr>
+            </w:pPr>
+            <w:r>
+              <w:t>Completed algorithms section,</w:t>
+            </w:r>
+          </w:p>
+          <w:p>
+            <w:pPr>
+              <w:pStyle w:val="ListParagraph"/>
+              <w:numPr>
+                <w:ilvl w:val="0"/>
+                <w:numId w:val="16"/>
+              </w:numPr>
+            </w:pPr>
+            <w:r>
+              <w:t>Completed description column of data dictionary,</w:t>
+            </w:r>
+          </w:p>
+          <w:p>
+            <w:pPr>
+              <w:pStyle w:val="ListParagraph"/>
+              <w:numPr>
+                <w:ilvl w:val="0"/>
+                <w:numId w:val="16"/>
+              </w:numPr>
+            </w:pPr>
+            <w:r>
+              <w:t>Completed methods of access documentation,</w:t>
+            </w:r>
           </w:p>
         </w:tc>
       </w:tr>
@@ -3575,7 +3797,6 @@
         <w:pStyle w:val="Heading2"/>
       </w:pPr>
       <w:r>
-        <w:lastRenderedPageBreak/>
         <w:t>Example Entry</w:t>
       </w:r>
     </w:p>
@@ -3673,7 +3894,6 @@
           </w:tcPr>
           <w:p>
             <w:r>
-              <w:lastRenderedPageBreak/>
               <w:t>12/10/25</w:t>
             </w:r>
           </w:p>
@@ -4156,6 +4376,232 @@
     </w:lvl>
   </w:abstractNum>
   <w:abstractNum w:abstractNumId="11" w15:restartNumberingAfterBreak="0">
+    <w:nsid w:val="52D73934"/>
+    <w:multiLevelType w:val="hybridMultilevel"/>
+    <w:tmpl w:val="8D5463C4"/>
+    <w:lvl w:ilvl="0" w:tplc="197C152C">
+      <w:start w:val="16"/>
+      <w:numFmt w:val="bullet"/>
+      <w:lvlText w:val="-"/>
+      <w:lvlJc w:val="left"/>
+      <w:pPr>
+        <w:ind w:left="720" w:hanging="360"/>
+      </w:pPr>
+      <w:rPr>
+        <w:rFonts w:ascii="Cambria" w:eastAsiaTheme="minorEastAsia" w:hAnsi="Cambria" w:cstheme="minorBidi" w:hint="default"/>
+      </w:rPr>
+    </w:lvl>
+    <w:lvl w:ilvl="1" w:tplc="08090003" w:tentative="1">
+      <w:start w:val="1"/>
+      <w:numFmt w:val="bullet"/>
+      <w:lvlText w:val="o"/>
+      <w:lvlJc w:val="left"/>
+      <w:pPr>
+        <w:ind w:left="1440" w:hanging="360"/>
+      </w:pPr>
+      <w:rPr>
+        <w:rFonts w:ascii="Courier New" w:hAnsi="Courier New" w:cs="Courier New" w:hint="default"/>
+      </w:rPr>
+    </w:lvl>
+    <w:lvl w:ilvl="2" w:tplc="08090005" w:tentative="1">
+      <w:start w:val="1"/>
+      <w:numFmt w:val="bullet"/>
+      <w:lvlText w:val=""/>
+      <w:lvlJc w:val="left"/>
+      <w:pPr>
+        <w:ind w:left="2160" w:hanging="360"/>
+      </w:pPr>
+      <w:rPr>
+        <w:rFonts w:ascii="Wingdings" w:hAnsi="Wingdings" w:hint="default"/>
+      </w:rPr>
+    </w:lvl>
+    <w:lvl w:ilvl="3" w:tplc="08090001" w:tentative="1">
+      <w:start w:val="1"/>
+      <w:numFmt w:val="bullet"/>
+      <w:lvlText w:val=""/>
+      <w:lvlJc w:val="left"/>
+      <w:pPr>
+        <w:ind w:left="2880" w:hanging="360"/>
+      </w:pPr>
+      <w:rPr>
+        <w:rFonts w:ascii="Symbol" w:hAnsi="Symbol" w:hint="default"/>
+      </w:rPr>
+    </w:lvl>
+    <w:lvl w:ilvl="4" w:tplc="08090003" w:tentative="1">
+      <w:start w:val="1"/>
+      <w:numFmt w:val="bullet"/>
+      <w:lvlText w:val="o"/>
+      <w:lvlJc w:val="left"/>
+      <w:pPr>
+        <w:ind w:left="3600" w:hanging="360"/>
+      </w:pPr>
+      <w:rPr>
+        <w:rFonts w:ascii="Courier New" w:hAnsi="Courier New" w:cs="Courier New" w:hint="default"/>
+      </w:rPr>
+    </w:lvl>
+    <w:lvl w:ilvl="5" w:tplc="08090005" w:tentative="1">
+      <w:start w:val="1"/>
+      <w:numFmt w:val="bullet"/>
+      <w:lvlText w:val=""/>
+      <w:lvlJc w:val="left"/>
+      <w:pPr>
+        <w:ind w:left="4320" w:hanging="360"/>
+      </w:pPr>
+      <w:rPr>
+        <w:rFonts w:ascii="Wingdings" w:hAnsi="Wingdings" w:hint="default"/>
+      </w:rPr>
+    </w:lvl>
+    <w:lvl w:ilvl="6" w:tplc="08090001" w:tentative="1">
+      <w:start w:val="1"/>
+      <w:numFmt w:val="bullet"/>
+      <w:lvlText w:val=""/>
+      <w:lvlJc w:val="left"/>
+      <w:pPr>
+        <w:ind w:left="5040" w:hanging="360"/>
+      </w:pPr>
+      <w:rPr>
+        <w:rFonts w:ascii="Symbol" w:hAnsi="Symbol" w:hint="default"/>
+      </w:rPr>
+    </w:lvl>
+    <w:lvl w:ilvl="7" w:tplc="08090003" w:tentative="1">
+      <w:start w:val="1"/>
+      <w:numFmt w:val="bullet"/>
+      <w:lvlText w:val="o"/>
+      <w:lvlJc w:val="left"/>
+      <w:pPr>
+        <w:ind w:left="5760" w:hanging="360"/>
+      </w:pPr>
+      <w:rPr>
+        <w:rFonts w:ascii="Courier New" w:hAnsi="Courier New" w:cs="Courier New" w:hint="default"/>
+      </w:rPr>
+    </w:lvl>
+    <w:lvl w:ilvl="8" w:tplc="08090005" w:tentative="1">
+      <w:start w:val="1"/>
+      <w:numFmt w:val="bullet"/>
+      <w:lvlText w:val=""/>
+      <w:lvlJc w:val="left"/>
+      <w:pPr>
+        <w:ind w:left="6480" w:hanging="360"/>
+      </w:pPr>
+      <w:rPr>
+        <w:rFonts w:ascii="Wingdings" w:hAnsi="Wingdings" w:hint="default"/>
+      </w:rPr>
+    </w:lvl>
+  </w:abstractNum>
+  <w:abstractNum w:abstractNumId="12" w15:restartNumberingAfterBreak="0">
+    <w:nsid w:val="59554D46"/>
+    <w:multiLevelType w:val="hybridMultilevel"/>
+    <w:tmpl w:val="350EAC14"/>
+    <w:lvl w:ilvl="0" w:tplc="08090001">
+      <w:start w:val="1"/>
+      <w:numFmt w:val="bullet"/>
+      <w:lvlText w:val=""/>
+      <w:lvlJc w:val="left"/>
+      <w:pPr>
+        <w:ind w:left="720" w:hanging="360"/>
+      </w:pPr>
+      <w:rPr>
+        <w:rFonts w:ascii="Symbol" w:hAnsi="Symbol" w:hint="default"/>
+      </w:rPr>
+    </w:lvl>
+    <w:lvl w:ilvl="1" w:tplc="08090003" w:tentative="1">
+      <w:start w:val="1"/>
+      <w:numFmt w:val="bullet"/>
+      <w:lvlText w:val="o"/>
+      <w:lvlJc w:val="left"/>
+      <w:pPr>
+        <w:ind w:left="1440" w:hanging="360"/>
+      </w:pPr>
+      <w:rPr>
+        <w:rFonts w:ascii="Courier New" w:hAnsi="Courier New" w:cs="Courier New" w:hint="default"/>
+      </w:rPr>
+    </w:lvl>
+    <w:lvl w:ilvl="2" w:tplc="08090005" w:tentative="1">
+      <w:start w:val="1"/>
+      <w:numFmt w:val="bullet"/>
+      <w:lvlText w:val=""/>
+      <w:lvlJc w:val="left"/>
+      <w:pPr>
+        <w:ind w:left="2160" w:hanging="360"/>
+      </w:pPr>
+      <w:rPr>
+        <w:rFonts w:ascii="Wingdings" w:hAnsi="Wingdings" w:hint="default"/>
+      </w:rPr>
+    </w:lvl>
+    <w:lvl w:ilvl="3" w:tplc="08090001" w:tentative="1">
+      <w:start w:val="1"/>
+      <w:numFmt w:val="bullet"/>
+      <w:lvlText w:val=""/>
+      <w:lvlJc w:val="left"/>
+      <w:pPr>
+        <w:ind w:left="2880" w:hanging="360"/>
+      </w:pPr>
+      <w:rPr>
+        <w:rFonts w:ascii="Symbol" w:hAnsi="Symbol" w:hint="default"/>
+      </w:rPr>
+    </w:lvl>
+    <w:lvl w:ilvl="4" w:tplc="08090003" w:tentative="1">
+      <w:start w:val="1"/>
+      <w:numFmt w:val="bullet"/>
+      <w:lvlText w:val="o"/>
+      <w:lvlJc w:val="left"/>
+      <w:pPr>
+        <w:ind w:left="3600" w:hanging="360"/>
+      </w:pPr>
+      <w:rPr>
+        <w:rFonts w:ascii="Courier New" w:hAnsi="Courier New" w:cs="Courier New" w:hint="default"/>
+      </w:rPr>
+    </w:lvl>
+    <w:lvl w:ilvl="5" w:tplc="08090005" w:tentative="1">
+      <w:start w:val="1"/>
+      <w:numFmt w:val="bullet"/>
+      <w:lvlText w:val=""/>
+      <w:lvlJc w:val="left"/>
+      <w:pPr>
+        <w:ind w:left="4320" w:hanging="360"/>
+      </w:pPr>
+      <w:rPr>
+        <w:rFonts w:ascii="Wingdings" w:hAnsi="Wingdings" w:hint="default"/>
+      </w:rPr>
+    </w:lvl>
+    <w:lvl w:ilvl="6" w:tplc="08090001" w:tentative="1">
+      <w:start w:val="1"/>
+      <w:numFmt w:val="bullet"/>
+      <w:lvlText w:val=""/>
+      <w:lvlJc w:val="left"/>
+      <w:pPr>
+        <w:ind w:left="5040" w:hanging="360"/>
+      </w:pPr>
+      <w:rPr>
+        <w:rFonts w:ascii="Symbol" w:hAnsi="Symbol" w:hint="default"/>
+      </w:rPr>
+    </w:lvl>
+    <w:lvl w:ilvl="7" w:tplc="08090003" w:tentative="1">
+      <w:start w:val="1"/>
+      <w:numFmt w:val="bullet"/>
+      <w:lvlText w:val="o"/>
+      <w:lvlJc w:val="left"/>
+      <w:pPr>
+        <w:ind w:left="5760" w:hanging="360"/>
+      </w:pPr>
+      <w:rPr>
+        <w:rFonts w:ascii="Courier New" w:hAnsi="Courier New" w:cs="Courier New" w:hint="default"/>
+      </w:rPr>
+    </w:lvl>
+    <w:lvl w:ilvl="8" w:tplc="08090005" w:tentative="1">
+      <w:start w:val="1"/>
+      <w:numFmt w:val="bullet"/>
+      <w:lvlText w:val=""/>
+      <w:lvlJc w:val="left"/>
+      <w:pPr>
+        <w:ind w:left="6480" w:hanging="360"/>
+      </w:pPr>
+      <w:rPr>
+        <w:rFonts w:ascii="Wingdings" w:hAnsi="Wingdings" w:hint="default"/>
+      </w:rPr>
+    </w:lvl>
+  </w:abstractNum>
+  <w:abstractNum w:abstractNumId="13" w15:restartNumberingAfterBreak="0">
     <w:nsid w:val="634B74DB"/>
     <w:multiLevelType w:val="hybridMultilevel"/>
     <w:tmpl w:val="70A61396"/>
@@ -4268,10 +4714,10 @@
       </w:rPr>
     </w:lvl>
   </w:abstractNum>
-  <w:abstractNum w:abstractNumId="12" w15:restartNumberingAfterBreak="0">
+  <w:abstractNum w:abstractNumId="14" w15:restartNumberingAfterBreak="0">
     <w:nsid w:val="6C2525FA"/>
     <w:multiLevelType w:val="hybridMultilevel"/>
-    <w:tmpl w:val="57E8DFC4"/>
+    <w:tmpl w:val="5F74630E"/>
     <w:lvl w:ilvl="0" w:tplc="08090001">
       <w:start w:val="1"/>
       <w:numFmt w:val="bullet"/>
@@ -4381,7 +4827,7 @@
       </w:rPr>
     </w:lvl>
   </w:abstractNum>
-  <w:abstractNum w:abstractNumId="13" w15:restartNumberingAfterBreak="0">
+  <w:abstractNum w:abstractNumId="15" w15:restartNumberingAfterBreak="0">
     <w:nsid w:val="73A55EE6"/>
     <w:multiLevelType w:val="hybridMultilevel"/>
     <w:tmpl w:val="F50A4A6A"/>
@@ -4522,18 +4968,24 @@
     <w:abstractNumId w:val="0"/>
   </w:num>
   <w:num w:numId="10" w16cid:durableId="614873554">
-    <w:abstractNumId w:val="13"/>
+    <w:abstractNumId w:val="15"/>
   </w:num>
   <w:num w:numId="11" w16cid:durableId="770205853">
     <w:abstractNumId w:val="9"/>
   </w:num>
   <w:num w:numId="12" w16cid:durableId="457836963">
-    <w:abstractNumId w:val="11"/>
+    <w:abstractNumId w:val="13"/>
   </w:num>
   <w:num w:numId="13" w16cid:durableId="1128819302">
     <w:abstractNumId w:val="10"/>
   </w:num>
   <w:num w:numId="14" w16cid:durableId="991328476">
+    <w:abstractNumId w:val="14"/>
+  </w:num>
+  <w:num w:numId="15" w16cid:durableId="1924605534">
+    <w:abstractNumId w:val="11"/>
+  </w:num>
+  <w:num w:numId="16" w16cid:durableId="1225291042">
     <w:abstractNumId w:val="12"/>
   </w:num>
 </w:numbering>
@@ -5142,6 +5594,7 @@
   <w:style w:type="character" w:default="1" w:styleId="DefaultParagraphFont">
     <w:name w:val="Default Paragraph Font"/>
     <w:uiPriority w:val="1"/>
+    <w:semiHidden/>
     <w:unhideWhenUsed/>
   </w:style>
   <w:style w:type="table" w:default="1" w:styleId="TableNormal">
@@ -16245,6 +16698,15 @@
 </file>
 
 <file path=customXml/item1.xml><?xml version="1.0" encoding="utf-8"?>
+<?mso-contentType ?>
+<FormTemplates xmlns="http://schemas.microsoft.com/sharepoint/v3/contenttype/forms">
+  <Display>DocumentLibraryForm</Display>
+  <Edit>DocumentLibraryForm</Edit>
+  <New>DocumentLibraryForm</New>
+</FormTemplates>
+</file>
+
+<file path=customXml/item2.xml><?xml version="1.0" encoding="utf-8"?>
 <p:properties xmlns:p="http://schemas.microsoft.com/office/2006/metadata/properties" xmlns:xsi="http://www.w3.org/2001/XMLSchema-instance" xmlns:pc="http://schemas.microsoft.com/office/infopath/2007/PartnerControls">
   <documentManagement>
     <TaxCatchAll xmlns="10d644ba-cf16-43e8-a31a-a6f565d9c224" xsi:nil="true"/>
@@ -16255,16 +16717,11 @@
 </p:properties>
 </file>
 
-<file path=customXml/item2.xml><?xml version="1.0" encoding="utf-8"?>
-<?mso-contentType ?>
-<FormTemplates xmlns="http://schemas.microsoft.com/sharepoint/v3/contenttype/forms">
-  <Display>DocumentLibraryForm</Display>
-  <Edit>DocumentLibraryForm</Edit>
-  <New>DocumentLibraryForm</New>
-</FormTemplates>
+<file path=customXml/item3.xml><?xml version="1.0" encoding="utf-8"?>
+<b:Sources xmlns:b="http://schemas.openxmlformats.org/officeDocument/2006/bibliography" xmlns="http://schemas.openxmlformats.org/officeDocument/2006/bibliography" SelectedStyle="/APA.XSL" StyleName="APA"/>
 </file>
 
-<file path=customXml/item3.xml><?xml version="1.0" encoding="utf-8"?>
+<file path=customXml/item4.xml><?xml version="1.0" encoding="utf-8"?>
 <ct:contentTypeSchema xmlns:ct="http://schemas.microsoft.com/office/2006/metadata/contentType" xmlns:ma="http://schemas.microsoft.com/office/2006/metadata/properties/metaAttributes" ct:_="" ma:_="" ma:contentTypeName="Document" ma:contentTypeID="0x010100B31D159F86750749BAD869CB65D39E6C" ma:contentTypeVersion="19" ma:contentTypeDescription="Create a new document." ma:contentTypeScope="" ma:versionID="0ea2422bc5c6366a6faeb9099b70d2d2">
   <xsd:schema xmlns:xsd="http://www.w3.org/2001/XMLSchema" xmlns:xs="http://www.w3.org/2001/XMLSchema" xmlns:p="http://schemas.microsoft.com/office/2006/metadata/properties" xmlns:ns2="9f27979c-cb1a-4f8c-bada-64f9d3ac4d94" xmlns:ns3="10d644ba-cf16-43e8-a31a-a6f565d9c224" targetNamespace="http://schemas.microsoft.com/office/2006/metadata/properties" ma:root="true" ma:fieldsID="3a98ec8fef0d077c94de2b1dd278fe35" ns2:_="" ns3:_="">
     <xsd:import namespace="9f27979c-cb1a-4f8c-bada-64f9d3ac4d94"/>
@@ -16525,11 +16982,15 @@
 </ct:contentTypeSchema>
 </file>
 
-<file path=customXml/item4.xml><?xml version="1.0" encoding="utf-8"?>
-<b:Sources xmlns:b="http://schemas.openxmlformats.org/officeDocument/2006/bibliography" xmlns="http://schemas.openxmlformats.org/officeDocument/2006/bibliography" SelectedStyle="/APA.XSL" StyleName="APA"/>
+<file path=customXml/itemProps1.xml><?xml version="1.0" encoding="utf-8"?>
+<ds:datastoreItem xmlns:ds="http://schemas.openxmlformats.org/officeDocument/2006/customXml" ds:itemID="{68F0750B-A861-460B-9805-C5691D482CA6}">
+  <ds:schemaRefs>
+    <ds:schemaRef ds:uri="http://schemas.microsoft.com/sharepoint/v3/contenttype/forms"/>
+  </ds:schemaRefs>
+</ds:datastoreItem>
 </file>
 
-<file path=customXml/itemProps1.xml><?xml version="1.0" encoding="utf-8"?>
+<file path=customXml/itemProps2.xml><?xml version="1.0" encoding="utf-8"?>
 <ds:datastoreItem xmlns:ds="http://schemas.openxmlformats.org/officeDocument/2006/customXml" ds:itemID="{FA635BD9-2924-48FA-9C69-F6A95F69A99B}">
   <ds:schemaRefs>
     <ds:schemaRef ds:uri="http://schemas.microsoft.com/office/2006/metadata/properties"/>
@@ -16540,15 +17001,15 @@
 </ds:datastoreItem>
 </file>
 
-<file path=customXml/itemProps2.xml><?xml version="1.0" encoding="utf-8"?>
-<ds:datastoreItem xmlns:ds="http://schemas.openxmlformats.org/officeDocument/2006/customXml" ds:itemID="{68F0750B-A861-460B-9805-C5691D482CA6}">
+<file path=customXml/itemProps3.xml><?xml version="1.0" encoding="utf-8"?>
+<ds:datastoreItem xmlns:ds="http://schemas.openxmlformats.org/officeDocument/2006/customXml" ds:itemID="{EF278816-EC6F-A645-907D-7F25AECB1D4A}">
   <ds:schemaRefs>
-    <ds:schemaRef ds:uri="http://schemas.microsoft.com/sharepoint/v3/contenttype/forms"/>
+    <ds:schemaRef ds:uri="http://schemas.openxmlformats.org/officeDocument/2006/bibliography"/>
   </ds:schemaRefs>
 </ds:datastoreItem>
 </file>
 
-<file path=customXml/itemProps3.xml><?xml version="1.0" encoding="utf-8"?>
+<file path=customXml/itemProps4.xml><?xml version="1.0" encoding="utf-8"?>
 <ds:datastoreItem xmlns:ds="http://schemas.openxmlformats.org/officeDocument/2006/customXml" ds:itemID="{067471EF-364C-4C77-B374-93CE54282B7E}">
   <ds:schemaRefs>
     <ds:schemaRef ds:uri="http://schemas.microsoft.com/office/2006/metadata/contentType"/>
@@ -16565,12 +17026,4 @@
     <ds:schemaRef ds:uri="http://schemas.microsoft.com/internal/obd"/>
   </ds:schemaRefs>
 </ds:datastoreItem>
-</file>
-
-<file path=customXml/itemProps4.xml><?xml version="1.0" encoding="utf-8"?>
-<ds:datastoreItem xmlns:ds="http://schemas.openxmlformats.org/officeDocument/2006/customXml" ds:itemID="{EF278816-EC6F-A645-907D-7F25AECB1D4A}">
-  <ds:schemaRefs>
-    <ds:schemaRef ds:uri="http://schemas.openxmlformats.org/officeDocument/2006/bibliography"/>
-  </ds:schemaRefs>
-</ds:datastoreItem>
 </file>
</xml_diff>

<commit_message>
Added airports to database
</commit_message>
<xml_diff>
--- a/.documentation/NEA log.docx
+++ b/.documentation/NEA log.docx
@@ -3073,16 +3073,7 @@
                 <w:color w:val="C00000"/>
                 <w:highlight w:val="darkRed"/>
               </w:rPr>
-              <w:t xml:space="preserve"> </w:t>
-            </w:r>
-            <w:r>
-              <w:rPr>
-                <w:b/>
-                <w:bCs/>
-                <w:color w:val="C00000"/>
-                <w:highlight w:val="darkRed"/>
-              </w:rPr>
-              <w:t>.</w:t>
+              <w:t xml:space="preserve"> .</w:t>
             </w:r>
             <w:r>
               <w:rPr>
@@ -3791,12 +3782,3070 @@
           </w:p>
         </w:tc>
       </w:tr>
+      <w:tr>
+        <w:trPr>
+          <w:cantSplit/>
+          <w:trHeight w:val="1419"/>
+        </w:trPr>
+        <w:tc>
+          <w:tcPr>
+            <w:tcW w:w="683" w:type="dxa"/>
+            <w:textDirection w:val="tbRl"/>
+            <w:vAlign w:val="center"/>
+          </w:tcPr>
+          <w:p>
+            <w:pPr>
+              <w:ind w:left="113" w:right="113"/>
+              <w:jc w:val="center"/>
+            </w:pPr>
+            <w:r>
+              <w:t>17.10.2026</w:t>
+            </w:r>
+          </w:p>
+        </w:tc>
+        <w:tc>
+          <w:tcPr>
+            <w:tcW w:w="929" w:type="dxa"/>
+            <w:vAlign w:val="center"/>
+          </w:tcPr>
+          <w:p>
+            <w:pPr>
+              <w:jc w:val="center"/>
+            </w:pPr>
+            <w:r>
+              <w:t>01:00</w:t>
+            </w:r>
+          </w:p>
+        </w:tc>
+        <w:tc>
+          <w:tcPr>
+            <w:tcW w:w="1644" w:type="dxa"/>
+            <w:vAlign w:val="center"/>
+          </w:tcPr>
+          <w:p>
+            <w:pPr>
+              <w:jc w:val="center"/>
+            </w:pPr>
+            <w:r>
+              <w:t>Design</w:t>
+            </w:r>
+          </w:p>
+        </w:tc>
+        <w:tc>
+          <w:tcPr>
+            <w:tcW w:w="8930" w:type="dxa"/>
+          </w:tcPr>
+          <w:p>
+            <w:pPr>
+              <w:pStyle w:val="ListParagraph"/>
+              <w:numPr>
+                <w:ilvl w:val="0"/>
+                <w:numId w:val="16"/>
+              </w:numPr>
+            </w:pPr>
+            <w:r>
+              <w:t>Started UI explanation write up,</w:t>
+            </w:r>
+          </w:p>
+        </w:tc>
+      </w:tr>
+      <w:tr>
+        <w:trPr>
+          <w:cantSplit/>
+          <w:trHeight w:val="1419"/>
+        </w:trPr>
+        <w:tc>
+          <w:tcPr>
+            <w:tcW w:w="683" w:type="dxa"/>
+            <w:textDirection w:val="tbRl"/>
+            <w:vAlign w:val="center"/>
+          </w:tcPr>
+          <w:p>
+            <w:pPr>
+              <w:ind w:left="113" w:right="113"/>
+              <w:jc w:val="center"/>
+            </w:pPr>
+            <w:r>
+              <w:t>19.10.2926</w:t>
+            </w:r>
+          </w:p>
+        </w:tc>
+        <w:tc>
+          <w:tcPr>
+            <w:tcW w:w="929" w:type="dxa"/>
+            <w:vAlign w:val="center"/>
+          </w:tcPr>
+          <w:p>
+            <w:pPr>
+              <w:jc w:val="center"/>
+            </w:pPr>
+            <w:r>
+              <w:t>01:00</w:t>
+            </w:r>
+          </w:p>
+        </w:tc>
+        <w:tc>
+          <w:tcPr>
+            <w:tcW w:w="1644" w:type="dxa"/>
+            <w:vAlign w:val="center"/>
+          </w:tcPr>
+          <w:p>
+            <w:pPr>
+              <w:jc w:val="center"/>
+            </w:pPr>
+            <w:r>
+              <w:t>Design</w:t>
+            </w:r>
+          </w:p>
+        </w:tc>
+        <w:tc>
+          <w:tcPr>
+            <w:tcW w:w="8930" w:type="dxa"/>
+          </w:tcPr>
+          <w:p>
+            <w:pPr>
+              <w:pStyle w:val="ListParagraph"/>
+              <w:numPr>
+                <w:ilvl w:val="0"/>
+                <w:numId w:val="16"/>
+              </w:numPr>
+            </w:pPr>
+            <w:r>
+              <w:t>Finished UI explanations,</w:t>
+            </w:r>
+          </w:p>
+        </w:tc>
+      </w:tr>
+      <w:tr>
+        <w:trPr>
+          <w:cantSplit/>
+          <w:trHeight w:val="1419"/>
+        </w:trPr>
+        <w:tc>
+          <w:tcPr>
+            <w:tcW w:w="683" w:type="dxa"/>
+            <w:textDirection w:val="tbRl"/>
+            <w:vAlign w:val="center"/>
+          </w:tcPr>
+          <w:p>
+            <w:pPr>
+              <w:ind w:left="113" w:right="113"/>
+              <w:jc w:val="center"/>
+            </w:pPr>
+            <w:r>
+              <w:lastRenderedPageBreak/>
+              <w:t>20.10.2026</w:t>
+            </w:r>
+          </w:p>
+        </w:tc>
+        <w:tc>
+          <w:tcPr>
+            <w:tcW w:w="929" w:type="dxa"/>
+            <w:vAlign w:val="center"/>
+          </w:tcPr>
+          <w:p>
+            <w:pPr>
+              <w:jc w:val="center"/>
+            </w:pPr>
+          </w:p>
+        </w:tc>
+        <w:tc>
+          <w:tcPr>
+            <w:tcW w:w="1644" w:type="dxa"/>
+            <w:vAlign w:val="center"/>
+          </w:tcPr>
+          <w:p>
+            <w:pPr>
+              <w:jc w:val="center"/>
+            </w:pPr>
+          </w:p>
+        </w:tc>
+        <w:tc>
+          <w:tcPr>
+            <w:tcW w:w="8930" w:type="dxa"/>
+          </w:tcPr>
+          <w:p>
+            <w:pPr>
+              <w:ind w:left="360" w:hanging="360"/>
+              <w:rPr>
+                <w:b/>
+                <w:bCs/>
+              </w:rPr>
+            </w:pPr>
+            <w:r>
+              <w:rPr>
+                <w:b/>
+                <w:bCs/>
+              </w:rPr>
+              <w:t>AI Usage Event #</w:t>
+            </w:r>
+            <w:r>
+              <w:rPr>
+                <w:b/>
+                <w:bCs/>
+              </w:rPr>
+              <w:t>2</w:t>
+            </w:r>
+          </w:p>
+          <w:p>
+            <w:pPr>
+              <w:ind w:left="30"/>
+            </w:pPr>
+            <w:r>
+              <w:t>I used Claud</w:t>
+            </w:r>
+            <w:r>
+              <w:t xml:space="preserve">e Code to </w:t>
+            </w:r>
+            <w:r>
+              <w:t>make</w:t>
+            </w:r>
+            <w:r>
+              <w:t xml:space="preserve"> a script to insert </w:t>
+            </w:r>
+            <w:r>
+              <w:t xml:space="preserve">a collection of airports into my database. The airport information was stored in a json file I </w:t>
+            </w:r>
+            <w:r>
+              <w:t>already had which had previously been create</w:t>
+            </w:r>
+            <w:r>
+              <w:t xml:space="preserve">d </w:t>
+            </w:r>
+            <w:r>
+              <w:t xml:space="preserve">by Claude for a personal project. </w:t>
+            </w:r>
+            <w:r>
+              <w:t>Its</w:t>
+            </w:r>
+            <w:r>
+              <w:t xml:space="preserve"> data is scraped from </w:t>
+            </w:r>
+            <w:r>
+              <w:t>open-source collection online.</w:t>
+            </w:r>
+          </w:p>
+          <w:p>
+            <w:pPr>
+              <w:ind w:left="30"/>
+            </w:pPr>
+          </w:p>
+          <w:p>
+            <w:pPr>
+              <w:ind w:left="30"/>
+            </w:pPr>
+            <w:r>
+              <w:t>I have used the script to populate my database and incorporated the recommendations for my model that it suggested that I had missed (I am confident I would have identified and corrected them at a later date had it not suggested them).</w:t>
+            </w:r>
+          </w:p>
+          <w:p>
+            <w:pPr>
+              <w:ind w:left="30"/>
+            </w:pPr>
+          </w:p>
+          <w:p>
+            <w:pPr>
+              <w:ind w:left="30"/>
+              <w:rPr>
+                <w:b/>
+                <w:bCs/>
+              </w:rPr>
+            </w:pPr>
+            <w:r>
+              <w:rPr>
+                <w:b/>
+                <w:bCs/>
+              </w:rPr>
+              <w:t>Prompt:</w:t>
+            </w:r>
+          </w:p>
+          <w:p>
+            <w:pPr>
+              <w:ind w:left="30"/>
+              <w:rPr>
+                <w:lang w:val="en-GB"/>
+              </w:rPr>
+            </w:pPr>
+            <w:r>
+              <w:rPr>
+                <w:lang w:val="en-GB"/>
+              </w:rPr>
+              <w:t>Please make me a python script I can run using ``` uv run ...``` in /.devtools/add-airports to populate the database with the airports in the airports_seed.json file. It should be made in a single Python file and should populate the airports table I have already made. DO NOT edit any files other than the python script that you make. Once complete, give me instructions on how to call it and nay modifiers I can put in the script.</w:t>
+            </w:r>
+          </w:p>
+          <w:p>
+            <w:pPr>
+              <w:ind w:left="30"/>
+              <w:rPr>
+                <w:b/>
+                <w:bCs/>
+              </w:rPr>
+            </w:pPr>
+          </w:p>
+          <w:p>
+            <w:pPr>
+              <w:ind w:left="30"/>
+              <w:rPr>
+                <w:b/>
+                <w:bCs/>
+              </w:rPr>
+            </w:pPr>
+            <w:r>
+              <w:rPr>
+                <w:b/>
+                <w:bCs/>
+              </w:rPr>
+              <w:t>Response:</w:t>
+            </w:r>
+          </w:p>
+          <w:p>
+            <w:pPr>
+              <w:ind w:left="30"/>
+              <w:rPr>
+                <w:lang w:val="en-GB"/>
+              </w:rPr>
+            </w:pPr>
+            <w:r>
+              <w:rPr>
+                <w:lang w:val="en-GB"/>
+              </w:rPr>
+              <w:t>I've written the script at .devtools/add-airports/add_airports.py. No other files were changed. I tested it on a copy of data.db: it added all 10,030airports, a second run skipped them all, and --update worked. Your real database still has 0 airports, so you need to run it yourself.</w:t>
+            </w:r>
+          </w:p>
+          <w:p>
+            <w:pPr>
+              <w:ind w:left="30"/>
+              <w:rPr>
+                <w:lang w:val="en-GB"/>
+              </w:rPr>
+            </w:pPr>
+          </w:p>
+          <w:p>
+            <w:pPr>
+              <w:ind w:left="30"/>
+              <w:rPr>
+                <w:lang w:val="en-GB"/>
+              </w:rPr>
+            </w:pPr>
+            <w:r>
+              <w:rPr>
+                <w:lang w:val="en-GB"/>
+              </w:rPr>
+              <w:t>How to run it</w:t>
+            </w:r>
+          </w:p>
+          <w:p>
+            <w:pPr>
+              <w:ind w:left="30"/>
+              <w:rPr>
+                <w:lang w:val="en-GB"/>
+              </w:rPr>
+            </w:pPr>
+          </w:p>
+          <w:p>
+            <w:pPr>
+              <w:ind w:left="30"/>
+              <w:rPr>
+                <w:lang w:val="en-GB"/>
+              </w:rPr>
+            </w:pPr>
+            <w:r>
+              <w:rPr>
+                <w:lang w:val="en-GB"/>
+              </w:rPr>
+              <w:t>Run it from the project root, in the same folder as pyproject.toml:</w:t>
+            </w:r>
+          </w:p>
+          <w:p>
+            <w:pPr>
+              <w:ind w:left="30"/>
+              <w:rPr>
+                <w:lang w:val="en-GB"/>
+              </w:rPr>
+            </w:pPr>
+          </w:p>
+          <w:p>
+            <w:pPr>
+              <w:ind w:left="30"/>
+              <w:rPr>
+                <w:lang w:val="en-GB"/>
+              </w:rPr>
+            </w:pPr>
+            <w:r>
+              <w:rPr>
+                <w:lang w:val="en-GB"/>
+              </w:rPr>
+              <w:t>uv run .devtools/add-airports/add_airports.py</w:t>
+            </w:r>
+          </w:p>
+          <w:p>
+            <w:pPr>
+              <w:ind w:left="30"/>
+              <w:rPr>
+                <w:lang w:val="en-GB"/>
+              </w:rPr>
+            </w:pPr>
+          </w:p>
+          <w:p>
+            <w:pPr>
+              <w:ind w:left="30"/>
+              <w:rPr>
+                <w:lang w:val="en-GB"/>
+              </w:rPr>
+            </w:pPr>
+            <w:r>
+              <w:rPr>
+                <w:lang w:val="en-GB"/>
+              </w:rPr>
+              <w:t>It uses your project's existing uv environment, so you don't need to install anything extra. When it finishes it prints how many airports were added,</w:t>
+            </w:r>
+          </w:p>
+          <w:p>
+            <w:pPr>
+              <w:ind w:left="30"/>
+              <w:rPr>
+                <w:lang w:val="en-GB"/>
+              </w:rPr>
+            </w:pPr>
+            <w:r>
+              <w:rPr>
+                <w:lang w:val="en-GB"/>
+              </w:rPr>
+              <w:t>updated, skipped and in conflict.</w:t>
+            </w:r>
+          </w:p>
+          <w:p>
+            <w:pPr>
+              <w:ind w:left="30"/>
+              <w:rPr>
+                <w:lang w:val="en-GB"/>
+              </w:rPr>
+            </w:pPr>
+          </w:p>
+          <w:p>
+            <w:pPr>
+              <w:ind w:left="30"/>
+              <w:rPr>
+                <w:lang w:val="en-GB"/>
+              </w:rPr>
+            </w:pPr>
+            <w:r>
+              <w:rPr>
+                <w:lang w:val="en-GB"/>
+              </w:rPr>
+              <w:t>Options</w:t>
+            </w:r>
+          </w:p>
+          <w:p>
+            <w:pPr>
+              <w:ind w:left="30"/>
+              <w:rPr>
+                <w:lang w:val="en-GB"/>
+              </w:rPr>
+            </w:pPr>
+          </w:p>
+          <w:p>
+            <w:pPr>
+              <w:ind w:left="30"/>
+              <w:rPr>
+                <w:lang w:val="en-GB"/>
+              </w:rPr>
+            </w:pPr>
+            <w:r>
+              <w:rPr>
+                <w:lang w:val="en-GB"/>
+              </w:rPr>
+              <w:t>| Option | What it does |</w:t>
+            </w:r>
+          </w:p>
+          <w:p>
+            <w:pPr>
+              <w:ind w:left="30"/>
+              <w:rPr>
+                <w:lang w:val="en-GB"/>
+              </w:rPr>
+            </w:pPr>
+            <w:r>
+              <w:rPr>
+                <w:lang w:val="en-GB"/>
+              </w:rPr>
+              <w:t>|---|---|</w:t>
+            </w:r>
+          </w:p>
+          <w:p>
+            <w:pPr>
+              <w:ind w:left="30"/>
+              <w:rPr>
+                <w:lang w:val="en-GB"/>
+              </w:rPr>
+            </w:pPr>
+            <w:r>
+              <w:rPr>
+                <w:lang w:val="en-GB"/>
+              </w:rPr>
+              <w:lastRenderedPageBreak/>
+              <w:t>| --dry-run | Shows what would happen without writing anything to the database |</w:t>
+            </w:r>
+          </w:p>
+          <w:p>
+            <w:pPr>
+              <w:ind w:left="30"/>
+              <w:rPr>
+                <w:lang w:val="en-GB"/>
+              </w:rPr>
+            </w:pPr>
+            <w:r>
+              <w:rPr>
+                <w:lang w:val="en-GB"/>
+              </w:rPr>
+              <w:t>| --update | Overwrites airports that are already in the table with the values from the seed file. By default they are skipped, so running it twice is safe |</w:t>
+            </w:r>
+          </w:p>
+          <w:p>
+            <w:pPr>
+              <w:ind w:left="30"/>
+              <w:rPr>
+                <w:lang w:val="en-GB"/>
+              </w:rPr>
+            </w:pPr>
+            <w:r>
+              <w:rPr>
+                <w:lang w:val="en-GB"/>
+              </w:rPr>
+              <w:t>| --country "United Kingdom" | Only adds airports from that country (not case-sensitive) |</w:t>
+            </w:r>
+          </w:p>
+          <w:p>
+            <w:pPr>
+              <w:ind w:left="30"/>
+              <w:rPr>
+                <w:lang w:val="en-GB"/>
+              </w:rPr>
+            </w:pPr>
+            <w:r>
+              <w:rPr>
+                <w:lang w:val="en-GB"/>
+              </w:rPr>
+              <w:t>| --limit 100 | Only processes the first N airports in the seed file |</w:t>
+            </w:r>
+          </w:p>
+          <w:p>
+            <w:pPr>
+              <w:ind w:left="30"/>
+              <w:rPr>
+                <w:lang w:val="en-GB"/>
+              </w:rPr>
+            </w:pPr>
+            <w:r>
+              <w:rPr>
+                <w:lang w:val="en-GB"/>
+              </w:rPr>
+              <w:t>| --file path/to/other.json | Uses a different seed file (default: airports_seed.json next to the script) |</w:t>
+            </w:r>
+          </w:p>
+          <w:p>
+            <w:pPr>
+              <w:ind w:left="30"/>
+              <w:rPr>
+                <w:lang w:val="en-GB"/>
+              </w:rPr>
+            </w:pPr>
+            <w:r>
+              <w:rPr>
+                <w:lang w:val="en-GB"/>
+              </w:rPr>
+              <w:t>| --db path/to/other.db | Uses a different SQLite database (default: data/data.db) |</w:t>
+            </w:r>
+          </w:p>
+          <w:p>
+            <w:pPr>
+              <w:ind w:left="30"/>
+              <w:rPr>
+                <w:lang w:val="en-GB"/>
+              </w:rPr>
+            </w:pPr>
+            <w:r>
+              <w:rPr>
+                <w:lang w:val="en-GB"/>
+              </w:rPr>
+              <w:t>| --help | Lists all of the options |</w:t>
+            </w:r>
+          </w:p>
+          <w:p>
+            <w:pPr>
+              <w:ind w:left="30"/>
+              <w:rPr>
+                <w:lang w:val="en-GB"/>
+              </w:rPr>
+            </w:pPr>
+          </w:p>
+          <w:p>
+            <w:pPr>
+              <w:ind w:left="30"/>
+              <w:rPr>
+                <w:lang w:val="en-GB"/>
+              </w:rPr>
+            </w:pPr>
+            <w:r>
+              <w:rPr>
+                <w:lang w:val="en-GB"/>
+              </w:rPr>
+              <w:t>You can combine them, for example:</w:t>
+            </w:r>
+          </w:p>
+          <w:p>
+            <w:pPr>
+              <w:ind w:left="30"/>
+              <w:rPr>
+                <w:lang w:val="en-GB"/>
+              </w:rPr>
+            </w:pPr>
+            <w:r>
+              <w:rPr>
+                <w:lang w:val="en-GB"/>
+              </w:rPr>
+              <w:t>``` POWERSHELL</w:t>
+            </w:r>
+          </w:p>
+          <w:p>
+            <w:pPr>
+              <w:ind w:left="30"/>
+              <w:rPr>
+                <w:lang w:val="en-GB"/>
+              </w:rPr>
+            </w:pPr>
+            <w:r>
+              <w:rPr>
+                <w:lang w:val="en-GB"/>
+              </w:rPr>
+              <w:t>uv run .devtools/add-airports/add_airports.py --country "United Kingdom" --dry-run</w:t>
+            </w:r>
+          </w:p>
+          <w:p>
+            <w:pPr>
+              <w:ind w:left="30"/>
+              <w:rPr>
+                <w:lang w:val="en-GB"/>
+              </w:rPr>
+            </w:pPr>
+            <w:r>
+              <w:rPr>
+                <w:lang w:val="en-GB"/>
+              </w:rPr>
+              <w:t>```</w:t>
+            </w:r>
+          </w:p>
+          <w:p>
+            <w:pPr>
+              <w:ind w:left="30"/>
+              <w:rPr>
+                <w:lang w:val="en-GB"/>
+              </w:rPr>
+            </w:pPr>
+          </w:p>
+          <w:p>
+            <w:pPr>
+              <w:ind w:left="30"/>
+              <w:rPr>
+                <w:lang w:val="en-GB"/>
+              </w:rPr>
+            </w:pPr>
+            <w:r>
+              <w:rPr>
+                <w:lang w:val="en-GB"/>
+              </w:rPr>
+              <w:t>If two airports have the same IATA code, the script skips the second one and lists it under Conflicts, instead of crashing on the unique constraint.</w:t>
+            </w:r>
+          </w:p>
+          <w:p>
+            <w:pPr>
+              <w:ind w:left="30"/>
+              <w:rPr>
+                <w:lang w:val="en-GB"/>
+              </w:rPr>
+            </w:pPr>
+          </w:p>
+          <w:p>
+            <w:pPr>
+              <w:ind w:left="30"/>
+              <w:rPr>
+                <w:lang w:val="en-GB"/>
+              </w:rPr>
+            </w:pPr>
+            <w:r>
+              <w:rPr>
+                <w:lang w:val="en-GB"/>
+              </w:rPr>
+              <w:t>Bug in your models</w:t>
+            </w:r>
+          </w:p>
+          <w:p>
+            <w:pPr>
+              <w:ind w:left="30"/>
+              <w:rPr>
+                <w:lang w:val="en-GB"/>
+              </w:rPr>
+            </w:pPr>
+          </w:p>
+          <w:p>
+            <w:pPr>
+              <w:ind w:left="30"/>
+              <w:rPr>
+                <w:lang w:val="en-GB"/>
+              </w:rPr>
+            </w:pPr>
+            <w:r>
+              <w:rPr>
+                <w:lang w:val="en-GB"/>
+              </w:rPr>
+              <w:t>Testing found a bug in your existing models. Route has two foreign keys to airports (origin_icao and destination_icao). The relationships on</w:t>
+            </w:r>
+          </w:p>
+          <w:p>
+            <w:pPr>
+              <w:ind w:left="30"/>
+              <w:rPr>
+                <w:lang w:val="en-GB"/>
+              </w:rPr>
+            </w:pPr>
+            <w:r>
+              <w:rPr>
+                <w:lang w:val="en-GB"/>
+              </w:rPr>
+              <w:t>Airport.departures/arrivals and Route.origin/destination don't say which key each one uses. Because of that, SQLAlchemy throws an AmbiguousForeignKeysError</w:t>
+            </w:r>
+          </w:p>
+          <w:p>
+            <w:pPr>
+              <w:ind w:left="30"/>
+              <w:rPr>
+                <w:lang w:val="en-GB"/>
+              </w:rPr>
+            </w:pPr>
+            <w:r>
+              <w:rPr>
+                <w:lang w:val="en-GB"/>
+              </w:rPr>
+              <w:t>the first time the Airport model is used in a query or insert. Your Flask app will hit the same error.</w:t>
+            </w:r>
+          </w:p>
+          <w:p>
+            <w:pPr>
+              <w:ind w:left="30"/>
+              <w:rPr>
+                <w:lang w:val="en-GB"/>
+              </w:rPr>
+            </w:pPr>
+          </w:p>
+          <w:p>
+            <w:pPr>
+              <w:ind w:left="30"/>
+              <w:rPr>
+                <w:lang w:val="en-GB"/>
+              </w:rPr>
+            </w:pPr>
+            <w:r>
+              <w:rPr>
+                <w:lang w:val="en-GB"/>
+              </w:rPr>
+              <w:t>I didn't edit the models, as you asked. Instead, the script writes to the table directly, which avoids the error. To fix the models, add foreign_keys= to</w:t>
+            </w:r>
+          </w:p>
+          <w:p>
+            <w:pPr>
+              <w:ind w:left="30"/>
+              <w:rPr>
+                <w:lang w:val="en-GB"/>
+              </w:rPr>
+            </w:pPr>
+            <w:r>
+              <w:rPr>
+                <w:lang w:val="en-GB"/>
+              </w:rPr>
+              <w:t>each relationship, for example:</w:t>
+            </w:r>
+          </w:p>
+          <w:p>
+            <w:pPr>
+              <w:ind w:left="30"/>
+              <w:rPr>
+                <w:lang w:val="en-GB"/>
+              </w:rPr>
+            </w:pPr>
+          </w:p>
+          <w:p>
+            <w:pPr>
+              <w:ind w:left="30"/>
+              <w:rPr>
+                <w:lang w:val="en-GB"/>
+              </w:rPr>
+            </w:pPr>
+            <w:r>
+              <w:rPr>
+                <w:lang w:val="en-GB"/>
+              </w:rPr>
+              <w:t>``` PYTHON</w:t>
+            </w:r>
+          </w:p>
+          <w:p>
+            <w:pPr>
+              <w:ind w:left="30"/>
+              <w:rPr>
+                <w:lang w:val="en-GB"/>
+              </w:rPr>
+            </w:pPr>
+            <w:r>
+              <w:rPr>
+                <w:lang w:val="en-GB"/>
+              </w:rPr>
+              <w:t>departures: Mapped[list["Route"]] = relationship(back_populates="origin", foreign_keys="Route.origin_icao")</w:t>
+            </w:r>
+          </w:p>
+          <w:p>
+            <w:pPr>
+              <w:ind w:left="30"/>
+              <w:rPr>
+                <w:lang w:val="en-GB"/>
+              </w:rPr>
+            </w:pPr>
+            <w:r>
+              <w:rPr>
+                <w:lang w:val="en-GB"/>
+              </w:rPr>
+              <w:t>```</w:t>
+            </w:r>
+          </w:p>
+          <w:p>
+            <w:pPr>
+              <w:ind w:left="30"/>
+              <w:rPr>
+                <w:lang w:val="en-GB"/>
+              </w:rPr>
+            </w:pPr>
+          </w:p>
+          <w:p>
+            <w:pPr>
+              <w:ind w:left="30"/>
+              <w:rPr>
+                <w:lang w:val="en-GB"/>
+              </w:rPr>
+            </w:pPr>
+            <w:r>
+              <w:rPr>
+                <w:lang w:val="en-GB"/>
+              </w:rPr>
+              <w:t>arrivals needs ```foreign_keys="Route.destination_icao"```, and the matching relationships in models/route.py need ```foreign_keys=[origin_icao]``` and</w:t>
+            </w:r>
+          </w:p>
+          <w:p>
+            <w:pPr>
+              <w:ind w:left="30"/>
+              <w:rPr>
+                <w:lang w:val="en-GB"/>
+              </w:rPr>
+            </w:pPr>
+            <w:r>
+              <w:rPr>
+                <w:lang w:val="en-GB"/>
+              </w:rPr>
+              <w:t>```foreign_keys=[destination_icao]```.</w:t>
+            </w:r>
+          </w:p>
+          <w:p>
+            <w:pPr>
+              <w:ind w:left="30"/>
+              <w:rPr>
+                <w:lang w:val="en-GB"/>
+              </w:rPr>
+            </w:pPr>
+          </w:p>
+          <w:p>
+            <w:pPr>
+              <w:ind w:left="30"/>
+              <w:rPr>
+                <w:lang w:val="en-GB"/>
+              </w:rPr>
+            </w:pPr>
+            <w:r>
+              <w:rPr>
+                <w:lang w:val="en-GB"/>
+              </w:rPr>
+              <w:lastRenderedPageBreak/>
+              <w:t>There's also a smaller mismatch: routes.origin_icao, routes.destination_icao and airport_staff.assigned_airport_icao are declared as String(3), but ICAO</w:t>
+            </w:r>
+          </w:p>
+          <w:p>
+            <w:pPr>
+              <w:ind w:left="30"/>
+              <w:rPr>
+                <w:lang w:val="en-GB"/>
+              </w:rPr>
+            </w:pPr>
+            <w:r>
+              <w:rPr>
+                <w:lang w:val="en-GB"/>
+              </w:rPr>
+              <w:t>codes are 4 characters. SQLite doesn't enforce string lengths, so nothing breaks now.</w:t>
+            </w:r>
+          </w:p>
+          <w:p>
+            <w:pPr>
+              <w:ind w:left="30"/>
+            </w:pPr>
+          </w:p>
+          <w:p>
+            <w:pPr>
+              <w:ind w:left="30"/>
+              <w:rPr>
+                <w:b/>
+                <w:bCs/>
+              </w:rPr>
+            </w:pPr>
+            <w:r>
+              <w:rPr>
+                <w:b/>
+                <w:bCs/>
+              </w:rPr>
+              <w:t>Output Code:</w:t>
+            </w:r>
+          </w:p>
+          <w:p>
+            <w:pPr>
+              <w:ind w:left="30"/>
+              <w:rPr>
+                <w:lang w:val="en-GB"/>
+              </w:rPr>
+            </w:pPr>
+            <w:r>
+              <w:rPr>
+                <w:lang w:val="en-GB"/>
+              </w:rPr>
+              <w:t>"""Dev tool to populate the airports table from airports_seed.json.</w:t>
+            </w:r>
+          </w:p>
+          <w:p>
+            <w:pPr>
+              <w:ind w:left="30"/>
+              <w:rPr>
+                <w:lang w:val="en-GB"/>
+              </w:rPr>
+            </w:pPr>
+          </w:p>
+          <w:p>
+            <w:pPr>
+              <w:ind w:left="30"/>
+              <w:rPr>
+                <w:lang w:val="en-GB"/>
+              </w:rPr>
+            </w:pPr>
+            <w:r>
+              <w:rPr>
+                <w:lang w:val="en-GB"/>
+              </w:rPr>
+              <w:t>Run from the repository root:</w:t>
+            </w:r>
+          </w:p>
+          <w:p>
+            <w:pPr>
+              <w:ind w:left="30"/>
+              <w:rPr>
+                <w:lang w:val="en-GB"/>
+              </w:rPr>
+            </w:pPr>
+            <w:r>
+              <w:rPr>
+                <w:lang w:val="en-GB"/>
+              </w:rPr>
+              <w:t>    uv run .devtools/add-airports/add_airports.py [options]</w:t>
+            </w:r>
+          </w:p>
+          <w:p>
+            <w:pPr>
+              <w:ind w:left="30"/>
+              <w:rPr>
+                <w:lang w:val="en-GB"/>
+              </w:rPr>
+            </w:pPr>
+          </w:p>
+          <w:p>
+            <w:pPr>
+              <w:ind w:left="30"/>
+              <w:rPr>
+                <w:lang w:val="en-GB"/>
+              </w:rPr>
+            </w:pPr>
+            <w:r>
+              <w:rPr>
+                <w:lang w:val="en-GB"/>
+              </w:rPr>
+              <w:t>Use --help to see all available options.</w:t>
+            </w:r>
+          </w:p>
+          <w:p>
+            <w:pPr>
+              <w:ind w:left="30"/>
+              <w:rPr>
+                <w:lang w:val="en-GB"/>
+              </w:rPr>
+            </w:pPr>
+            <w:r>
+              <w:rPr>
+                <w:lang w:val="en-GB"/>
+              </w:rPr>
+              <w:t>"""</w:t>
+            </w:r>
+          </w:p>
+          <w:p>
+            <w:pPr>
+              <w:ind w:left="30"/>
+              <w:rPr>
+                <w:lang w:val="en-GB"/>
+              </w:rPr>
+            </w:pPr>
+          </w:p>
+          <w:p>
+            <w:pPr>
+              <w:ind w:left="30"/>
+              <w:rPr>
+                <w:lang w:val="en-GB"/>
+              </w:rPr>
+            </w:pPr>
+            <w:r>
+              <w:rPr>
+                <w:lang w:val="en-GB"/>
+              </w:rPr>
+              <w:t>import argparse</w:t>
+            </w:r>
+          </w:p>
+          <w:p>
+            <w:pPr>
+              <w:ind w:left="30"/>
+              <w:rPr>
+                <w:lang w:val="en-GB"/>
+              </w:rPr>
+            </w:pPr>
+            <w:r>
+              <w:rPr>
+                <w:lang w:val="en-GB"/>
+              </w:rPr>
+              <w:t>import json</w:t>
+            </w:r>
+          </w:p>
+          <w:p>
+            <w:pPr>
+              <w:ind w:left="30"/>
+              <w:rPr>
+                <w:lang w:val="en-GB"/>
+              </w:rPr>
+            </w:pPr>
+            <w:r>
+              <w:rPr>
+                <w:lang w:val="en-GB"/>
+              </w:rPr>
+              <w:t>import sys</w:t>
+            </w:r>
+          </w:p>
+          <w:p>
+            <w:pPr>
+              <w:ind w:left="30"/>
+              <w:rPr>
+                <w:lang w:val="en-GB"/>
+              </w:rPr>
+            </w:pPr>
+            <w:r>
+              <w:rPr>
+                <w:lang w:val="en-GB"/>
+              </w:rPr>
+              <w:t>from pathlib import Path</w:t>
+            </w:r>
+          </w:p>
+          <w:p>
+            <w:pPr>
+              <w:ind w:left="30"/>
+              <w:rPr>
+                <w:lang w:val="en-GB"/>
+              </w:rPr>
+            </w:pPr>
+          </w:p>
+          <w:p>
+            <w:pPr>
+              <w:ind w:left="30"/>
+              <w:rPr>
+                <w:lang w:val="en-GB"/>
+              </w:rPr>
+            </w:pPr>
+            <w:r>
+              <w:rPr>
+                <w:lang w:val="en-GB"/>
+              </w:rPr>
+              <w:t>SCRIPT_DIR = Path(__file__).resolve().parent</w:t>
+            </w:r>
+          </w:p>
+          <w:p>
+            <w:pPr>
+              <w:ind w:left="30"/>
+              <w:rPr>
+                <w:lang w:val="en-GB"/>
+              </w:rPr>
+            </w:pPr>
+            <w:r>
+              <w:rPr>
+                <w:lang w:val="en-GB"/>
+              </w:rPr>
+              <w:t>REPO_ROOT = SCRIPT_DIR.parent.parent</w:t>
+            </w:r>
+          </w:p>
+          <w:p>
+            <w:pPr>
+              <w:ind w:left="30"/>
+              <w:rPr>
+                <w:lang w:val="en-GB"/>
+              </w:rPr>
+            </w:pPr>
+          </w:p>
+          <w:p>
+            <w:pPr>
+              <w:ind w:left="30"/>
+              <w:rPr>
+                <w:lang w:val="en-GB"/>
+              </w:rPr>
+            </w:pPr>
+            <w:r>
+              <w:rPr>
+                <w:lang w:val="en-GB"/>
+              </w:rPr>
+              <w:t># Allows the project's models package to be imported no matter where the script is run from</w:t>
+            </w:r>
+          </w:p>
+          <w:p>
+            <w:pPr>
+              <w:ind w:left="30"/>
+              <w:rPr>
+                <w:lang w:val="en-GB"/>
+              </w:rPr>
+            </w:pPr>
+            <w:r>
+              <w:rPr>
+                <w:lang w:val="en-GB"/>
+              </w:rPr>
+              <w:t>sys.path.insert(0, str(REPO_ROOT))</w:t>
+            </w:r>
+          </w:p>
+          <w:p>
+            <w:pPr>
+              <w:ind w:left="30"/>
+              <w:rPr>
+                <w:lang w:val="en-GB"/>
+              </w:rPr>
+            </w:pPr>
+          </w:p>
+          <w:p>
+            <w:pPr>
+              <w:ind w:left="30"/>
+              <w:rPr>
+                <w:lang w:val="en-GB"/>
+              </w:rPr>
+            </w:pPr>
+            <w:r>
+              <w:rPr>
+                <w:lang w:val="en-GB"/>
+              </w:rPr>
+              <w:t>from sqlalchemy import create_engine, insert, inspect, select, update</w:t>
+            </w:r>
+          </w:p>
+          <w:p>
+            <w:pPr>
+              <w:ind w:left="30"/>
+              <w:rPr>
+                <w:lang w:val="en-GB"/>
+              </w:rPr>
+            </w:pPr>
+          </w:p>
+          <w:p>
+            <w:pPr>
+              <w:ind w:left="30"/>
+              <w:rPr>
+                <w:lang w:val="en-GB"/>
+              </w:rPr>
+            </w:pPr>
+            <w:r>
+              <w:rPr>
+                <w:lang w:val="en-GB"/>
+              </w:rPr>
+              <w:t>from models import Airport</w:t>
+            </w:r>
+          </w:p>
+          <w:p>
+            <w:pPr>
+              <w:ind w:left="30"/>
+              <w:rPr>
+                <w:lang w:val="en-GB"/>
+              </w:rPr>
+            </w:pPr>
+            <w:r>
+              <w:rPr>
+                <w:lang w:val="en-GB"/>
+              </w:rPr>
+              <w:t>from models.base import DB_PATH</w:t>
+            </w:r>
+          </w:p>
+          <w:p>
+            <w:pPr>
+              <w:ind w:left="30"/>
+              <w:rPr>
+                <w:lang w:val="en-GB"/>
+              </w:rPr>
+            </w:pPr>
+          </w:p>
+          <w:p>
+            <w:pPr>
+              <w:ind w:left="30"/>
+              <w:rPr>
+                <w:lang w:val="en-GB"/>
+              </w:rPr>
+            </w:pPr>
+            <w:r>
+              <w:rPr>
+                <w:lang w:val="en-GB"/>
+              </w:rPr>
+              <w:t>DEFAULT_SEED_PATH = SCRIPT_DIR / "airports_seed.json"</w:t>
+            </w:r>
+          </w:p>
+          <w:p>
+            <w:pPr>
+              <w:ind w:left="30"/>
+              <w:rPr>
+                <w:lang w:val="en-GB"/>
+              </w:rPr>
+            </w:pPr>
+            <w:r>
+              <w:rPr>
+                <w:lang w:val="en-GB"/>
+              </w:rPr>
+              <w:t>REQUIRED_FIELDS = ["icao", "iata", "name", "city", "country", "latitude", "longitude", "timezone"]</w:t>
+            </w:r>
+          </w:p>
+          <w:p>
+            <w:pPr>
+              <w:ind w:left="30"/>
+              <w:rPr>
+                <w:lang w:val="en-GB"/>
+              </w:rPr>
+            </w:pPr>
+          </w:p>
+          <w:p>
+            <w:pPr>
+              <w:ind w:left="30"/>
+              <w:rPr>
+                <w:lang w:val="en-GB"/>
+              </w:rPr>
+            </w:pPr>
+            <w:r>
+              <w:rPr>
+                <w:lang w:val="en-GB"/>
+              </w:rPr>
+              <w:t>def parse_args() -&gt; argparse.Namespace:</w:t>
+            </w:r>
+          </w:p>
+          <w:p>
+            <w:pPr>
+              <w:ind w:left="30"/>
+              <w:rPr>
+                <w:lang w:val="en-GB"/>
+              </w:rPr>
+            </w:pPr>
+            <w:r>
+              <w:rPr>
+                <w:lang w:val="en-GB"/>
+              </w:rPr>
+              <w:t>    """Parses the command line arguments for the script.</w:t>
+            </w:r>
+          </w:p>
+          <w:p>
+            <w:pPr>
+              <w:ind w:left="30"/>
+              <w:rPr>
+                <w:lang w:val="en-GB"/>
+              </w:rPr>
+            </w:pPr>
+          </w:p>
+          <w:p>
+            <w:pPr>
+              <w:ind w:left="30"/>
+              <w:rPr>
+                <w:lang w:val="en-GB"/>
+              </w:rPr>
+            </w:pPr>
+            <w:r>
+              <w:rPr>
+                <w:lang w:val="en-GB"/>
+              </w:rPr>
+              <w:lastRenderedPageBreak/>
+              <w:t>    Returns:</w:t>
+            </w:r>
+          </w:p>
+          <w:p>
+            <w:pPr>
+              <w:ind w:left="30"/>
+              <w:rPr>
+                <w:lang w:val="en-GB"/>
+              </w:rPr>
+            </w:pPr>
+            <w:r>
+              <w:rPr>
+                <w:lang w:val="en-GB"/>
+              </w:rPr>
+              <w:t>        argparse.Namespace: The parsed arguments</w:t>
+            </w:r>
+          </w:p>
+          <w:p>
+            <w:pPr>
+              <w:ind w:left="30"/>
+              <w:rPr>
+                <w:lang w:val="en-GB"/>
+              </w:rPr>
+            </w:pPr>
+            <w:r>
+              <w:rPr>
+                <w:lang w:val="en-GB"/>
+              </w:rPr>
+              <w:t>    """</w:t>
+            </w:r>
+          </w:p>
+          <w:p>
+            <w:pPr>
+              <w:ind w:left="30"/>
+              <w:rPr>
+                <w:lang w:val="en-GB"/>
+              </w:rPr>
+            </w:pPr>
+          </w:p>
+          <w:p>
+            <w:pPr>
+              <w:ind w:left="30"/>
+              <w:rPr>
+                <w:lang w:val="en-GB"/>
+              </w:rPr>
+            </w:pPr>
+            <w:r>
+              <w:rPr>
+                <w:lang w:val="en-GB"/>
+              </w:rPr>
+              <w:t>    parser = argparse.ArgumentParser(description="Populate the airports table from a JSON seed file.")</w:t>
+            </w:r>
+          </w:p>
+          <w:p>
+            <w:pPr>
+              <w:ind w:left="30"/>
+              <w:rPr>
+                <w:lang w:val="en-GB"/>
+              </w:rPr>
+            </w:pPr>
+            <w:r>
+              <w:rPr>
+                <w:lang w:val="en-GB"/>
+              </w:rPr>
+              <w:t>    parser.add_argument("--file", type=Path, default=DEFAULT_SEED_PATH, help=f"Path to the seed JSON file (default: {DEFAULT_SEED_PATH.name})")</w:t>
+            </w:r>
+          </w:p>
+          <w:p>
+            <w:pPr>
+              <w:ind w:left="30"/>
+              <w:rPr>
+                <w:lang w:val="en-GB"/>
+              </w:rPr>
+            </w:pPr>
+            <w:r>
+              <w:rPr>
+                <w:lang w:val="en-GB"/>
+              </w:rPr>
+              <w:t>    parser.add_argument("--db", type=Path, default=DB_PATH, help="Path to the SQLite database (default: data/data.db)")</w:t>
+            </w:r>
+          </w:p>
+          <w:p>
+            <w:pPr>
+              <w:ind w:left="30"/>
+              <w:rPr>
+                <w:lang w:val="en-GB"/>
+              </w:rPr>
+            </w:pPr>
+            <w:r>
+              <w:rPr>
+                <w:lang w:val="en-GB"/>
+              </w:rPr>
+              <w:t>    parser.add_argument("--update", action="store_true", help="Overwrite airports that already exist with the seed values instead of skipping them")</w:t>
+            </w:r>
+          </w:p>
+          <w:p>
+            <w:pPr>
+              <w:ind w:left="30"/>
+              <w:rPr>
+                <w:lang w:val="en-GB"/>
+              </w:rPr>
+            </w:pPr>
+            <w:r>
+              <w:rPr>
+                <w:lang w:val="en-GB"/>
+              </w:rPr>
+              <w:t>    parser.add_argument("--limit", type=int, default=None, help="Only process the first N airports from the seed file")</w:t>
+            </w:r>
+          </w:p>
+          <w:p>
+            <w:pPr>
+              <w:ind w:left="30"/>
+              <w:rPr>
+                <w:lang w:val="en-GB"/>
+              </w:rPr>
+            </w:pPr>
+            <w:r>
+              <w:rPr>
+                <w:lang w:val="en-GB"/>
+              </w:rPr>
+              <w:t>    parser.add_argument("--country", type=str, default=None, help="Only add airports from this country (case insensitive, e.g. \"United Kingdom\")")</w:t>
+            </w:r>
+          </w:p>
+          <w:p>
+            <w:pPr>
+              <w:ind w:left="30"/>
+              <w:rPr>
+                <w:lang w:val="en-GB"/>
+              </w:rPr>
+            </w:pPr>
+            <w:r>
+              <w:rPr>
+                <w:lang w:val="en-GB"/>
+              </w:rPr>
+              <w:t>    parser.add_argument("--dry-run", action="store_true", help="Show what would happen without writing anything to the database")</w:t>
+            </w:r>
+          </w:p>
+          <w:p>
+            <w:pPr>
+              <w:ind w:left="30"/>
+              <w:rPr>
+                <w:lang w:val="en-GB"/>
+              </w:rPr>
+            </w:pPr>
+            <w:r>
+              <w:rPr>
+                <w:lang w:val="en-GB"/>
+              </w:rPr>
+              <w:t>    return parser.parse_args()</w:t>
+            </w:r>
+          </w:p>
+          <w:p>
+            <w:pPr>
+              <w:ind w:left="30"/>
+              <w:rPr>
+                <w:lang w:val="en-GB"/>
+              </w:rPr>
+            </w:pPr>
+          </w:p>
+          <w:p>
+            <w:pPr>
+              <w:ind w:left="30"/>
+              <w:rPr>
+                <w:lang w:val="en-GB"/>
+              </w:rPr>
+            </w:pPr>
+            <w:r>
+              <w:rPr>
+                <w:lang w:val="en-GB"/>
+              </w:rPr>
+              <w:t>def load_seed(path: Path) -&gt; list[dict]:</w:t>
+            </w:r>
+          </w:p>
+          <w:p>
+            <w:pPr>
+              <w:ind w:left="30"/>
+              <w:rPr>
+                <w:lang w:val="en-GB"/>
+              </w:rPr>
+            </w:pPr>
+            <w:r>
+              <w:rPr>
+                <w:lang w:val="en-GB"/>
+              </w:rPr>
+              <w:t>    """Loads and validates the airport records from the seed file.</w:t>
+            </w:r>
+          </w:p>
+          <w:p>
+            <w:pPr>
+              <w:ind w:left="30"/>
+              <w:rPr>
+                <w:lang w:val="en-GB"/>
+              </w:rPr>
+            </w:pPr>
+          </w:p>
+          <w:p>
+            <w:pPr>
+              <w:ind w:left="30"/>
+              <w:rPr>
+                <w:lang w:val="en-GB"/>
+              </w:rPr>
+            </w:pPr>
+            <w:r>
+              <w:rPr>
+                <w:lang w:val="en-GB"/>
+              </w:rPr>
+              <w:t>    Args:</w:t>
+            </w:r>
+          </w:p>
+          <w:p>
+            <w:pPr>
+              <w:ind w:left="30"/>
+              <w:rPr>
+                <w:lang w:val="en-GB"/>
+              </w:rPr>
+            </w:pPr>
+            <w:r>
+              <w:rPr>
+                <w:lang w:val="en-GB"/>
+              </w:rPr>
+              <w:t>        path (Path): The path to the seed JSON file</w:t>
+            </w:r>
+          </w:p>
+          <w:p>
+            <w:pPr>
+              <w:ind w:left="30"/>
+              <w:rPr>
+                <w:lang w:val="en-GB"/>
+              </w:rPr>
+            </w:pPr>
+          </w:p>
+          <w:p>
+            <w:pPr>
+              <w:ind w:left="30"/>
+              <w:rPr>
+                <w:lang w:val="en-GB"/>
+              </w:rPr>
+            </w:pPr>
+            <w:r>
+              <w:rPr>
+                <w:lang w:val="en-GB"/>
+              </w:rPr>
+              <w:t>    Returns:</w:t>
+            </w:r>
+          </w:p>
+          <w:p>
+            <w:pPr>
+              <w:ind w:left="30"/>
+              <w:rPr>
+                <w:lang w:val="en-GB"/>
+              </w:rPr>
+            </w:pPr>
+            <w:r>
+              <w:rPr>
+                <w:lang w:val="en-GB"/>
+              </w:rPr>
+              <w:t>        list[dict]: The list of airport records</w:t>
+            </w:r>
+          </w:p>
+          <w:p>
+            <w:pPr>
+              <w:ind w:left="30"/>
+              <w:rPr>
+                <w:lang w:val="en-GB"/>
+              </w:rPr>
+            </w:pPr>
+            <w:r>
+              <w:rPr>
+                <w:lang w:val="en-GB"/>
+              </w:rPr>
+              <w:t>    """</w:t>
+            </w:r>
+          </w:p>
+          <w:p>
+            <w:pPr>
+              <w:ind w:left="30"/>
+              <w:rPr>
+                <w:lang w:val="en-GB"/>
+              </w:rPr>
+            </w:pPr>
+          </w:p>
+          <w:p>
+            <w:pPr>
+              <w:ind w:left="30"/>
+              <w:rPr>
+                <w:lang w:val="en-GB"/>
+              </w:rPr>
+            </w:pPr>
+            <w:r>
+              <w:rPr>
+                <w:lang w:val="en-GB"/>
+              </w:rPr>
+              <w:t>    if not path.exists():</w:t>
+            </w:r>
+          </w:p>
+          <w:p>
+            <w:pPr>
+              <w:ind w:left="30"/>
+              <w:rPr>
+                <w:lang w:val="en-GB"/>
+              </w:rPr>
+            </w:pPr>
+            <w:r>
+              <w:rPr>
+                <w:lang w:val="en-GB"/>
+              </w:rPr>
+              <w:t>        sys.exit(f"Seed file not found: {path}")</w:t>
+            </w:r>
+          </w:p>
+          <w:p>
+            <w:pPr>
+              <w:ind w:left="30"/>
+              <w:rPr>
+                <w:lang w:val="en-GB"/>
+              </w:rPr>
+            </w:pPr>
+          </w:p>
+          <w:p>
+            <w:pPr>
+              <w:ind w:left="30"/>
+              <w:rPr>
+                <w:lang w:val="en-GB"/>
+              </w:rPr>
+            </w:pPr>
+            <w:r>
+              <w:rPr>
+                <w:lang w:val="en-GB"/>
+              </w:rPr>
+              <w:t>    with open(path, encoding="utf-8") as file:</w:t>
+            </w:r>
+          </w:p>
+          <w:p>
+            <w:pPr>
+              <w:ind w:left="30"/>
+              <w:rPr>
+                <w:lang w:val="en-GB"/>
+              </w:rPr>
+            </w:pPr>
+            <w:r>
+              <w:rPr>
+                <w:lang w:val="en-GB"/>
+              </w:rPr>
+              <w:t>        records = json.load(file)</w:t>
+            </w:r>
+          </w:p>
+          <w:p>
+            <w:pPr>
+              <w:ind w:left="30"/>
+              <w:rPr>
+                <w:lang w:val="en-GB"/>
+              </w:rPr>
+            </w:pPr>
+          </w:p>
+          <w:p>
+            <w:pPr>
+              <w:ind w:left="30"/>
+              <w:rPr>
+                <w:lang w:val="en-GB"/>
+              </w:rPr>
+            </w:pPr>
+            <w:r>
+              <w:rPr>
+                <w:lang w:val="en-GB"/>
+              </w:rPr>
+              <w:lastRenderedPageBreak/>
+              <w:t>    if not isinstance(records, list):</w:t>
+            </w:r>
+          </w:p>
+          <w:p>
+            <w:pPr>
+              <w:ind w:left="30"/>
+              <w:rPr>
+                <w:lang w:val="en-GB"/>
+              </w:rPr>
+            </w:pPr>
+            <w:r>
+              <w:rPr>
+                <w:lang w:val="en-GB"/>
+              </w:rPr>
+              <w:t>        sys.exit("Seed file must contain a JSON list of airports")</w:t>
+            </w:r>
+          </w:p>
+          <w:p>
+            <w:pPr>
+              <w:ind w:left="30"/>
+              <w:rPr>
+                <w:lang w:val="en-GB"/>
+              </w:rPr>
+            </w:pPr>
+          </w:p>
+          <w:p>
+            <w:pPr>
+              <w:ind w:left="30"/>
+              <w:rPr>
+                <w:lang w:val="en-GB"/>
+              </w:rPr>
+            </w:pPr>
+            <w:r>
+              <w:rPr>
+                <w:lang w:val="en-GB"/>
+              </w:rPr>
+              <w:t>    for index, record in enumerate(records):</w:t>
+            </w:r>
+          </w:p>
+          <w:p>
+            <w:pPr>
+              <w:ind w:left="30"/>
+              <w:rPr>
+                <w:lang w:val="en-GB"/>
+              </w:rPr>
+            </w:pPr>
+            <w:r>
+              <w:rPr>
+                <w:lang w:val="en-GB"/>
+              </w:rPr>
+              <w:t>        missing = [field for field in REQUIRED_FIELDS if field not in record]</w:t>
+            </w:r>
+          </w:p>
+          <w:p>
+            <w:pPr>
+              <w:ind w:left="30"/>
+              <w:rPr>
+                <w:lang w:val="en-GB"/>
+              </w:rPr>
+            </w:pPr>
+            <w:r>
+              <w:rPr>
+                <w:lang w:val="en-GB"/>
+              </w:rPr>
+              <w:t>        if missing:</w:t>
+            </w:r>
+          </w:p>
+          <w:p>
+            <w:pPr>
+              <w:ind w:left="30"/>
+              <w:rPr>
+                <w:lang w:val="en-GB"/>
+              </w:rPr>
+            </w:pPr>
+            <w:r>
+              <w:rPr>
+                <w:lang w:val="en-GB"/>
+              </w:rPr>
+              <w:t>            sys.exit(f"Record {index} is missing fields: {', '.join(missing)}")</w:t>
+            </w:r>
+          </w:p>
+          <w:p>
+            <w:pPr>
+              <w:ind w:left="30"/>
+              <w:rPr>
+                <w:lang w:val="en-GB"/>
+              </w:rPr>
+            </w:pPr>
+          </w:p>
+          <w:p>
+            <w:pPr>
+              <w:ind w:left="30"/>
+              <w:rPr>
+                <w:lang w:val="en-GB"/>
+              </w:rPr>
+            </w:pPr>
+            <w:r>
+              <w:rPr>
+                <w:lang w:val="en-GB"/>
+              </w:rPr>
+              <w:t>    return records</w:t>
+            </w:r>
+          </w:p>
+          <w:p>
+            <w:pPr>
+              <w:ind w:left="30"/>
+              <w:rPr>
+                <w:lang w:val="en-GB"/>
+              </w:rPr>
+            </w:pPr>
+          </w:p>
+          <w:p>
+            <w:pPr>
+              <w:ind w:left="30"/>
+              <w:rPr>
+                <w:lang w:val="en-GB"/>
+              </w:rPr>
+            </w:pPr>
+            <w:r>
+              <w:rPr>
+                <w:lang w:val="en-GB"/>
+              </w:rPr>
+              <w:t>def main():</w:t>
+            </w:r>
+          </w:p>
+          <w:p>
+            <w:pPr>
+              <w:ind w:left="30"/>
+              <w:rPr>
+                <w:lang w:val="en-GB"/>
+              </w:rPr>
+            </w:pPr>
+            <w:r>
+              <w:rPr>
+                <w:lang w:val="en-GB"/>
+              </w:rPr>
+              <w:t>    args = parse_args()</w:t>
+            </w:r>
+          </w:p>
+          <w:p>
+            <w:pPr>
+              <w:ind w:left="30"/>
+              <w:rPr>
+                <w:lang w:val="en-GB"/>
+              </w:rPr>
+            </w:pPr>
+          </w:p>
+          <w:p>
+            <w:pPr>
+              <w:ind w:left="30"/>
+              <w:rPr>
+                <w:lang w:val="en-GB"/>
+              </w:rPr>
+            </w:pPr>
+            <w:r>
+              <w:rPr>
+                <w:lang w:val="en-GB"/>
+              </w:rPr>
+              <w:t>    if not args.db.exists():</w:t>
+            </w:r>
+          </w:p>
+          <w:p>
+            <w:pPr>
+              <w:ind w:left="30"/>
+              <w:rPr>
+                <w:lang w:val="en-GB"/>
+              </w:rPr>
+            </w:pPr>
+            <w:r>
+              <w:rPr>
+                <w:lang w:val="en-GB"/>
+              </w:rPr>
+              <w:t>        sys.exit(f"Database not found: {args.db}\nRun the alembic migrations first (uv run alembic upgrade head)")</w:t>
+            </w:r>
+          </w:p>
+          <w:p>
+            <w:pPr>
+              <w:ind w:left="30"/>
+              <w:rPr>
+                <w:lang w:val="en-GB"/>
+              </w:rPr>
+            </w:pPr>
+          </w:p>
+          <w:p>
+            <w:pPr>
+              <w:ind w:left="30"/>
+              <w:rPr>
+                <w:lang w:val="en-GB"/>
+              </w:rPr>
+            </w:pPr>
+            <w:r>
+              <w:rPr>
+                <w:lang w:val="en-GB"/>
+              </w:rPr>
+              <w:t>    records = load_seed(args.file)</w:t>
+            </w:r>
+          </w:p>
+          <w:p>
+            <w:pPr>
+              <w:ind w:left="30"/>
+              <w:rPr>
+                <w:lang w:val="en-GB"/>
+              </w:rPr>
+            </w:pPr>
+          </w:p>
+          <w:p>
+            <w:pPr>
+              <w:ind w:left="30"/>
+              <w:rPr>
+                <w:lang w:val="en-GB"/>
+              </w:rPr>
+            </w:pPr>
+            <w:r>
+              <w:rPr>
+                <w:lang w:val="en-GB"/>
+              </w:rPr>
+              <w:t>    if args.country:</w:t>
+            </w:r>
+          </w:p>
+          <w:p>
+            <w:pPr>
+              <w:ind w:left="30"/>
+              <w:rPr>
+                <w:lang w:val="en-GB"/>
+              </w:rPr>
+            </w:pPr>
+            <w:r>
+              <w:rPr>
+                <w:lang w:val="en-GB"/>
+              </w:rPr>
+              <w:t>        records = [record for record in records if record["country"].lower() == args.country.lower()]</w:t>
+            </w:r>
+          </w:p>
+          <w:p>
+            <w:pPr>
+              <w:ind w:left="30"/>
+              <w:rPr>
+                <w:lang w:val="en-GB"/>
+              </w:rPr>
+            </w:pPr>
+            <w:r>
+              <w:rPr>
+                <w:lang w:val="en-GB"/>
+              </w:rPr>
+              <w:t>    if args.limit is not None:</w:t>
+            </w:r>
+          </w:p>
+          <w:p>
+            <w:pPr>
+              <w:ind w:left="30"/>
+              <w:rPr>
+                <w:lang w:val="en-GB"/>
+              </w:rPr>
+            </w:pPr>
+            <w:r>
+              <w:rPr>
+                <w:lang w:val="en-GB"/>
+              </w:rPr>
+              <w:t>        records = records[:args.limit]</w:t>
+            </w:r>
+          </w:p>
+          <w:p>
+            <w:pPr>
+              <w:ind w:left="30"/>
+              <w:rPr>
+                <w:lang w:val="en-GB"/>
+              </w:rPr>
+            </w:pPr>
+          </w:p>
+          <w:p>
+            <w:pPr>
+              <w:ind w:left="30"/>
+              <w:rPr>
+                <w:lang w:val="en-GB"/>
+              </w:rPr>
+            </w:pPr>
+            <w:r>
+              <w:rPr>
+                <w:lang w:val="en-GB"/>
+              </w:rPr>
+              <w:t>    engine = create_engine(f"sqlite:///{args.db}")</w:t>
+            </w:r>
+          </w:p>
+          <w:p>
+            <w:pPr>
+              <w:ind w:left="30"/>
+              <w:rPr>
+                <w:lang w:val="en-GB"/>
+              </w:rPr>
+            </w:pPr>
+          </w:p>
+          <w:p>
+            <w:pPr>
+              <w:ind w:left="30"/>
+              <w:rPr>
+                <w:lang w:val="en-GB"/>
+              </w:rPr>
+            </w:pPr>
+            <w:r>
+              <w:rPr>
+                <w:lang w:val="en-GB"/>
+              </w:rPr>
+              <w:t>    if not inspect(engine).has_table(Airport.__tablename__):</w:t>
+            </w:r>
+          </w:p>
+          <w:p>
+            <w:pPr>
+              <w:ind w:left="30"/>
+              <w:rPr>
+                <w:lang w:val="en-GB"/>
+              </w:rPr>
+            </w:pPr>
+            <w:r>
+              <w:rPr>
+                <w:lang w:val="en-GB"/>
+              </w:rPr>
+              <w:t>        sys.exit("The airports table does not exist. Run the alembic migrations first (uv run alembic upgrade head)")</w:t>
+            </w:r>
+          </w:p>
+          <w:p>
+            <w:pPr>
+              <w:ind w:left="30"/>
+              <w:rPr>
+                <w:lang w:val="en-GB"/>
+              </w:rPr>
+            </w:pPr>
+          </w:p>
+          <w:p>
+            <w:pPr>
+              <w:ind w:left="30"/>
+              <w:rPr>
+                <w:lang w:val="en-GB"/>
+              </w:rPr>
+            </w:pPr>
+            <w:r>
+              <w:rPr>
+                <w:lang w:val="en-GB"/>
+              </w:rPr>
+              <w:t>    # Uses the table directly (SQLAlchemy Core) so the ORM relationships don't need to be configured</w:t>
+            </w:r>
+          </w:p>
+          <w:p>
+            <w:pPr>
+              <w:ind w:left="30"/>
+              <w:rPr>
+                <w:lang w:val="en-GB"/>
+              </w:rPr>
+            </w:pPr>
+            <w:r>
+              <w:rPr>
+                <w:lang w:val="en-GB"/>
+              </w:rPr>
+              <w:t>    airports_table = Airport.__table__</w:t>
+            </w:r>
+          </w:p>
+          <w:p>
+            <w:pPr>
+              <w:ind w:left="30"/>
+              <w:rPr>
+                <w:lang w:val="en-GB"/>
+              </w:rPr>
+            </w:pPr>
+          </w:p>
+          <w:p>
+            <w:pPr>
+              <w:ind w:left="30"/>
+              <w:rPr>
+                <w:lang w:val="en-GB"/>
+              </w:rPr>
+            </w:pPr>
+            <w:r>
+              <w:rPr>
+                <w:lang w:val="en-GB"/>
+              </w:rPr>
+              <w:t>    added = 0</w:t>
+            </w:r>
+          </w:p>
+          <w:p>
+            <w:pPr>
+              <w:ind w:left="30"/>
+              <w:rPr>
+                <w:lang w:val="en-GB"/>
+              </w:rPr>
+            </w:pPr>
+            <w:r>
+              <w:rPr>
+                <w:lang w:val="en-GB"/>
+              </w:rPr>
+              <w:lastRenderedPageBreak/>
+              <w:t>    updated = 0</w:t>
+            </w:r>
+          </w:p>
+          <w:p>
+            <w:pPr>
+              <w:ind w:left="30"/>
+              <w:rPr>
+                <w:lang w:val="en-GB"/>
+              </w:rPr>
+            </w:pPr>
+            <w:r>
+              <w:rPr>
+                <w:lang w:val="en-GB"/>
+              </w:rPr>
+              <w:t>    skipped = 0</w:t>
+            </w:r>
+          </w:p>
+          <w:p>
+            <w:pPr>
+              <w:ind w:left="30"/>
+              <w:rPr>
+                <w:lang w:val="en-GB"/>
+              </w:rPr>
+            </w:pPr>
+            <w:r>
+              <w:rPr>
+                <w:lang w:val="en-GB"/>
+              </w:rPr>
+              <w:t>    conflicts = []</w:t>
+            </w:r>
+          </w:p>
+          <w:p>
+            <w:pPr>
+              <w:ind w:left="30"/>
+              <w:rPr>
+                <w:lang w:val="en-GB"/>
+              </w:rPr>
+            </w:pPr>
+          </w:p>
+          <w:p>
+            <w:pPr>
+              <w:ind w:left="30"/>
+              <w:rPr>
+                <w:lang w:val="en-GB"/>
+              </w:rPr>
+            </w:pPr>
+            <w:r>
+              <w:rPr>
+                <w:lang w:val="en-GB"/>
+              </w:rPr>
+              <w:t>    connection = engine.connect()</w:t>
+            </w:r>
+          </w:p>
+          <w:p>
+            <w:pPr>
+              <w:ind w:left="30"/>
+              <w:rPr>
+                <w:lang w:val="en-GB"/>
+              </w:rPr>
+            </w:pPr>
+            <w:r>
+              <w:rPr>
+                <w:lang w:val="en-GB"/>
+              </w:rPr>
+              <w:t>    transaction = connection.begin()</w:t>
+            </w:r>
+          </w:p>
+          <w:p>
+            <w:pPr>
+              <w:ind w:left="30"/>
+              <w:rPr>
+                <w:lang w:val="en-GB"/>
+              </w:rPr>
+            </w:pPr>
+          </w:p>
+          <w:p>
+            <w:pPr>
+              <w:ind w:left="30"/>
+              <w:rPr>
+                <w:lang w:val="en-GB"/>
+              </w:rPr>
+            </w:pPr>
+            <w:r>
+              <w:rPr>
+                <w:lang w:val="en-GB"/>
+              </w:rPr>
+              <w:t>    try:</w:t>
+            </w:r>
+          </w:p>
+          <w:p>
+            <w:pPr>
+              <w:ind w:left="30"/>
+              <w:rPr>
+                <w:lang w:val="en-GB"/>
+              </w:rPr>
+            </w:pPr>
+            <w:r>
+              <w:rPr>
+                <w:lang w:val="en-GB"/>
+              </w:rPr>
+              <w:t>        # Loads existing airports once so each record doesn't need its own query</w:t>
+            </w:r>
+          </w:p>
+          <w:p>
+            <w:pPr>
+              <w:ind w:left="30"/>
+              <w:rPr>
+                <w:lang w:val="en-GB"/>
+              </w:rPr>
+            </w:pPr>
+            <w:r>
+              <w:rPr>
+                <w:lang w:val="en-GB"/>
+              </w:rPr>
+              <w:t>        existing_iata_by_icao = {row.icao: row.iata for row in connection.execute(select(airports_table.c.icao, airports_table.c.iata))}</w:t>
+            </w:r>
+          </w:p>
+          <w:p>
+            <w:pPr>
+              <w:ind w:left="30"/>
+              <w:rPr>
+                <w:lang w:val="en-GB"/>
+              </w:rPr>
+            </w:pPr>
+            <w:r>
+              <w:rPr>
+                <w:lang w:val="en-GB"/>
+              </w:rPr>
+              <w:t>        icao_by_iata = {iata: icao for icao, iata in existing_iata_by_icao.items() if iata}</w:t>
+            </w:r>
+          </w:p>
+          <w:p>
+            <w:pPr>
+              <w:ind w:left="30"/>
+              <w:rPr>
+                <w:lang w:val="en-GB"/>
+              </w:rPr>
+            </w:pPr>
+          </w:p>
+          <w:p>
+            <w:pPr>
+              <w:ind w:left="30"/>
+              <w:rPr>
+                <w:lang w:val="en-GB"/>
+              </w:rPr>
+            </w:pPr>
+            <w:r>
+              <w:rPr>
+                <w:lang w:val="en-GB"/>
+              </w:rPr>
+              <w:t>        to_insert = []</w:t>
+            </w:r>
+          </w:p>
+          <w:p>
+            <w:pPr>
+              <w:ind w:left="30"/>
+              <w:rPr>
+                <w:lang w:val="en-GB"/>
+              </w:rPr>
+            </w:pPr>
+          </w:p>
+          <w:p>
+            <w:pPr>
+              <w:ind w:left="30"/>
+              <w:rPr>
+                <w:lang w:val="en-GB"/>
+              </w:rPr>
+            </w:pPr>
+            <w:r>
+              <w:rPr>
+                <w:lang w:val="en-GB"/>
+              </w:rPr>
+              <w:t>        for record in records:</w:t>
+            </w:r>
+          </w:p>
+          <w:p>
+            <w:pPr>
+              <w:ind w:left="30"/>
+              <w:rPr>
+                <w:lang w:val="en-GB"/>
+              </w:rPr>
+            </w:pPr>
+            <w:r>
+              <w:rPr>
+                <w:lang w:val="en-GB"/>
+              </w:rPr>
+              <w:t>            icao = record["icao"].strip().upper()</w:t>
+            </w:r>
+          </w:p>
+          <w:p>
+            <w:pPr>
+              <w:ind w:left="30"/>
+              <w:rPr>
+                <w:lang w:val="en-GB"/>
+              </w:rPr>
+            </w:pPr>
+            <w:r>
+              <w:rPr>
+                <w:lang w:val="en-GB"/>
+              </w:rPr>
+              <w:t>            iata = record["iata"].strip().upper() if record["iata"] else None</w:t>
+            </w:r>
+          </w:p>
+          <w:p>
+            <w:pPr>
+              <w:ind w:left="30"/>
+              <w:rPr>
+                <w:lang w:val="en-GB"/>
+              </w:rPr>
+            </w:pPr>
+            <w:r>
+              <w:rPr>
+                <w:lang w:val="en-GB"/>
+              </w:rPr>
+              <w:t>            values = {</w:t>
+            </w:r>
+          </w:p>
+          <w:p>
+            <w:pPr>
+              <w:ind w:left="30"/>
+              <w:rPr>
+                <w:lang w:val="en-GB"/>
+              </w:rPr>
+            </w:pPr>
+            <w:r>
+              <w:rPr>
+                <w:lang w:val="en-GB"/>
+              </w:rPr>
+              <w:t>                "iata": iata,</w:t>
+            </w:r>
+          </w:p>
+          <w:p>
+            <w:pPr>
+              <w:ind w:left="30"/>
+              <w:rPr>
+                <w:lang w:val="en-GB"/>
+              </w:rPr>
+            </w:pPr>
+            <w:r>
+              <w:rPr>
+                <w:lang w:val="en-GB"/>
+              </w:rPr>
+              <w:t>                "name": record["name"],</w:t>
+            </w:r>
+          </w:p>
+          <w:p>
+            <w:pPr>
+              <w:ind w:left="30"/>
+              <w:rPr>
+                <w:lang w:val="en-GB"/>
+              </w:rPr>
+            </w:pPr>
+            <w:r>
+              <w:rPr>
+                <w:lang w:val="en-GB"/>
+              </w:rPr>
+              <w:t>                "city": record["city"],</w:t>
+            </w:r>
+          </w:p>
+          <w:p>
+            <w:pPr>
+              <w:ind w:left="30"/>
+              <w:rPr>
+                <w:lang w:val="en-GB"/>
+              </w:rPr>
+            </w:pPr>
+            <w:r>
+              <w:rPr>
+                <w:lang w:val="en-GB"/>
+              </w:rPr>
+              <w:t>                "country": record["country"],</w:t>
+            </w:r>
+          </w:p>
+          <w:p>
+            <w:pPr>
+              <w:ind w:left="30"/>
+              <w:rPr>
+                <w:lang w:val="en-GB"/>
+              </w:rPr>
+            </w:pPr>
+            <w:r>
+              <w:rPr>
+                <w:lang w:val="en-GB"/>
+              </w:rPr>
+              <w:t>                "latitude": float(record["latitude"]),</w:t>
+            </w:r>
+          </w:p>
+          <w:p>
+            <w:pPr>
+              <w:ind w:left="30"/>
+              <w:rPr>
+                <w:lang w:val="en-GB"/>
+              </w:rPr>
+            </w:pPr>
+            <w:r>
+              <w:rPr>
+                <w:lang w:val="en-GB"/>
+              </w:rPr>
+              <w:t>                "longitude": float(record["longitude"]),</w:t>
+            </w:r>
+          </w:p>
+          <w:p>
+            <w:pPr>
+              <w:ind w:left="30"/>
+              <w:rPr>
+                <w:lang w:val="en-GB"/>
+              </w:rPr>
+            </w:pPr>
+            <w:r>
+              <w:rPr>
+                <w:lang w:val="en-GB"/>
+              </w:rPr>
+              <w:t>                "timezone": record["timezone"],</w:t>
+            </w:r>
+          </w:p>
+          <w:p>
+            <w:pPr>
+              <w:ind w:left="30"/>
+              <w:rPr>
+                <w:lang w:val="en-GB"/>
+              </w:rPr>
+            </w:pPr>
+            <w:r>
+              <w:rPr>
+                <w:lang w:val="en-GB"/>
+              </w:rPr>
+              <w:t>            }</w:t>
+            </w:r>
+          </w:p>
+          <w:p>
+            <w:pPr>
+              <w:ind w:left="30"/>
+              <w:rPr>
+                <w:lang w:val="en-GB"/>
+              </w:rPr>
+            </w:pPr>
+          </w:p>
+          <w:p>
+            <w:pPr>
+              <w:ind w:left="30"/>
+              <w:rPr>
+                <w:lang w:val="en-GB"/>
+              </w:rPr>
+            </w:pPr>
+            <w:r>
+              <w:rPr>
+                <w:lang w:val="en-GB"/>
+              </w:rPr>
+              <w:t>            # Stops an IATA code being given to two different airports, which would break the unique constraint</w:t>
+            </w:r>
+          </w:p>
+          <w:p>
+            <w:pPr>
+              <w:ind w:left="30"/>
+              <w:rPr>
+                <w:lang w:val="en-GB"/>
+              </w:rPr>
+            </w:pPr>
+            <w:r>
+              <w:rPr>
+                <w:lang w:val="en-GB"/>
+              </w:rPr>
+              <w:t>            if iata and iata in icao_by_iata and icao_by_iata[iata] != icao:</w:t>
+            </w:r>
+          </w:p>
+          <w:p>
+            <w:pPr>
+              <w:ind w:left="30"/>
+              <w:rPr>
+                <w:lang w:val="en-GB"/>
+              </w:rPr>
+            </w:pPr>
+            <w:r>
+              <w:rPr>
+                <w:lang w:val="en-GB"/>
+              </w:rPr>
+              <w:t>                conflicts.append(f"{icao}: IATA {iata} already used by {icao_by_iata[iata]}")</w:t>
+            </w:r>
+          </w:p>
+          <w:p>
+            <w:pPr>
+              <w:ind w:left="30"/>
+              <w:rPr>
+                <w:lang w:val="en-GB"/>
+              </w:rPr>
+            </w:pPr>
+            <w:r>
+              <w:rPr>
+                <w:lang w:val="en-GB"/>
+              </w:rPr>
+              <w:t>                continue</w:t>
+            </w:r>
+          </w:p>
+          <w:p>
+            <w:pPr>
+              <w:ind w:left="30"/>
+              <w:rPr>
+                <w:lang w:val="en-GB"/>
+              </w:rPr>
+            </w:pPr>
+          </w:p>
+          <w:p>
+            <w:pPr>
+              <w:ind w:left="30"/>
+              <w:rPr>
+                <w:lang w:val="en-GB"/>
+              </w:rPr>
+            </w:pPr>
+            <w:r>
+              <w:rPr>
+                <w:lang w:val="en-GB"/>
+              </w:rPr>
+              <w:t>            if icao not in existing_iata_by_icao:</w:t>
+            </w:r>
+          </w:p>
+          <w:p>
+            <w:pPr>
+              <w:ind w:left="30"/>
+              <w:rPr>
+                <w:lang w:val="en-GB"/>
+              </w:rPr>
+            </w:pPr>
+            <w:r>
+              <w:rPr>
+                <w:lang w:val="en-GB"/>
+              </w:rPr>
+              <w:t>                to_insert.append({"icao": icao, **values})</w:t>
+            </w:r>
+          </w:p>
+          <w:p>
+            <w:pPr>
+              <w:ind w:left="30"/>
+              <w:rPr>
+                <w:lang w:val="en-GB"/>
+              </w:rPr>
+            </w:pPr>
+            <w:r>
+              <w:rPr>
+                <w:lang w:val="en-GB"/>
+              </w:rPr>
+              <w:lastRenderedPageBreak/>
+              <w:t>                added += 1</w:t>
+            </w:r>
+          </w:p>
+          <w:p>
+            <w:pPr>
+              <w:ind w:left="30"/>
+              <w:rPr>
+                <w:lang w:val="en-GB"/>
+              </w:rPr>
+            </w:pPr>
+            <w:r>
+              <w:rPr>
+                <w:lang w:val="en-GB"/>
+              </w:rPr>
+              <w:t>            elif args.update:</w:t>
+            </w:r>
+          </w:p>
+          <w:p>
+            <w:pPr>
+              <w:ind w:left="30"/>
+              <w:rPr>
+                <w:lang w:val="en-GB"/>
+              </w:rPr>
+            </w:pPr>
+            <w:r>
+              <w:rPr>
+                <w:lang w:val="en-GB"/>
+              </w:rPr>
+              <w:t>                old_iata = existing_iata_by_icao[icao]</w:t>
+            </w:r>
+          </w:p>
+          <w:p>
+            <w:pPr>
+              <w:ind w:left="30"/>
+              <w:rPr>
+                <w:lang w:val="en-GB"/>
+              </w:rPr>
+            </w:pPr>
+            <w:r>
+              <w:rPr>
+                <w:lang w:val="en-GB"/>
+              </w:rPr>
+              <w:t>                if old_iata and old_iata != iata:</w:t>
+            </w:r>
+          </w:p>
+          <w:p>
+            <w:pPr>
+              <w:ind w:left="30"/>
+              <w:rPr>
+                <w:lang w:val="en-GB"/>
+              </w:rPr>
+            </w:pPr>
+            <w:r>
+              <w:rPr>
+                <w:lang w:val="en-GB"/>
+              </w:rPr>
+              <w:t>                    del icao_by_iata[old_iata]</w:t>
+            </w:r>
+          </w:p>
+          <w:p>
+            <w:pPr>
+              <w:ind w:left="30"/>
+              <w:rPr>
+                <w:lang w:val="en-GB"/>
+              </w:rPr>
+            </w:pPr>
+            <w:r>
+              <w:rPr>
+                <w:lang w:val="en-GB"/>
+              </w:rPr>
+              <w:t>                connection.execute(update(airports_table).where(airports_table.c.icao == icao).values(**values))</w:t>
+            </w:r>
+          </w:p>
+          <w:p>
+            <w:pPr>
+              <w:ind w:left="30"/>
+              <w:rPr>
+                <w:lang w:val="en-GB"/>
+              </w:rPr>
+            </w:pPr>
+            <w:r>
+              <w:rPr>
+                <w:lang w:val="en-GB"/>
+              </w:rPr>
+              <w:t>                updated += 1</w:t>
+            </w:r>
+          </w:p>
+          <w:p>
+            <w:pPr>
+              <w:ind w:left="30"/>
+              <w:rPr>
+                <w:lang w:val="en-GB"/>
+              </w:rPr>
+            </w:pPr>
+            <w:r>
+              <w:rPr>
+                <w:lang w:val="en-GB"/>
+              </w:rPr>
+              <w:t>            else:</w:t>
+            </w:r>
+          </w:p>
+          <w:p>
+            <w:pPr>
+              <w:ind w:left="30"/>
+              <w:rPr>
+                <w:lang w:val="en-GB"/>
+              </w:rPr>
+            </w:pPr>
+            <w:r>
+              <w:rPr>
+                <w:lang w:val="en-GB"/>
+              </w:rPr>
+              <w:t>                skipped += 1</w:t>
+            </w:r>
+          </w:p>
+          <w:p>
+            <w:pPr>
+              <w:ind w:left="30"/>
+              <w:rPr>
+                <w:lang w:val="en-GB"/>
+              </w:rPr>
+            </w:pPr>
+            <w:r>
+              <w:rPr>
+                <w:lang w:val="en-GB"/>
+              </w:rPr>
+              <w:t>                continue</w:t>
+            </w:r>
+          </w:p>
+          <w:p>
+            <w:pPr>
+              <w:ind w:left="30"/>
+              <w:rPr>
+                <w:lang w:val="en-GB"/>
+              </w:rPr>
+            </w:pPr>
+          </w:p>
+          <w:p>
+            <w:pPr>
+              <w:ind w:left="30"/>
+              <w:rPr>
+                <w:lang w:val="en-GB"/>
+              </w:rPr>
+            </w:pPr>
+            <w:r>
+              <w:rPr>
+                <w:lang w:val="en-GB"/>
+              </w:rPr>
+              <w:t>            existing_iata_by_icao[icao] = iata</w:t>
+            </w:r>
+          </w:p>
+          <w:p>
+            <w:pPr>
+              <w:ind w:left="30"/>
+              <w:rPr>
+                <w:lang w:val="en-GB"/>
+              </w:rPr>
+            </w:pPr>
+            <w:r>
+              <w:rPr>
+                <w:lang w:val="en-GB"/>
+              </w:rPr>
+              <w:t>            if iata:</w:t>
+            </w:r>
+          </w:p>
+          <w:p>
+            <w:pPr>
+              <w:ind w:left="30"/>
+              <w:rPr>
+                <w:lang w:val="en-GB"/>
+              </w:rPr>
+            </w:pPr>
+            <w:r>
+              <w:rPr>
+                <w:lang w:val="en-GB"/>
+              </w:rPr>
+              <w:t>                icao_by_iata[iata] = icao</w:t>
+            </w:r>
+          </w:p>
+          <w:p>
+            <w:pPr>
+              <w:ind w:left="30"/>
+              <w:rPr>
+                <w:lang w:val="en-GB"/>
+              </w:rPr>
+            </w:pPr>
+          </w:p>
+          <w:p>
+            <w:pPr>
+              <w:ind w:left="30"/>
+              <w:rPr>
+                <w:lang w:val="en-GB"/>
+              </w:rPr>
+            </w:pPr>
+            <w:r>
+              <w:rPr>
+                <w:lang w:val="en-GB"/>
+              </w:rPr>
+              <w:t>        # Inserts all new airports in a single executemany call</w:t>
+            </w:r>
+          </w:p>
+          <w:p>
+            <w:pPr>
+              <w:ind w:left="30"/>
+              <w:rPr>
+                <w:lang w:val="en-GB"/>
+              </w:rPr>
+            </w:pPr>
+            <w:r>
+              <w:rPr>
+                <w:lang w:val="en-GB"/>
+              </w:rPr>
+              <w:t>        if to_insert:</w:t>
+            </w:r>
+          </w:p>
+          <w:p>
+            <w:pPr>
+              <w:ind w:left="30"/>
+              <w:rPr>
+                <w:lang w:val="en-GB"/>
+              </w:rPr>
+            </w:pPr>
+            <w:r>
+              <w:rPr>
+                <w:lang w:val="en-GB"/>
+              </w:rPr>
+              <w:t>            connection.execute(insert(airports_table), to_insert)</w:t>
+            </w:r>
+          </w:p>
+          <w:p>
+            <w:pPr>
+              <w:ind w:left="30"/>
+              <w:rPr>
+                <w:lang w:val="en-GB"/>
+              </w:rPr>
+            </w:pPr>
+          </w:p>
+          <w:p>
+            <w:pPr>
+              <w:ind w:left="30"/>
+              <w:rPr>
+                <w:lang w:val="en-GB"/>
+              </w:rPr>
+            </w:pPr>
+            <w:r>
+              <w:rPr>
+                <w:lang w:val="en-GB"/>
+              </w:rPr>
+              <w:t>        if args.dry_run:</w:t>
+            </w:r>
+          </w:p>
+          <w:p>
+            <w:pPr>
+              <w:ind w:left="30"/>
+              <w:rPr>
+                <w:lang w:val="en-GB"/>
+              </w:rPr>
+            </w:pPr>
+            <w:r>
+              <w:rPr>
+                <w:lang w:val="en-GB"/>
+              </w:rPr>
+              <w:t>            transaction.rollback()</w:t>
+            </w:r>
+          </w:p>
+          <w:p>
+            <w:pPr>
+              <w:ind w:left="30"/>
+              <w:rPr>
+                <w:lang w:val="en-GB"/>
+              </w:rPr>
+            </w:pPr>
+            <w:r>
+              <w:rPr>
+                <w:lang w:val="en-GB"/>
+              </w:rPr>
+              <w:t>        else:</w:t>
+            </w:r>
+          </w:p>
+          <w:p>
+            <w:pPr>
+              <w:ind w:left="30"/>
+              <w:rPr>
+                <w:lang w:val="en-GB"/>
+              </w:rPr>
+            </w:pPr>
+            <w:r>
+              <w:rPr>
+                <w:lang w:val="en-GB"/>
+              </w:rPr>
+              <w:t>            transaction.commit()</w:t>
+            </w:r>
+          </w:p>
+          <w:p>
+            <w:pPr>
+              <w:ind w:left="30"/>
+              <w:rPr>
+                <w:lang w:val="en-GB"/>
+              </w:rPr>
+            </w:pPr>
+            <w:r>
+              <w:rPr>
+                <w:lang w:val="en-GB"/>
+              </w:rPr>
+              <w:t>    except Exception:</w:t>
+            </w:r>
+          </w:p>
+          <w:p>
+            <w:pPr>
+              <w:ind w:left="30"/>
+              <w:rPr>
+                <w:lang w:val="en-GB"/>
+              </w:rPr>
+            </w:pPr>
+            <w:r>
+              <w:rPr>
+                <w:lang w:val="en-GB"/>
+              </w:rPr>
+              <w:t>        transaction.rollback()</w:t>
+            </w:r>
+          </w:p>
+          <w:p>
+            <w:pPr>
+              <w:ind w:left="30"/>
+              <w:rPr>
+                <w:lang w:val="en-GB"/>
+              </w:rPr>
+            </w:pPr>
+            <w:r>
+              <w:rPr>
+                <w:lang w:val="en-GB"/>
+              </w:rPr>
+              <w:t>        raise</w:t>
+            </w:r>
+          </w:p>
+          <w:p>
+            <w:pPr>
+              <w:ind w:left="30"/>
+              <w:rPr>
+                <w:lang w:val="en-GB"/>
+              </w:rPr>
+            </w:pPr>
+            <w:r>
+              <w:rPr>
+                <w:lang w:val="en-GB"/>
+              </w:rPr>
+              <w:t>    finally:</w:t>
+            </w:r>
+          </w:p>
+          <w:p>
+            <w:pPr>
+              <w:ind w:left="30"/>
+              <w:rPr>
+                <w:lang w:val="en-GB"/>
+              </w:rPr>
+            </w:pPr>
+            <w:r>
+              <w:rPr>
+                <w:lang w:val="en-GB"/>
+              </w:rPr>
+              <w:t>        connection.close()</w:t>
+            </w:r>
+          </w:p>
+          <w:p>
+            <w:pPr>
+              <w:ind w:left="30"/>
+              <w:rPr>
+                <w:lang w:val="en-GB"/>
+              </w:rPr>
+            </w:pPr>
+          </w:p>
+          <w:p>
+            <w:pPr>
+              <w:ind w:left="30"/>
+              <w:rPr>
+                <w:lang w:val="en-GB"/>
+              </w:rPr>
+            </w:pPr>
+            <w:r>
+              <w:rPr>
+                <w:lang w:val="en-GB"/>
+              </w:rPr>
+              <w:t>    prefix = "[DRY RUN] Would have" if args.dry_run else "Done."</w:t>
+            </w:r>
+          </w:p>
+          <w:p>
+            <w:pPr>
+              <w:ind w:left="30"/>
+              <w:rPr>
+                <w:lang w:val="en-GB"/>
+              </w:rPr>
+            </w:pPr>
+            <w:r>
+              <w:rPr>
+                <w:lang w:val="en-GB"/>
+              </w:rPr>
+              <w:t>    print(f"{prefix} processed {len(records)} airports from {args.file.name}")</w:t>
+            </w:r>
+          </w:p>
+          <w:p>
+            <w:pPr>
+              <w:ind w:left="30"/>
+              <w:rPr>
+                <w:lang w:val="en-GB"/>
+              </w:rPr>
+            </w:pPr>
+            <w:r>
+              <w:rPr>
+                <w:lang w:val="en-GB"/>
+              </w:rPr>
+              <w:t>    print(f"  Added:     {added}")</w:t>
+            </w:r>
+          </w:p>
+          <w:p>
+            <w:pPr>
+              <w:ind w:left="30"/>
+              <w:rPr>
+                <w:lang w:val="en-GB"/>
+              </w:rPr>
+            </w:pPr>
+            <w:r>
+              <w:rPr>
+                <w:lang w:val="en-GB"/>
+              </w:rPr>
+              <w:t>    print(f"  Updated:   {updated}")</w:t>
+            </w:r>
+          </w:p>
+          <w:p>
+            <w:pPr>
+              <w:ind w:left="30"/>
+              <w:rPr>
+                <w:lang w:val="en-GB"/>
+              </w:rPr>
+            </w:pPr>
+            <w:r>
+              <w:rPr>
+                <w:lang w:val="en-GB"/>
+              </w:rPr>
+              <w:t>    print(f"  Skipped:   {skipped} (already in database{', use --update to overwrite' if skipped and not args.update else ''})")</w:t>
+            </w:r>
+          </w:p>
+          <w:p>
+            <w:pPr>
+              <w:ind w:left="30"/>
+              <w:rPr>
+                <w:lang w:val="en-GB"/>
+              </w:rPr>
+            </w:pPr>
+            <w:r>
+              <w:rPr>
+                <w:lang w:val="en-GB"/>
+              </w:rPr>
+              <w:lastRenderedPageBreak/>
+              <w:t>    print(f"  Conflicts: {len(conflicts)}")</w:t>
+            </w:r>
+          </w:p>
+          <w:p>
+            <w:pPr>
+              <w:ind w:left="30"/>
+              <w:rPr>
+                <w:lang w:val="en-GB"/>
+              </w:rPr>
+            </w:pPr>
+            <w:r>
+              <w:rPr>
+                <w:lang w:val="en-GB"/>
+              </w:rPr>
+              <w:t>    for conflict in conflicts[:20]:</w:t>
+            </w:r>
+          </w:p>
+          <w:p>
+            <w:pPr>
+              <w:ind w:left="30"/>
+              <w:rPr>
+                <w:lang w:val="en-GB"/>
+              </w:rPr>
+            </w:pPr>
+            <w:r>
+              <w:rPr>
+                <w:lang w:val="en-GB"/>
+              </w:rPr>
+              <w:t>        print(f"    {conflict}")</w:t>
+            </w:r>
+          </w:p>
+          <w:p>
+            <w:pPr>
+              <w:ind w:left="30"/>
+              <w:rPr>
+                <w:lang w:val="en-GB"/>
+              </w:rPr>
+            </w:pPr>
+            <w:r>
+              <w:rPr>
+                <w:lang w:val="en-GB"/>
+              </w:rPr>
+              <w:t>    if len(conflicts) &gt; 20:</w:t>
+            </w:r>
+          </w:p>
+          <w:p>
+            <w:pPr>
+              <w:ind w:left="30"/>
+              <w:rPr>
+                <w:lang w:val="en-GB"/>
+              </w:rPr>
+            </w:pPr>
+            <w:r>
+              <w:rPr>
+                <w:lang w:val="en-GB"/>
+              </w:rPr>
+              <w:t>        print(f"    ...and {len(conflicts) - 20} more")</w:t>
+            </w:r>
+          </w:p>
+          <w:p>
+            <w:pPr>
+              <w:ind w:left="30"/>
+              <w:rPr>
+                <w:lang w:val="en-GB"/>
+              </w:rPr>
+            </w:pPr>
+          </w:p>
+          <w:p>
+            <w:pPr>
+              <w:ind w:left="30"/>
+              <w:rPr>
+                <w:lang w:val="en-GB"/>
+              </w:rPr>
+            </w:pPr>
+            <w:r>
+              <w:rPr>
+                <w:lang w:val="en-GB"/>
+              </w:rPr>
+              <w:t>if __name__ == "__main__":</w:t>
+            </w:r>
+          </w:p>
+          <w:p>
+            <w:pPr>
+              <w:ind w:left="30"/>
+              <w:rPr>
+                <w:lang w:val="en-GB"/>
+              </w:rPr>
+            </w:pPr>
+            <w:r>
+              <w:rPr>
+                <w:lang w:val="en-GB"/>
+              </w:rPr>
+              <w:t>    main()</w:t>
+            </w:r>
+          </w:p>
+          <w:p>
+            <w:pPr>
+              <w:ind w:left="30"/>
+              <w:rPr>
+                <w:lang w:val="en-GB"/>
+              </w:rPr>
+            </w:pPr>
+          </w:p>
+          <w:p>
+            <w:pPr>
+              <w:ind w:left="30"/>
+            </w:pPr>
+          </w:p>
+        </w:tc>
+      </w:tr>
     </w:tbl>
     <w:p>
       <w:pPr>
         <w:pStyle w:val="Heading2"/>
       </w:pPr>
       <w:r>
+        <w:lastRenderedPageBreak/>
         <w:t>Example Entry</w:t>
       </w:r>
     </w:p>
@@ -5594,7 +8643,6 @@
   <w:style w:type="character" w:default="1" w:styleId="DefaultParagraphFont">
     <w:name w:val="Default Paragraph Font"/>
     <w:uiPriority w:val="1"/>
-    <w:semiHidden/>
     <w:unhideWhenUsed/>
   </w:style>
   <w:style w:type="table" w:default="1" w:styleId="TableNormal">
@@ -16707,21 +19755,6 @@
 </file>
 
 <file path=customXml/item2.xml><?xml version="1.0" encoding="utf-8"?>
-<p:properties xmlns:p="http://schemas.microsoft.com/office/2006/metadata/properties" xmlns:xsi="http://www.w3.org/2001/XMLSchema-instance" xmlns:pc="http://schemas.microsoft.com/office/infopath/2007/PartnerControls">
-  <documentManagement>
-    <TaxCatchAll xmlns="10d644ba-cf16-43e8-a31a-a6f565d9c224" xsi:nil="true"/>
-    <lcf76f155ced4ddcb4097134ff3c332f xmlns="9f27979c-cb1a-4f8c-bada-64f9d3ac4d94">
-      <Terms xmlns="http://schemas.microsoft.com/office/infopath/2007/PartnerControls"/>
-    </lcf76f155ced4ddcb4097134ff3c332f>
-  </documentManagement>
-</p:properties>
-</file>
-
-<file path=customXml/item3.xml><?xml version="1.0" encoding="utf-8"?>
-<b:Sources xmlns:b="http://schemas.openxmlformats.org/officeDocument/2006/bibliography" xmlns="http://schemas.openxmlformats.org/officeDocument/2006/bibliography" SelectedStyle="/APA.XSL" StyleName="APA"/>
-</file>
-
-<file path=customXml/item4.xml><?xml version="1.0" encoding="utf-8"?>
 <ct:contentTypeSchema xmlns:ct="http://schemas.microsoft.com/office/2006/metadata/contentType" xmlns:ma="http://schemas.microsoft.com/office/2006/metadata/properties/metaAttributes" ct:_="" ma:_="" ma:contentTypeName="Document" ma:contentTypeID="0x010100B31D159F86750749BAD869CB65D39E6C" ma:contentTypeVersion="19" ma:contentTypeDescription="Create a new document." ma:contentTypeScope="" ma:versionID="0ea2422bc5c6366a6faeb9099b70d2d2">
   <xsd:schema xmlns:xsd="http://www.w3.org/2001/XMLSchema" xmlns:xs="http://www.w3.org/2001/XMLSchema" xmlns:p="http://schemas.microsoft.com/office/2006/metadata/properties" xmlns:ns2="9f27979c-cb1a-4f8c-bada-64f9d3ac4d94" xmlns:ns3="10d644ba-cf16-43e8-a31a-a6f565d9c224" targetNamespace="http://schemas.microsoft.com/office/2006/metadata/properties" ma:root="true" ma:fieldsID="3a98ec8fef0d077c94de2b1dd278fe35" ns2:_="" ns3:_="">
     <xsd:import namespace="9f27979c-cb1a-4f8c-bada-64f9d3ac4d94"/>
@@ -16982,6 +20015,21 @@
 </ct:contentTypeSchema>
 </file>
 
+<file path=customXml/item3.xml><?xml version="1.0" encoding="utf-8"?>
+<b:Sources xmlns:b="http://schemas.openxmlformats.org/officeDocument/2006/bibliography" xmlns="http://schemas.openxmlformats.org/officeDocument/2006/bibliography" SelectedStyle="/APA.XSL" StyleName="APA"/>
+</file>
+
+<file path=customXml/item4.xml><?xml version="1.0" encoding="utf-8"?>
+<p:properties xmlns:p="http://schemas.microsoft.com/office/2006/metadata/properties" xmlns:xsi="http://www.w3.org/2001/XMLSchema-instance" xmlns:pc="http://schemas.microsoft.com/office/infopath/2007/PartnerControls">
+  <documentManagement>
+    <TaxCatchAll xmlns="10d644ba-cf16-43e8-a31a-a6f565d9c224" xsi:nil="true"/>
+    <lcf76f155ced4ddcb4097134ff3c332f xmlns="9f27979c-cb1a-4f8c-bada-64f9d3ac4d94">
+      <Terms xmlns="http://schemas.microsoft.com/office/infopath/2007/PartnerControls"/>
+    </lcf76f155ced4ddcb4097134ff3c332f>
+  </documentManagement>
+</p:properties>
+</file>
+
 <file path=customXml/itemProps1.xml><?xml version="1.0" encoding="utf-8"?>
 <ds:datastoreItem xmlns:ds="http://schemas.openxmlformats.org/officeDocument/2006/customXml" ds:itemID="{68F0750B-A861-460B-9805-C5691D482CA6}">
   <ds:schemaRefs>
@@ -16991,25 +20039,6 @@
 </file>
 
 <file path=customXml/itemProps2.xml><?xml version="1.0" encoding="utf-8"?>
-<ds:datastoreItem xmlns:ds="http://schemas.openxmlformats.org/officeDocument/2006/customXml" ds:itemID="{FA635BD9-2924-48FA-9C69-F6A95F69A99B}">
-  <ds:schemaRefs>
-    <ds:schemaRef ds:uri="http://schemas.microsoft.com/office/2006/metadata/properties"/>
-    <ds:schemaRef ds:uri="http://schemas.microsoft.com/office/infopath/2007/PartnerControls"/>
-    <ds:schemaRef ds:uri="10d644ba-cf16-43e8-a31a-a6f565d9c224"/>
-    <ds:schemaRef ds:uri="9f27979c-cb1a-4f8c-bada-64f9d3ac4d94"/>
-  </ds:schemaRefs>
-</ds:datastoreItem>
-</file>
-
-<file path=customXml/itemProps3.xml><?xml version="1.0" encoding="utf-8"?>
-<ds:datastoreItem xmlns:ds="http://schemas.openxmlformats.org/officeDocument/2006/customXml" ds:itemID="{EF278816-EC6F-A645-907D-7F25AECB1D4A}">
-  <ds:schemaRefs>
-    <ds:schemaRef ds:uri="http://schemas.openxmlformats.org/officeDocument/2006/bibliography"/>
-  </ds:schemaRefs>
-</ds:datastoreItem>
-</file>
-
-<file path=customXml/itemProps4.xml><?xml version="1.0" encoding="utf-8"?>
 <ds:datastoreItem xmlns:ds="http://schemas.openxmlformats.org/officeDocument/2006/customXml" ds:itemID="{067471EF-364C-4C77-B374-93CE54282B7E}">
   <ds:schemaRefs>
     <ds:schemaRef ds:uri="http://schemas.microsoft.com/office/2006/metadata/contentType"/>
@@ -17026,4 +20055,23 @@
     <ds:schemaRef ds:uri="http://schemas.microsoft.com/internal/obd"/>
   </ds:schemaRefs>
 </ds:datastoreItem>
+</file>
+
+<file path=customXml/itemProps3.xml><?xml version="1.0" encoding="utf-8"?>
+<ds:datastoreItem xmlns:ds="http://schemas.openxmlformats.org/officeDocument/2006/customXml" ds:itemID="{EF278816-EC6F-A645-907D-7F25AECB1D4A}">
+  <ds:schemaRefs>
+    <ds:schemaRef ds:uri="http://schemas.openxmlformats.org/officeDocument/2006/bibliography"/>
+  </ds:schemaRefs>
+</ds:datastoreItem>
+</file>
+
+<file path=customXml/itemProps4.xml><?xml version="1.0" encoding="utf-8"?>
+<ds:datastoreItem xmlns:ds="http://schemas.openxmlformats.org/officeDocument/2006/customXml" ds:itemID="{FA635BD9-2924-48FA-9C69-F6A95F69A99B}">
+  <ds:schemaRefs>
+    <ds:schemaRef ds:uri="http://schemas.microsoft.com/office/2006/metadata/properties"/>
+    <ds:schemaRef ds:uri="http://schemas.microsoft.com/office/infopath/2007/PartnerControls"/>
+    <ds:schemaRef ds:uri="10d644ba-cf16-43e8-a31a-a6f565d9c224"/>
+    <ds:schemaRef ds:uri="9f27979c-cb1a-4f8c-bada-64f9d3ac4d94"/>
+  </ds:schemaRefs>
+</ds:datastoreItem>
 </file>
</xml_diff>